<commit_message>
AGNI 10/10 upgrade: Triple-Agent Council, IEEE-CIS calibration, war room UI.
Add Scout/Forge/Critic agents with DeepSeek integration, 3 new playbooks,
evasion-pressure generations, rules baseline comparator, Agent Council UI,
vector heatmap, tier-labelled genomes, and calibrated benchmarks.
</commit_message>
<xml_diff>
--- a/docs/AGNI_Solution_Walkthrough.docx
+++ b/docs/AGNI_Solution_Walkthrough.docx
@@ -8,7 +8,7 @@
         <w:jc w:val="center"/>
       </w:pPr>
       <w:r>
-        <w:t>AGNI Fraud Wind Tunnel</w:t>
+        <w:t>AGNI — Triple-Agent Fraud Wind Tunnel</w:t>
       </w:r>
     </w:p>
     <w:p>
@@ -16,7 +16,7 @@
         <w:jc w:val="center"/>
       </w:pPr>
       <w:r>
-        <w:t>Mastercard Innovation Challenge 2026 — AI Defense Lab for Payment Security</w:t>
+        <w:t>Mastercard Innovation Challenge 2026 · AI Defense Lab for Payment Security</w:t>
       </w:r>
     </w:p>
     <w:p>
@@ -29,7 +29,7 @@
     </w:p>
     <w:p>
       <w:r>
-        <w:t>AGNI (Adversarial GenAI Network for Integrity) is a closed-loop fraud wind tunnel that identifies emerging GenAI-powered payment fraud, simulates attacks at scale with fidelity scored against real payment data, and hardens a fusion detector through an adversarial Red Queen loop. Unlike static red-team reports, AGNI measures Time-to-Evade (TtE) — how many generations a frozen defender survives before evolving attacks bypass it — and Loop Gain from each retrain cycle.</w:t>
+        <w:t>AGNI is a closed-loop adversarial AI system for GenAI-powered payment fraud. Three LLM agents — Scout (identify), Forge (generate), Critic (evolve) — operate inside a Red Queen wind tunnel calibrated on 590,540 real IEEE-CIS/Vesta transactions. We measure Time-to-Evade (TtE): how many generations a frozen defender survives before evolving attacks bypass it.</w:t>
       </w:r>
     </w:p>
     <w:p>
@@ -37,7 +37,7 @@
         <w:rPr>
           <w:b/>
         </w:rPr>
-        <w:t>Headline results (multi-seed mean across seeds 7, 42, 99): ROC AUC 0.997, recall 92.2%, FPR 0.41%, fidelity 0.62, TtE 4 generations, 35 distinct attack vectors.</w:t>
+        <w:t>Headline results (seeds 7/42/99, IEEE-CIS calibrated): ROC AUC 0.997, Sentinel recall 90.0%, static rules recall 1.6%, FPR 0.42%, TtE 4 gens, 38 vectors (13 tier-A playbooks).</w:t>
       </w:r>
     </w:p>
     <w:p>
@@ -45,12 +45,31 @@
         <w:pStyle w:val="Heading1"/>
       </w:pPr>
       <w:r>
-        <w:t>2. Threat Landscape — Fraud Genome (35 Vectors)</w:t>
+        <w:t>2. Triple-Agent Council</w:t>
       </w:r>
     </w:p>
     <w:p>
       <w:r>
-        <w:t>We mapped 35 GenAI-enabled payment fraud vectors across UPI, card, wire, and wallet rails; social engineering, KYC onboarding, agentic checkout, behavioral, customer support, and infrastructure surfaces. Each vector is encoded as a machine-readable AttackGenome JSON with TTPs, observables, and executable playbooks.</w:t>
+        <w:t>Scout Agent: reads curated threat intel (FBI AI-fraud, India digital-arrest, NPCI UPI advisories) plus defender blind spots; proposes new AttackGenome JSON each 2 generations (DeepSeek API, offline fallback included).</w:t>
+        <w:br/>
+        <w:br/>
+        <w:t>Forge Agent: LLM-enriches scam artifacts (SMS, transcripts, emails) for realism; cached per attack_id.</w:t>
+        <w:br/>
+        <w:br/>
+        <w:t>Critic Agent: analyzes detection rates and feature blind spots; narrates mutation strategy in the Agent Council UI.</w:t>
+      </w:r>
+    </w:p>
+    <w:p>
+      <w:pPr>
+        <w:pStyle w:val="Heading1"/>
+      </w:pPr>
+      <w:r>
+        <w:t>3. Threat Landscape — Fraud Genome</w:t>
+      </w:r>
+    </w:p>
+    <w:p>
+      <w:r>
+        <w:t>38 vectors tiered honestly: Tier A = dedicated playbook, Tier B = param variant, Tier C = Scout-discovered at runtime.</w:t>
       </w:r>
     </w:p>
     <w:tbl>
@@ -60,17 +79,18 @@
         <w:tblLook w:firstColumn="1" w:firstRow="1" w:lastColumn="0" w:lastRow="0" w:noHBand="0" w:noVBand="1" w:val="04A0"/>
       </w:tblPr>
       <w:tblGrid>
-        <w:gridCol w:w="1440"/>
-        <w:gridCol w:w="1440"/>
-        <w:gridCol w:w="1440"/>
-        <w:gridCol w:w="1440"/>
-        <w:gridCol w:w="1440"/>
-        <w:gridCol w:w="1440"/>
+        <w:gridCol w:w="1234"/>
+        <w:gridCol w:w="1234"/>
+        <w:gridCol w:w="1234"/>
+        <w:gridCol w:w="1234"/>
+        <w:gridCol w:w="1234"/>
+        <w:gridCol w:w="1234"/>
+        <w:gridCol w:w="1234"/>
       </w:tblGrid>
       <w:tr>
         <w:tc>
           <w:tcPr>
-            <w:tcW w:type="dxa" w:w="1440"/>
+            <w:tcW w:type="dxa" w:w="1234"/>
           </w:tcPr>
           <w:p>
             <w:r>
@@ -80,7 +100,17 @@
         </w:tc>
         <w:tc>
           <w:tcPr>
-            <w:tcW w:type="dxa" w:w="1440"/>
+            <w:tcW w:type="dxa" w:w="1234"/>
+          </w:tcPr>
+          <w:p>
+            <w:r>
+              <w:t>Tier</w:t>
+            </w:r>
+          </w:p>
+        </w:tc>
+        <w:tc>
+          <w:tcPr>
+            <w:tcW w:type="dxa" w:w="1234"/>
           </w:tcPr>
           <w:p>
             <w:r>
@@ -90,7 +120,7 @@
         </w:tc>
         <w:tc>
           <w:tcPr>
-            <w:tcW w:type="dxa" w:w="1440"/>
+            <w:tcW w:type="dxa" w:w="1234"/>
           </w:tcPr>
           <w:p>
             <w:r>
@@ -100,7 +130,7 @@
         </w:tc>
         <w:tc>
           <w:tcPr>
-            <w:tcW w:type="dxa" w:w="1440"/>
+            <w:tcW w:type="dxa" w:w="1234"/>
           </w:tcPr>
           <w:p>
             <w:r>
@@ -110,17 +140,17 @@
         </w:tc>
         <w:tc>
           <w:tcPr>
-            <w:tcW w:type="dxa" w:w="1440"/>
-          </w:tcPr>
-          <w:p>
-            <w:r>
-              <w:t>GenAI Capability</w:t>
-            </w:r>
-          </w:p>
-        </w:tc>
-        <w:tc>
-          <w:tcPr>
-            <w:tcW w:type="dxa" w:w="1440"/>
+            <w:tcW w:type="dxa" w:w="1234"/>
+          </w:tcPr>
+          <w:p>
+            <w:r>
+              <w:t>Capability</w:t>
+            </w:r>
+          </w:p>
+        </w:tc>
+        <w:tc>
+          <w:tcPr>
+            <w:tcW w:type="dxa" w:w="1234"/>
           </w:tcPr>
           <w:p>
             <w:r>
@@ -132,7 +162,7 @@
       <w:tr>
         <w:tc>
           <w:tcPr>
-            <w:tcW w:type="dxa" w:w="1440"/>
+            <w:tcW w:type="dxa" w:w="1234"/>
           </w:tcPr>
           <w:p>
             <w:r>
@@ -142,17 +172,27 @@
         </w:tc>
         <w:tc>
           <w:tcPr>
-            <w:tcW w:type="dxa" w:w="1440"/>
-          </w:tcPr>
-          <w:p>
-            <w:r>
-              <w:t>Voice-clone relative-in-emergency UPI drain</w:t>
-            </w:r>
-          </w:p>
-        </w:tc>
-        <w:tc>
-          <w:tcPr>
-            <w:tcW w:type="dxa" w:w="1440"/>
+            <w:tcW w:type="dxa" w:w="1234"/>
+          </w:tcPr>
+          <w:p>
+            <w:r>
+              <w:t>A</w:t>
+            </w:r>
+          </w:p>
+        </w:tc>
+        <w:tc>
+          <w:tcPr>
+            <w:tcW w:type="dxa" w:w="1234"/>
+          </w:tcPr>
+          <w:p>
+            <w:r>
+              <w:t>Voice-clone relative-in-emergency UPI dr</w:t>
+            </w:r>
+          </w:p>
+        </w:tc>
+        <w:tc>
+          <w:tcPr>
+            <w:tcW w:type="dxa" w:w="1234"/>
           </w:tcPr>
           <w:p>
             <w:r>
@@ -162,7 +202,7 @@
         </w:tc>
         <w:tc>
           <w:tcPr>
-            <w:tcW w:type="dxa" w:w="1440"/>
+            <w:tcW w:type="dxa" w:w="1234"/>
           </w:tcPr>
           <w:p>
             <w:r>
@@ -172,7 +212,7 @@
         </w:tc>
         <w:tc>
           <w:tcPr>
-            <w:tcW w:type="dxa" w:w="1440"/>
+            <w:tcW w:type="dxa" w:w="1234"/>
           </w:tcPr>
           <w:p>
             <w:r>
@@ -182,7 +222,7 @@
         </w:tc>
         <w:tc>
           <w:tcPr>
-            <w:tcW w:type="dxa" w:w="1440"/>
+            <w:tcW w:type="dxa" w:w="1234"/>
           </w:tcPr>
           <w:p>
             <w:r>
@@ -194,7 +234,7 @@
       <w:tr>
         <w:tc>
           <w:tcPr>
-            <w:tcW w:type="dxa" w:w="1440"/>
+            <w:tcW w:type="dxa" w:w="1234"/>
           </w:tcPr>
           <w:p>
             <w:r>
@@ -204,17 +244,27 @@
         </w:tc>
         <w:tc>
           <w:tcPr>
-            <w:tcW w:type="dxa" w:w="1440"/>
-          </w:tcPr>
-          <w:p>
-            <w:r>
-              <w:t>Deepfake digital-arrest savings exfiltration</w:t>
-            </w:r>
-          </w:p>
-        </w:tc>
-        <w:tc>
-          <w:tcPr>
-            <w:tcW w:type="dxa" w:w="1440"/>
+            <w:tcW w:type="dxa" w:w="1234"/>
+          </w:tcPr>
+          <w:p>
+            <w:r>
+              <w:t>A</w:t>
+            </w:r>
+          </w:p>
+        </w:tc>
+        <w:tc>
+          <w:tcPr>
+            <w:tcW w:type="dxa" w:w="1234"/>
+          </w:tcPr>
+          <w:p>
+            <w:r>
+              <w:t>Deepfake digital-arrest savings exfiltra</w:t>
+            </w:r>
+          </w:p>
+        </w:tc>
+        <w:tc>
+          <w:tcPr>
+            <w:tcW w:type="dxa" w:w="1234"/>
           </w:tcPr>
           <w:p>
             <w:r>
@@ -224,7 +274,7 @@
         </w:tc>
         <w:tc>
           <w:tcPr>
-            <w:tcW w:type="dxa" w:w="1440"/>
+            <w:tcW w:type="dxa" w:w="1234"/>
           </w:tcPr>
           <w:p>
             <w:r>
@@ -234,17 +284,17 @@
         </w:tc>
         <w:tc>
           <w:tcPr>
-            <w:tcW w:type="dxa" w:w="1440"/>
-          </w:tcPr>
-          <w:p>
-            <w:r>
-              <w:t>deepfake_video, voice_clone, text_generation</w:t>
-            </w:r>
-          </w:p>
-        </w:tc>
-        <w:tc>
-          <w:tcPr>
-            <w:tcW w:type="dxa" w:w="1440"/>
+            <w:tcW w:type="dxa" w:w="1234"/>
+          </w:tcPr>
+          <w:p>
+            <w:r>
+              <w:t>deepfake_video, voice_clone, t</w:t>
+            </w:r>
+          </w:p>
+        </w:tc>
+        <w:tc>
+          <w:tcPr>
+            <w:tcW w:type="dxa" w:w="1234"/>
           </w:tcPr>
           <w:p>
             <w:r>
@@ -256,7 +306,7 @@
       <w:tr>
         <w:tc>
           <w:tcPr>
-            <w:tcW w:type="dxa" w:w="1440"/>
+            <w:tcW w:type="dxa" w:w="1234"/>
           </w:tcPr>
           <w:p>
             <w:r>
@@ -266,7 +316,17 @@
         </w:tc>
         <w:tc>
           <w:tcPr>
-            <w:tcW w:type="dxa" w:w="1440"/>
+            <w:tcW w:type="dxa" w:w="1234"/>
+          </w:tcPr>
+          <w:p>
+            <w:r>
+              <w:t>A</w:t>
+            </w:r>
+          </w:p>
+        </w:tc>
+        <w:tc>
+          <w:tcPr>
+            <w:tcW w:type="dxa" w:w="1234"/>
           </w:tcPr>
           <w:p>
             <w:r>
@@ -276,7 +336,7 @@
         </w:tc>
         <w:tc>
           <w:tcPr>
-            <w:tcW w:type="dxa" w:w="1440"/>
+            <w:tcW w:type="dxa" w:w="1234"/>
           </w:tcPr>
           <w:p>
             <w:r>
@@ -286,17 +346,17 @@
         </w:tc>
         <w:tc>
           <w:tcPr>
-            <w:tcW w:type="dxa" w:w="1440"/>
-          </w:tcPr>
-          <w:p>
-            <w:r>
-              <w:t>social_engineering, customer_support</w:t>
-            </w:r>
-          </w:p>
-        </w:tc>
-        <w:tc>
-          <w:tcPr>
-            <w:tcW w:type="dxa" w:w="1440"/>
+            <w:tcW w:type="dxa" w:w="1234"/>
+          </w:tcPr>
+          <w:p>
+            <w:r>
+              <w:t>social_engineering, customer_s</w:t>
+            </w:r>
+          </w:p>
+        </w:tc>
+        <w:tc>
+          <w:tcPr>
+            <w:tcW w:type="dxa" w:w="1234"/>
           </w:tcPr>
           <w:p>
             <w:r>
@@ -306,7 +366,7 @@
         </w:tc>
         <w:tc>
           <w:tcPr>
-            <w:tcW w:type="dxa" w:w="1440"/>
+            <w:tcW w:type="dxa" w:w="1234"/>
           </w:tcPr>
           <w:p>
             <w:r>
@@ -318,7 +378,7 @@
       <w:tr>
         <w:tc>
           <w:tcPr>
-            <w:tcW w:type="dxa" w:w="1440"/>
+            <w:tcW w:type="dxa" w:w="1234"/>
           </w:tcPr>
           <w:p>
             <w:r>
@@ -328,7 +388,17 @@
         </w:tc>
         <w:tc>
           <w:tcPr>
-            <w:tcW w:type="dxa" w:w="1440"/>
+            <w:tcW w:type="dxa" w:w="1234"/>
+          </w:tcPr>
+          <w:p>
+            <w:r>
+              <w:t>A</w:t>
+            </w:r>
+          </w:p>
+        </w:tc>
+        <w:tc>
+          <w:tcPr>
+            <w:tcW w:type="dxa" w:w="1234"/>
           </w:tcPr>
           <w:p>
             <w:r>
@@ -338,7 +408,7 @@
         </w:tc>
         <w:tc>
           <w:tcPr>
-            <w:tcW w:type="dxa" w:w="1440"/>
+            <w:tcW w:type="dxa" w:w="1234"/>
           </w:tcPr>
           <w:p>
             <w:r>
@@ -348,7 +418,7 @@
         </w:tc>
         <w:tc>
           <w:tcPr>
-            <w:tcW w:type="dxa" w:w="1440"/>
+            <w:tcW w:type="dxa" w:w="1234"/>
           </w:tcPr>
           <w:p>
             <w:r>
@@ -358,17 +428,17 @@
         </w:tc>
         <w:tc>
           <w:tcPr>
-            <w:tcW w:type="dxa" w:w="1440"/>
-          </w:tcPr>
-          <w:p>
-            <w:r>
-              <w:t>image_generation, document_forgery, deepfake_video</w:t>
-            </w:r>
-          </w:p>
-        </w:tc>
-        <w:tc>
-          <w:tcPr>
-            <w:tcW w:type="dxa" w:w="1440"/>
+            <w:tcW w:type="dxa" w:w="1234"/>
+          </w:tcPr>
+          <w:p>
+            <w:r>
+              <w:t>image_generation, document_for</w:t>
+            </w:r>
+          </w:p>
+        </w:tc>
+        <w:tc>
+          <w:tcPr>
+            <w:tcW w:type="dxa" w:w="1234"/>
           </w:tcPr>
           <w:p>
             <w:r>
@@ -380,7 +450,7 @@
       <w:tr>
         <w:tc>
           <w:tcPr>
-            <w:tcW w:type="dxa" w:w="1440"/>
+            <w:tcW w:type="dxa" w:w="1234"/>
           </w:tcPr>
           <w:p>
             <w:r>
@@ -390,17 +460,27 @@
         </w:tc>
         <w:tc>
           <w:tcPr>
-            <w:tcW w:type="dxa" w:w="1440"/>
-          </w:tcPr>
-          <w:p>
-            <w:r>
-              <w:t>Personalized smishing refund phish -&gt; CNP spend</w:t>
-            </w:r>
-          </w:p>
-        </w:tc>
-        <w:tc>
-          <w:tcPr>
-            <w:tcW w:type="dxa" w:w="1440"/>
+            <w:tcW w:type="dxa" w:w="1234"/>
+          </w:tcPr>
+          <w:p>
+            <w:r>
+              <w:t>A</w:t>
+            </w:r>
+          </w:p>
+        </w:tc>
+        <w:tc>
+          <w:tcPr>
+            <w:tcW w:type="dxa" w:w="1234"/>
+          </w:tcPr>
+          <w:p>
+            <w:r>
+              <w:t>Personalized smishing refund phish -&gt; CN</w:t>
+            </w:r>
+          </w:p>
+        </w:tc>
+        <w:tc>
+          <w:tcPr>
+            <w:tcW w:type="dxa" w:w="1234"/>
           </w:tcPr>
           <w:p>
             <w:r>
@@ -410,7 +490,7 @@
         </w:tc>
         <w:tc>
           <w:tcPr>
-            <w:tcW w:type="dxa" w:w="1440"/>
+            <w:tcW w:type="dxa" w:w="1234"/>
           </w:tcPr>
           <w:p>
             <w:r>
@@ -420,7 +500,7 @@
         </w:tc>
         <w:tc>
           <w:tcPr>
-            <w:tcW w:type="dxa" w:w="1440"/>
+            <w:tcW w:type="dxa" w:w="1234"/>
           </w:tcPr>
           <w:p>
             <w:r>
@@ -430,7 +510,7 @@
         </w:tc>
         <w:tc>
           <w:tcPr>
-            <w:tcW w:type="dxa" w:w="1440"/>
+            <w:tcW w:type="dxa" w:w="1234"/>
           </w:tcPr>
           <w:p>
             <w:r>
@@ -442,7 +522,7 @@
       <w:tr>
         <w:tc>
           <w:tcPr>
-            <w:tcW w:type="dxa" w:w="1440"/>
+            <w:tcW w:type="dxa" w:w="1234"/>
           </w:tcPr>
           <w:p>
             <w:r>
@@ -452,7 +532,17 @@
         </w:tc>
         <w:tc>
           <w:tcPr>
-            <w:tcW w:type="dxa" w:w="1440"/>
+            <w:tcW w:type="dxa" w:w="1234"/>
+          </w:tcPr>
+          <w:p>
+            <w:r>
+              <w:t>A</w:t>
+            </w:r>
+          </w:p>
+        </w:tc>
+        <w:tc>
+          <w:tcPr>
+            <w:tcW w:type="dxa" w:w="1234"/>
           </w:tcPr>
           <w:p>
             <w:r>
@@ -462,7 +552,7 @@
         </w:tc>
         <w:tc>
           <w:tcPr>
-            <w:tcW w:type="dxa" w:w="1440"/>
+            <w:tcW w:type="dxa" w:w="1234"/>
           </w:tcPr>
           <w:p>
             <w:r>
@@ -472,7 +562,7 @@
         </w:tc>
         <w:tc>
           <w:tcPr>
-            <w:tcW w:type="dxa" w:w="1440"/>
+            <w:tcW w:type="dxa" w:w="1234"/>
           </w:tcPr>
           <w:p>
             <w:r>
@@ -482,7 +572,7 @@
         </w:tc>
         <w:tc>
           <w:tcPr>
-            <w:tcW w:type="dxa" w:w="1440"/>
+            <w:tcW w:type="dxa" w:w="1234"/>
           </w:tcPr>
           <w:p>
             <w:r>
@@ -492,7 +582,7 @@
         </w:tc>
         <w:tc>
           <w:tcPr>
-            <w:tcW w:type="dxa" w:w="1440"/>
+            <w:tcW w:type="dxa" w:w="1234"/>
           </w:tcPr>
           <w:p>
             <w:r>
@@ -504,7 +594,7 @@
       <w:tr>
         <w:tc>
           <w:tcPr>
-            <w:tcW w:type="dxa" w:w="1440"/>
+            <w:tcW w:type="dxa" w:w="1234"/>
           </w:tcPr>
           <w:p>
             <w:r>
@@ -514,17 +604,27 @@
         </w:tc>
         <w:tc>
           <w:tcPr>
-            <w:tcW w:type="dxa" w:w="1440"/>
-          </w:tcPr>
-          <w:p>
-            <w:r>
-              <w:t>Prompt-injected agentic-checkout gift-card fraud</w:t>
-            </w:r>
-          </w:p>
-        </w:tc>
-        <w:tc>
-          <w:tcPr>
-            <w:tcW w:type="dxa" w:w="1440"/>
+            <w:tcW w:type="dxa" w:w="1234"/>
+          </w:tcPr>
+          <w:p>
+            <w:r>
+              <w:t>A</w:t>
+            </w:r>
+          </w:p>
+        </w:tc>
+        <w:tc>
+          <w:tcPr>
+            <w:tcW w:type="dxa" w:w="1234"/>
+          </w:tcPr>
+          <w:p>
+            <w:r>
+              <w:t>Prompt-injected agentic-checkout gift-ca</w:t>
+            </w:r>
+          </w:p>
+        </w:tc>
+        <w:tc>
+          <w:tcPr>
+            <w:tcW w:type="dxa" w:w="1234"/>
           </w:tcPr>
           <w:p>
             <w:r>
@@ -534,7 +634,7 @@
         </w:tc>
         <w:tc>
           <w:tcPr>
-            <w:tcW w:type="dxa" w:w="1440"/>
+            <w:tcW w:type="dxa" w:w="1234"/>
           </w:tcPr>
           <w:p>
             <w:r>
@@ -544,17 +644,17 @@
         </w:tc>
         <w:tc>
           <w:tcPr>
-            <w:tcW w:type="dxa" w:w="1440"/>
-          </w:tcPr>
-          <w:p>
-            <w:r>
-              <w:t>agent_orchestration, text_generation, image_generation</w:t>
-            </w:r>
-          </w:p>
-        </w:tc>
-        <w:tc>
-          <w:tcPr>
-            <w:tcW w:type="dxa" w:w="1440"/>
+            <w:tcW w:type="dxa" w:w="1234"/>
+          </w:tcPr>
+          <w:p>
+            <w:r>
+              <w:t>agent_orchestration, text_gene</w:t>
+            </w:r>
+          </w:p>
+        </w:tc>
+        <w:tc>
+          <w:tcPr>
+            <w:tcW w:type="dxa" w:w="1234"/>
           </w:tcPr>
           <w:p>
             <w:r>
@@ -566,7 +666,7 @@
       <w:tr>
         <w:tc>
           <w:tcPr>
-            <w:tcW w:type="dxa" w:w="1440"/>
+            <w:tcW w:type="dxa" w:w="1234"/>
           </w:tcPr>
           <w:p>
             <w:r>
@@ -576,17 +676,27 @@
         </w:tc>
         <w:tc>
           <w:tcPr>
-            <w:tcW w:type="dxa" w:w="1440"/>
-          </w:tcPr>
-          <w:p>
-            <w:r>
-              <w:t>LLM task-scam mule-network recruitment + layering</w:t>
-            </w:r>
-          </w:p>
-        </w:tc>
-        <w:tc>
-          <w:tcPr>
-            <w:tcW w:type="dxa" w:w="1440"/>
+            <w:tcW w:type="dxa" w:w="1234"/>
+          </w:tcPr>
+          <w:p>
+            <w:r>
+              <w:t>A</w:t>
+            </w:r>
+          </w:p>
+        </w:tc>
+        <w:tc>
+          <w:tcPr>
+            <w:tcW w:type="dxa" w:w="1234"/>
+          </w:tcPr>
+          <w:p>
+            <w:r>
+              <w:t>LLM task-scam mule-network recruitment +</w:t>
+            </w:r>
+          </w:p>
+        </w:tc>
+        <w:tc>
+          <w:tcPr>
+            <w:tcW w:type="dxa" w:w="1234"/>
           </w:tcPr>
           <w:p>
             <w:r>
@@ -596,27 +706,27 @@
         </w:tc>
         <w:tc>
           <w:tcPr>
-            <w:tcW w:type="dxa" w:w="1440"/>
-          </w:tcPr>
-          <w:p>
-            <w:r>
-              <w:t>infrastructure, social_engineering</w:t>
-            </w:r>
-          </w:p>
-        </w:tc>
-        <w:tc>
-          <w:tcPr>
-            <w:tcW w:type="dxa" w:w="1440"/>
-          </w:tcPr>
-          <w:p>
-            <w:r>
-              <w:t>text_generation, agent_orchestration</w:t>
-            </w:r>
-          </w:p>
-        </w:tc>
-        <w:tc>
-          <w:tcPr>
-            <w:tcW w:type="dxa" w:w="1440"/>
+            <w:tcW w:type="dxa" w:w="1234"/>
+          </w:tcPr>
+          <w:p>
+            <w:r>
+              <w:t>infrastructure, social_enginee</w:t>
+            </w:r>
+          </w:p>
+        </w:tc>
+        <w:tc>
+          <w:tcPr>
+            <w:tcW w:type="dxa" w:w="1234"/>
+          </w:tcPr>
+          <w:p>
+            <w:r>
+              <w:t>text_generation, agent_orchest</w:t>
+            </w:r>
+          </w:p>
+        </w:tc>
+        <w:tc>
+          <w:tcPr>
+            <w:tcW w:type="dxa" w:w="1234"/>
           </w:tcPr>
           <w:p>
             <w:r>
@@ -628,7 +738,7 @@
       <w:tr>
         <w:tc>
           <w:tcPr>
-            <w:tcW w:type="dxa" w:w="1440"/>
+            <w:tcW w:type="dxa" w:w="1234"/>
           </w:tcPr>
           <w:p>
             <w:r>
@@ -638,7 +748,17 @@
         </w:tc>
         <w:tc>
           <w:tcPr>
-            <w:tcW w:type="dxa" w:w="1440"/>
+            <w:tcW w:type="dxa" w:w="1234"/>
+          </w:tcPr>
+          <w:p>
+            <w:r>
+              <w:t>A</w:t>
+            </w:r>
+          </w:p>
+        </w:tc>
+        <w:tc>
+          <w:tcPr>
+            <w:tcW w:type="dxa" w:w="1234"/>
           </w:tcPr>
           <w:p>
             <w:r>
@@ -648,7 +768,7 @@
         </w:tc>
         <w:tc>
           <w:tcPr>
-            <w:tcW w:type="dxa" w:w="1440"/>
+            <w:tcW w:type="dxa" w:w="1234"/>
           </w:tcPr>
           <w:p>
             <w:r>
@@ -658,7 +778,7 @@
         </w:tc>
         <w:tc>
           <w:tcPr>
-            <w:tcW w:type="dxa" w:w="1440"/>
+            <w:tcW w:type="dxa" w:w="1234"/>
           </w:tcPr>
           <w:p>
             <w:r>
@@ -668,17 +788,17 @@
         </w:tc>
         <w:tc>
           <w:tcPr>
-            <w:tcW w:type="dxa" w:w="1440"/>
-          </w:tcPr>
-          <w:p>
-            <w:r>
-              <w:t>image_generation, text_generation</w:t>
-            </w:r>
-          </w:p>
-        </w:tc>
-        <w:tc>
-          <w:tcPr>
-            <w:tcW w:type="dxa" w:w="1440"/>
+            <w:tcW w:type="dxa" w:w="1234"/>
+          </w:tcPr>
+          <w:p>
+            <w:r>
+              <w:t>image_generation, text_generat</w:t>
+            </w:r>
+          </w:p>
+        </w:tc>
+        <w:tc>
+          <w:tcPr>
+            <w:tcW w:type="dxa" w:w="1234"/>
           </w:tcPr>
           <w:p>
             <w:r>
@@ -690,7 +810,7 @@
       <w:tr>
         <w:tc>
           <w:tcPr>
-            <w:tcW w:type="dxa" w:w="1440"/>
+            <w:tcW w:type="dxa" w:w="1234"/>
           </w:tcPr>
           <w:p>
             <w:r>
@@ -700,7 +820,17 @@
         </w:tc>
         <w:tc>
           <w:tcPr>
-            <w:tcW w:type="dxa" w:w="1440"/>
+            <w:tcW w:type="dxa" w:w="1234"/>
+          </w:tcPr>
+          <w:p>
+            <w:r>
+              <w:t>A</w:t>
+            </w:r>
+          </w:p>
+        </w:tc>
+        <w:tc>
+          <w:tcPr>
+            <w:tcW w:type="dxa" w:w="1234"/>
           </w:tcPr>
           <w:p>
             <w:r>
@@ -710,7 +840,7 @@
         </w:tc>
         <w:tc>
           <w:tcPr>
-            <w:tcW w:type="dxa" w:w="1440"/>
+            <w:tcW w:type="dxa" w:w="1234"/>
           </w:tcPr>
           <w:p>
             <w:r>
@@ -720,7 +850,7 @@
         </w:tc>
         <w:tc>
           <w:tcPr>
-            <w:tcW w:type="dxa" w:w="1440"/>
+            <w:tcW w:type="dxa" w:w="1234"/>
           </w:tcPr>
           <w:p>
             <w:r>
@@ -730,17 +860,17 @@
         </w:tc>
         <w:tc>
           <w:tcPr>
-            <w:tcW w:type="dxa" w:w="1440"/>
-          </w:tcPr>
-          <w:p>
-            <w:r>
-              <w:t>image_generation, deepfake_video, text_generation</w:t>
-            </w:r>
-          </w:p>
-        </w:tc>
-        <w:tc>
-          <w:tcPr>
-            <w:tcW w:type="dxa" w:w="1440"/>
+            <w:tcW w:type="dxa" w:w="1234"/>
+          </w:tcPr>
+          <w:p>
+            <w:r>
+              <w:t>image_generation, deepfake_vid</w:t>
+            </w:r>
+          </w:p>
+        </w:tc>
+        <w:tc>
+          <w:tcPr>
+            <w:tcW w:type="dxa" w:w="1234"/>
           </w:tcPr>
           <w:p>
             <w:r>
@@ -752,7 +882,7 @@
       <w:tr>
         <w:tc>
           <w:tcPr>
-            <w:tcW w:type="dxa" w:w="1440"/>
+            <w:tcW w:type="dxa" w:w="1234"/>
           </w:tcPr>
           <w:p>
             <w:r>
@@ -762,7 +892,17 @@
         </w:tc>
         <w:tc>
           <w:tcPr>
-            <w:tcW w:type="dxa" w:w="1440"/>
+            <w:tcW w:type="dxa" w:w="1234"/>
+          </w:tcPr>
+          <w:p>
+            <w:r>
+              <w:t>B</w:t>
+            </w:r>
+          </w:p>
+        </w:tc>
+        <w:tc>
+          <w:tcPr>
+            <w:tcW w:type="dxa" w:w="1234"/>
           </w:tcPr>
           <w:p>
             <w:r>
@@ -772,7 +912,7 @@
         </w:tc>
         <w:tc>
           <w:tcPr>
-            <w:tcW w:type="dxa" w:w="1440"/>
+            <w:tcW w:type="dxa" w:w="1234"/>
           </w:tcPr>
           <w:p>
             <w:r>
@@ -782,7 +922,7 @@
         </w:tc>
         <w:tc>
           <w:tcPr>
-            <w:tcW w:type="dxa" w:w="1440"/>
+            <w:tcW w:type="dxa" w:w="1234"/>
           </w:tcPr>
           <w:p>
             <w:r>
@@ -792,7 +932,7 @@
         </w:tc>
         <w:tc>
           <w:tcPr>
-            <w:tcW w:type="dxa" w:w="1440"/>
+            <w:tcW w:type="dxa" w:w="1234"/>
           </w:tcPr>
           <w:p>
             <w:r>
@@ -802,7 +942,7 @@
         </w:tc>
         <w:tc>
           <w:tcPr>
-            <w:tcW w:type="dxa" w:w="1440"/>
+            <w:tcW w:type="dxa" w:w="1234"/>
           </w:tcPr>
           <w:p>
             <w:r>
@@ -814,7 +954,7 @@
       <w:tr>
         <w:tc>
           <w:tcPr>
-            <w:tcW w:type="dxa" w:w="1440"/>
+            <w:tcW w:type="dxa" w:w="1234"/>
           </w:tcPr>
           <w:p>
             <w:r>
@@ -824,7 +964,17 @@
         </w:tc>
         <w:tc>
           <w:tcPr>
-            <w:tcW w:type="dxa" w:w="1440"/>
+            <w:tcW w:type="dxa" w:w="1234"/>
+          </w:tcPr>
+          <w:p>
+            <w:r>
+              <w:t>B</w:t>
+            </w:r>
+          </w:p>
+        </w:tc>
+        <w:tc>
+          <w:tcPr>
+            <w:tcW w:type="dxa" w:w="1234"/>
           </w:tcPr>
           <w:p>
             <w:r>
@@ -834,7 +984,7 @@
         </w:tc>
         <w:tc>
           <w:tcPr>
-            <w:tcW w:type="dxa" w:w="1440"/>
+            <w:tcW w:type="dxa" w:w="1234"/>
           </w:tcPr>
           <w:p>
             <w:r>
@@ -844,7 +994,7 @@
         </w:tc>
         <w:tc>
           <w:tcPr>
-            <w:tcW w:type="dxa" w:w="1440"/>
+            <w:tcW w:type="dxa" w:w="1234"/>
           </w:tcPr>
           <w:p>
             <w:r>
@@ -854,17 +1004,17 @@
         </w:tc>
         <w:tc>
           <w:tcPr>
-            <w:tcW w:type="dxa" w:w="1440"/>
-          </w:tcPr>
-          <w:p>
-            <w:r>
-              <w:t>text_generation, document_forgery</w:t>
-            </w:r>
-          </w:p>
-        </w:tc>
-        <w:tc>
-          <w:tcPr>
-            <w:tcW w:type="dxa" w:w="1440"/>
+            <w:tcW w:type="dxa" w:w="1234"/>
+          </w:tcPr>
+          <w:p>
+            <w:r>
+              <w:t>text_generation, document_forg</w:t>
+            </w:r>
+          </w:p>
+        </w:tc>
+        <w:tc>
+          <w:tcPr>
+            <w:tcW w:type="dxa" w:w="1234"/>
           </w:tcPr>
           <w:p>
             <w:r>
@@ -876,7 +1026,7 @@
       <w:tr>
         <w:tc>
           <w:tcPr>
-            <w:tcW w:type="dxa" w:w="1440"/>
+            <w:tcW w:type="dxa" w:w="1234"/>
           </w:tcPr>
           <w:p>
             <w:r>
@@ -886,7 +1036,17 @@
         </w:tc>
         <w:tc>
           <w:tcPr>
-            <w:tcW w:type="dxa" w:w="1440"/>
+            <w:tcW w:type="dxa" w:w="1234"/>
+          </w:tcPr>
+          <w:p>
+            <w:r>
+              <w:t>B</w:t>
+            </w:r>
+          </w:p>
+        </w:tc>
+        <w:tc>
+          <w:tcPr>
+            <w:tcW w:type="dxa" w:w="1234"/>
           </w:tcPr>
           <w:p>
             <w:r>
@@ -896,7 +1056,7 @@
         </w:tc>
         <w:tc>
           <w:tcPr>
-            <w:tcW w:type="dxa" w:w="1440"/>
+            <w:tcW w:type="dxa" w:w="1234"/>
           </w:tcPr>
           <w:p>
             <w:r>
@@ -906,7 +1066,7 @@
         </w:tc>
         <w:tc>
           <w:tcPr>
-            <w:tcW w:type="dxa" w:w="1440"/>
+            <w:tcW w:type="dxa" w:w="1234"/>
           </w:tcPr>
           <w:p>
             <w:r>
@@ -916,17 +1076,17 @@
         </w:tc>
         <w:tc>
           <w:tcPr>
-            <w:tcW w:type="dxa" w:w="1440"/>
-          </w:tcPr>
-          <w:p>
-            <w:r>
-              <w:t>text_generation, agent_orchestration</w:t>
-            </w:r>
-          </w:p>
-        </w:tc>
-        <w:tc>
-          <w:tcPr>
-            <w:tcW w:type="dxa" w:w="1440"/>
+            <w:tcW w:type="dxa" w:w="1234"/>
+          </w:tcPr>
+          <w:p>
+            <w:r>
+              <w:t>text_generation, agent_orchest</w:t>
+            </w:r>
+          </w:p>
+        </w:tc>
+        <w:tc>
+          <w:tcPr>
+            <w:tcW w:type="dxa" w:w="1234"/>
           </w:tcPr>
           <w:p>
             <w:r>
@@ -938,7 +1098,7 @@
       <w:tr>
         <w:tc>
           <w:tcPr>
-            <w:tcW w:type="dxa" w:w="1440"/>
+            <w:tcW w:type="dxa" w:w="1234"/>
           </w:tcPr>
           <w:p>
             <w:r>
@@ -948,7 +1108,17 @@
         </w:tc>
         <w:tc>
           <w:tcPr>
-            <w:tcW w:type="dxa" w:w="1440"/>
+            <w:tcW w:type="dxa" w:w="1234"/>
+          </w:tcPr>
+          <w:p>
+            <w:r>
+              <w:t>B</w:t>
+            </w:r>
+          </w:p>
+        </w:tc>
+        <w:tc>
+          <w:tcPr>
+            <w:tcW w:type="dxa" w:w="1234"/>
           </w:tcPr>
           <w:p>
             <w:r>
@@ -958,7 +1128,7 @@
         </w:tc>
         <w:tc>
           <w:tcPr>
-            <w:tcW w:type="dxa" w:w="1440"/>
+            <w:tcW w:type="dxa" w:w="1234"/>
           </w:tcPr>
           <w:p>
             <w:r>
@@ -968,7 +1138,7 @@
         </w:tc>
         <w:tc>
           <w:tcPr>
-            <w:tcW w:type="dxa" w:w="1440"/>
+            <w:tcW w:type="dxa" w:w="1234"/>
           </w:tcPr>
           <w:p>
             <w:r>
@@ -978,7 +1148,7 @@
         </w:tc>
         <w:tc>
           <w:tcPr>
-            <w:tcW w:type="dxa" w:w="1440"/>
+            <w:tcW w:type="dxa" w:w="1234"/>
           </w:tcPr>
           <w:p>
             <w:r>
@@ -988,7 +1158,7 @@
         </w:tc>
         <w:tc>
           <w:tcPr>
-            <w:tcW w:type="dxa" w:w="1440"/>
+            <w:tcW w:type="dxa" w:w="1234"/>
           </w:tcPr>
           <w:p>
             <w:r>
@@ -1000,7 +1170,7 @@
       <w:tr>
         <w:tc>
           <w:tcPr>
-            <w:tcW w:type="dxa" w:w="1440"/>
+            <w:tcW w:type="dxa" w:w="1234"/>
           </w:tcPr>
           <w:p>
             <w:r>
@@ -1010,7 +1180,17 @@
         </w:tc>
         <w:tc>
           <w:tcPr>
-            <w:tcW w:type="dxa" w:w="1440"/>
+            <w:tcW w:type="dxa" w:w="1234"/>
+          </w:tcPr>
+          <w:p>
+            <w:r>
+              <w:t>B</w:t>
+            </w:r>
+          </w:p>
+        </w:tc>
+        <w:tc>
+          <w:tcPr>
+            <w:tcW w:type="dxa" w:w="1234"/>
           </w:tcPr>
           <w:p>
             <w:r>
@@ -1020,7 +1200,7 @@
         </w:tc>
         <w:tc>
           <w:tcPr>
-            <w:tcW w:type="dxa" w:w="1440"/>
+            <w:tcW w:type="dxa" w:w="1234"/>
           </w:tcPr>
           <w:p>
             <w:r>
@@ -1030,7 +1210,7 @@
         </w:tc>
         <w:tc>
           <w:tcPr>
-            <w:tcW w:type="dxa" w:w="1440"/>
+            <w:tcW w:type="dxa" w:w="1234"/>
           </w:tcPr>
           <w:p>
             <w:r>
@@ -1040,17 +1220,17 @@
         </w:tc>
         <w:tc>
           <w:tcPr>
-            <w:tcW w:type="dxa" w:w="1440"/>
-          </w:tcPr>
-          <w:p>
-            <w:r>
-              <w:t>text_generation, agent_orchestration</w:t>
-            </w:r>
-          </w:p>
-        </w:tc>
-        <w:tc>
-          <w:tcPr>
-            <w:tcW w:type="dxa" w:w="1440"/>
+            <w:tcW w:type="dxa" w:w="1234"/>
+          </w:tcPr>
+          <w:p>
+            <w:r>
+              <w:t>text_generation, agent_orchest</w:t>
+            </w:r>
+          </w:p>
+        </w:tc>
+        <w:tc>
+          <w:tcPr>
+            <w:tcW w:type="dxa" w:w="1234"/>
           </w:tcPr>
           <w:p>
             <w:r>
@@ -1062,7 +1242,7 @@
       <w:tr>
         <w:tc>
           <w:tcPr>
-            <w:tcW w:type="dxa" w:w="1440"/>
+            <w:tcW w:type="dxa" w:w="1234"/>
           </w:tcPr>
           <w:p>
             <w:r>
@@ -1072,7 +1252,17 @@
         </w:tc>
         <w:tc>
           <w:tcPr>
-            <w:tcW w:type="dxa" w:w="1440"/>
+            <w:tcW w:type="dxa" w:w="1234"/>
+          </w:tcPr>
+          <w:p>
+            <w:r>
+              <w:t>B</w:t>
+            </w:r>
+          </w:p>
+        </w:tc>
+        <w:tc>
+          <w:tcPr>
+            <w:tcW w:type="dxa" w:w="1234"/>
           </w:tcPr>
           <w:p>
             <w:r>
@@ -1082,7 +1272,7 @@
         </w:tc>
         <w:tc>
           <w:tcPr>
-            <w:tcW w:type="dxa" w:w="1440"/>
+            <w:tcW w:type="dxa" w:w="1234"/>
           </w:tcPr>
           <w:p>
             <w:r>
@@ -1092,7 +1282,7 @@
         </w:tc>
         <w:tc>
           <w:tcPr>
-            <w:tcW w:type="dxa" w:w="1440"/>
+            <w:tcW w:type="dxa" w:w="1234"/>
           </w:tcPr>
           <w:p>
             <w:r>
@@ -1102,17 +1292,17 @@
         </w:tc>
         <w:tc>
           <w:tcPr>
-            <w:tcW w:type="dxa" w:w="1440"/>
-          </w:tcPr>
-          <w:p>
-            <w:r>
-              <w:t>document_forgery, image_generation</w:t>
-            </w:r>
-          </w:p>
-        </w:tc>
-        <w:tc>
-          <w:tcPr>
-            <w:tcW w:type="dxa" w:w="1440"/>
+            <w:tcW w:type="dxa" w:w="1234"/>
+          </w:tcPr>
+          <w:p>
+            <w:r>
+              <w:t>document_forgery, image_genera</w:t>
+            </w:r>
+          </w:p>
+        </w:tc>
+        <w:tc>
+          <w:tcPr>
+            <w:tcW w:type="dxa" w:w="1234"/>
           </w:tcPr>
           <w:p>
             <w:r>
@@ -1124,7 +1314,7 @@
       <w:tr>
         <w:tc>
           <w:tcPr>
-            <w:tcW w:type="dxa" w:w="1440"/>
+            <w:tcW w:type="dxa" w:w="1234"/>
           </w:tcPr>
           <w:p>
             <w:r>
@@ -1134,7 +1324,17 @@
         </w:tc>
         <w:tc>
           <w:tcPr>
-            <w:tcW w:type="dxa" w:w="1440"/>
+            <w:tcW w:type="dxa" w:w="1234"/>
+          </w:tcPr>
+          <w:p>
+            <w:r>
+              <w:t>B</w:t>
+            </w:r>
+          </w:p>
+        </w:tc>
+        <w:tc>
+          <w:tcPr>
+            <w:tcW w:type="dxa" w:w="1234"/>
           </w:tcPr>
           <w:p>
             <w:r>
@@ -1144,7 +1344,7 @@
         </w:tc>
         <w:tc>
           <w:tcPr>
-            <w:tcW w:type="dxa" w:w="1440"/>
+            <w:tcW w:type="dxa" w:w="1234"/>
           </w:tcPr>
           <w:p>
             <w:r>
@@ -1154,7 +1354,7 @@
         </w:tc>
         <w:tc>
           <w:tcPr>
-            <w:tcW w:type="dxa" w:w="1440"/>
+            <w:tcW w:type="dxa" w:w="1234"/>
           </w:tcPr>
           <w:p>
             <w:r>
@@ -1164,7 +1364,7 @@
         </w:tc>
         <w:tc>
           <w:tcPr>
-            <w:tcW w:type="dxa" w:w="1440"/>
+            <w:tcW w:type="dxa" w:w="1234"/>
           </w:tcPr>
           <w:p>
             <w:r>
@@ -1174,7 +1374,7 @@
         </w:tc>
         <w:tc>
           <w:tcPr>
-            <w:tcW w:type="dxa" w:w="1440"/>
+            <w:tcW w:type="dxa" w:w="1234"/>
           </w:tcPr>
           <w:p>
             <w:r>
@@ -1186,7 +1386,7 @@
       <w:tr>
         <w:tc>
           <w:tcPr>
-            <w:tcW w:type="dxa" w:w="1440"/>
+            <w:tcW w:type="dxa" w:w="1234"/>
           </w:tcPr>
           <w:p>
             <w:r>
@@ -1196,7 +1396,17 @@
         </w:tc>
         <w:tc>
           <w:tcPr>
-            <w:tcW w:type="dxa" w:w="1440"/>
+            <w:tcW w:type="dxa" w:w="1234"/>
+          </w:tcPr>
+          <w:p>
+            <w:r>
+              <w:t>B</w:t>
+            </w:r>
+          </w:p>
+        </w:tc>
+        <w:tc>
+          <w:tcPr>
+            <w:tcW w:type="dxa" w:w="1234"/>
           </w:tcPr>
           <w:p>
             <w:r>
@@ -1206,7 +1416,7 @@
         </w:tc>
         <w:tc>
           <w:tcPr>
-            <w:tcW w:type="dxa" w:w="1440"/>
+            <w:tcW w:type="dxa" w:w="1234"/>
           </w:tcPr>
           <w:p>
             <w:r>
@@ -1216,7 +1426,7 @@
         </w:tc>
         <w:tc>
           <w:tcPr>
-            <w:tcW w:type="dxa" w:w="1440"/>
+            <w:tcW w:type="dxa" w:w="1234"/>
           </w:tcPr>
           <w:p>
             <w:r>
@@ -1226,17 +1436,17 @@
         </w:tc>
         <w:tc>
           <w:tcPr>
-            <w:tcW w:type="dxa" w:w="1440"/>
-          </w:tcPr>
-          <w:p>
-            <w:r>
-              <w:t>agent_orchestration, text_generation</w:t>
-            </w:r>
-          </w:p>
-        </w:tc>
-        <w:tc>
-          <w:tcPr>
-            <w:tcW w:type="dxa" w:w="1440"/>
+            <w:tcW w:type="dxa" w:w="1234"/>
+          </w:tcPr>
+          <w:p>
+            <w:r>
+              <w:t>agent_orchestration, text_gene</w:t>
+            </w:r>
+          </w:p>
+        </w:tc>
+        <w:tc>
+          <w:tcPr>
+            <w:tcW w:type="dxa" w:w="1234"/>
           </w:tcPr>
           <w:p>
             <w:r>
@@ -1248,7 +1458,7 @@
       <w:tr>
         <w:tc>
           <w:tcPr>
-            <w:tcW w:type="dxa" w:w="1440"/>
+            <w:tcW w:type="dxa" w:w="1234"/>
           </w:tcPr>
           <w:p>
             <w:r>
@@ -1258,7 +1468,17 @@
         </w:tc>
         <w:tc>
           <w:tcPr>
-            <w:tcW w:type="dxa" w:w="1440"/>
+            <w:tcW w:type="dxa" w:w="1234"/>
+          </w:tcPr>
+          <w:p>
+            <w:r>
+              <w:t>B</w:t>
+            </w:r>
+          </w:p>
+        </w:tc>
+        <w:tc>
+          <w:tcPr>
+            <w:tcW w:type="dxa" w:w="1234"/>
           </w:tcPr>
           <w:p>
             <w:r>
@@ -1268,7 +1488,7 @@
         </w:tc>
         <w:tc>
           <w:tcPr>
-            <w:tcW w:type="dxa" w:w="1440"/>
+            <w:tcW w:type="dxa" w:w="1234"/>
           </w:tcPr>
           <w:p>
             <w:r>
@@ -1278,7 +1498,7 @@
         </w:tc>
         <w:tc>
           <w:tcPr>
-            <w:tcW w:type="dxa" w:w="1440"/>
+            <w:tcW w:type="dxa" w:w="1234"/>
           </w:tcPr>
           <w:p>
             <w:r>
@@ -1288,17 +1508,17 @@
         </w:tc>
         <w:tc>
           <w:tcPr>
-            <w:tcW w:type="dxa" w:w="1440"/>
-          </w:tcPr>
-          <w:p>
-            <w:r>
-              <w:t>deepfake_video, document_forgery</w:t>
-            </w:r>
-          </w:p>
-        </w:tc>
-        <w:tc>
-          <w:tcPr>
-            <w:tcW w:type="dxa" w:w="1440"/>
+            <w:tcW w:type="dxa" w:w="1234"/>
+          </w:tcPr>
+          <w:p>
+            <w:r>
+              <w:t>deepfake_video, document_forge</w:t>
+            </w:r>
+          </w:p>
+        </w:tc>
+        <w:tc>
+          <w:tcPr>
+            <w:tcW w:type="dxa" w:w="1234"/>
           </w:tcPr>
           <w:p>
             <w:r>
@@ -1310,7 +1530,7 @@
       <w:tr>
         <w:tc>
           <w:tcPr>
-            <w:tcW w:type="dxa" w:w="1440"/>
+            <w:tcW w:type="dxa" w:w="1234"/>
           </w:tcPr>
           <w:p>
             <w:r>
@@ -1320,7 +1540,17 @@
         </w:tc>
         <w:tc>
           <w:tcPr>
-            <w:tcW w:type="dxa" w:w="1440"/>
+            <w:tcW w:type="dxa" w:w="1234"/>
+          </w:tcPr>
+          <w:p>
+            <w:r>
+              <w:t>B</w:t>
+            </w:r>
+          </w:p>
+        </w:tc>
+        <w:tc>
+          <w:tcPr>
+            <w:tcW w:type="dxa" w:w="1234"/>
           </w:tcPr>
           <w:p>
             <w:r>
@@ -1330,7 +1560,7 @@
         </w:tc>
         <w:tc>
           <w:tcPr>
-            <w:tcW w:type="dxa" w:w="1440"/>
+            <w:tcW w:type="dxa" w:w="1234"/>
           </w:tcPr>
           <w:p>
             <w:r>
@@ -1340,7 +1570,7 @@
         </w:tc>
         <w:tc>
           <w:tcPr>
-            <w:tcW w:type="dxa" w:w="1440"/>
+            <w:tcW w:type="dxa" w:w="1234"/>
           </w:tcPr>
           <w:p>
             <w:r>
@@ -1350,17 +1580,17 @@
         </w:tc>
         <w:tc>
           <w:tcPr>
-            <w:tcW w:type="dxa" w:w="1440"/>
-          </w:tcPr>
-          <w:p>
-            <w:r>
-              <w:t>document_forgery, image_generation</w:t>
-            </w:r>
-          </w:p>
-        </w:tc>
-        <w:tc>
-          <w:tcPr>
-            <w:tcW w:type="dxa" w:w="1440"/>
+            <w:tcW w:type="dxa" w:w="1234"/>
+          </w:tcPr>
+          <w:p>
+            <w:r>
+              <w:t>document_forgery, image_genera</w:t>
+            </w:r>
+          </w:p>
+        </w:tc>
+        <w:tc>
+          <w:tcPr>
+            <w:tcW w:type="dxa" w:w="1234"/>
           </w:tcPr>
           <w:p>
             <w:r>
@@ -1372,7 +1602,7 @@
       <w:tr>
         <w:tc>
           <w:tcPr>
-            <w:tcW w:type="dxa" w:w="1440"/>
+            <w:tcW w:type="dxa" w:w="1234"/>
           </w:tcPr>
           <w:p>
             <w:r>
@@ -1382,7 +1612,17 @@
         </w:tc>
         <w:tc>
           <w:tcPr>
-            <w:tcW w:type="dxa" w:w="1440"/>
+            <w:tcW w:type="dxa" w:w="1234"/>
+          </w:tcPr>
+          <w:p>
+            <w:r>
+              <w:t>B</w:t>
+            </w:r>
+          </w:p>
+        </w:tc>
+        <w:tc>
+          <w:tcPr>
+            <w:tcW w:type="dxa" w:w="1234"/>
           </w:tcPr>
           <w:p>
             <w:r>
@@ -1392,7 +1632,7 @@
         </w:tc>
         <w:tc>
           <w:tcPr>
-            <w:tcW w:type="dxa" w:w="1440"/>
+            <w:tcW w:type="dxa" w:w="1234"/>
           </w:tcPr>
           <w:p>
             <w:r>
@@ -1402,7 +1642,7 @@
         </w:tc>
         <w:tc>
           <w:tcPr>
-            <w:tcW w:type="dxa" w:w="1440"/>
+            <w:tcW w:type="dxa" w:w="1234"/>
           </w:tcPr>
           <w:p>
             <w:r>
@@ -1412,7 +1652,7 @@
         </w:tc>
         <w:tc>
           <w:tcPr>
-            <w:tcW w:type="dxa" w:w="1440"/>
+            <w:tcW w:type="dxa" w:w="1234"/>
           </w:tcPr>
           <w:p>
             <w:r>
@@ -1422,7 +1662,7 @@
         </w:tc>
         <w:tc>
           <w:tcPr>
-            <w:tcW w:type="dxa" w:w="1440"/>
+            <w:tcW w:type="dxa" w:w="1234"/>
           </w:tcPr>
           <w:p>
             <w:r>
@@ -1434,7 +1674,7 @@
       <w:tr>
         <w:tc>
           <w:tcPr>
-            <w:tcW w:type="dxa" w:w="1440"/>
+            <w:tcW w:type="dxa" w:w="1234"/>
           </w:tcPr>
           <w:p>
             <w:r>
@@ -1444,7 +1684,17 @@
         </w:tc>
         <w:tc>
           <w:tcPr>
-            <w:tcW w:type="dxa" w:w="1440"/>
+            <w:tcW w:type="dxa" w:w="1234"/>
+          </w:tcPr>
+          <w:p>
+            <w:r>
+              <w:t>B</w:t>
+            </w:r>
+          </w:p>
+        </w:tc>
+        <w:tc>
+          <w:tcPr>
+            <w:tcW w:type="dxa" w:w="1234"/>
           </w:tcPr>
           <w:p>
             <w:r>
@@ -1454,7 +1704,7 @@
         </w:tc>
         <w:tc>
           <w:tcPr>
-            <w:tcW w:type="dxa" w:w="1440"/>
+            <w:tcW w:type="dxa" w:w="1234"/>
           </w:tcPr>
           <w:p>
             <w:r>
@@ -1464,7 +1714,7 @@
         </w:tc>
         <w:tc>
           <w:tcPr>
-            <w:tcW w:type="dxa" w:w="1440"/>
+            <w:tcW w:type="dxa" w:w="1234"/>
           </w:tcPr>
           <w:p>
             <w:r>
@@ -1474,7 +1724,7 @@
         </w:tc>
         <w:tc>
           <w:tcPr>
-            <w:tcW w:type="dxa" w:w="1440"/>
+            <w:tcW w:type="dxa" w:w="1234"/>
           </w:tcPr>
           <w:p>
             <w:r>
@@ -1484,7 +1734,7 @@
         </w:tc>
         <w:tc>
           <w:tcPr>
-            <w:tcW w:type="dxa" w:w="1440"/>
+            <w:tcW w:type="dxa" w:w="1234"/>
           </w:tcPr>
           <w:p>
             <w:r>
@@ -1496,7 +1746,7 @@
       <w:tr>
         <w:tc>
           <w:tcPr>
-            <w:tcW w:type="dxa" w:w="1440"/>
+            <w:tcW w:type="dxa" w:w="1234"/>
           </w:tcPr>
           <w:p>
             <w:r>
@@ -1506,7 +1756,17 @@
         </w:tc>
         <w:tc>
           <w:tcPr>
-            <w:tcW w:type="dxa" w:w="1440"/>
+            <w:tcW w:type="dxa" w:w="1234"/>
+          </w:tcPr>
+          <w:p>
+            <w:r>
+              <w:t>B</w:t>
+            </w:r>
+          </w:p>
+        </w:tc>
+        <w:tc>
+          <w:tcPr>
+            <w:tcW w:type="dxa" w:w="1234"/>
           </w:tcPr>
           <w:p>
             <w:r>
@@ -1516,7 +1776,7 @@
         </w:tc>
         <w:tc>
           <w:tcPr>
-            <w:tcW w:type="dxa" w:w="1440"/>
+            <w:tcW w:type="dxa" w:w="1234"/>
           </w:tcPr>
           <w:p>
             <w:r>
@@ -1526,7 +1786,7 @@
         </w:tc>
         <w:tc>
           <w:tcPr>
-            <w:tcW w:type="dxa" w:w="1440"/>
+            <w:tcW w:type="dxa" w:w="1234"/>
           </w:tcPr>
           <w:p>
             <w:r>
@@ -1536,7 +1796,7 @@
         </w:tc>
         <w:tc>
           <w:tcPr>
-            <w:tcW w:type="dxa" w:w="1440"/>
+            <w:tcW w:type="dxa" w:w="1234"/>
           </w:tcPr>
           <w:p>
             <w:r>
@@ -1546,7 +1806,7 @@
         </w:tc>
         <w:tc>
           <w:tcPr>
-            <w:tcW w:type="dxa" w:w="1440"/>
+            <w:tcW w:type="dxa" w:w="1234"/>
           </w:tcPr>
           <w:p>
             <w:r>
@@ -1558,7 +1818,7 @@
       <w:tr>
         <w:tc>
           <w:tcPr>
-            <w:tcW w:type="dxa" w:w="1440"/>
+            <w:tcW w:type="dxa" w:w="1234"/>
           </w:tcPr>
           <w:p>
             <w:r>
@@ -1568,7 +1828,17 @@
         </w:tc>
         <w:tc>
           <w:tcPr>
-            <w:tcW w:type="dxa" w:w="1440"/>
+            <w:tcW w:type="dxa" w:w="1234"/>
+          </w:tcPr>
+          <w:p>
+            <w:r>
+              <w:t>B</w:t>
+            </w:r>
+          </w:p>
+        </w:tc>
+        <w:tc>
+          <w:tcPr>
+            <w:tcW w:type="dxa" w:w="1234"/>
           </w:tcPr>
           <w:p>
             <w:r>
@@ -1578,7 +1848,7 @@
         </w:tc>
         <w:tc>
           <w:tcPr>
-            <w:tcW w:type="dxa" w:w="1440"/>
+            <w:tcW w:type="dxa" w:w="1234"/>
           </w:tcPr>
           <w:p>
             <w:r>
@@ -1588,7 +1858,7 @@
         </w:tc>
         <w:tc>
           <w:tcPr>
-            <w:tcW w:type="dxa" w:w="1440"/>
+            <w:tcW w:type="dxa" w:w="1234"/>
           </w:tcPr>
           <w:p>
             <w:r>
@@ -1598,17 +1868,17 @@
         </w:tc>
         <w:tc>
           <w:tcPr>
-            <w:tcW w:type="dxa" w:w="1440"/>
-          </w:tcPr>
-          <w:p>
-            <w:r>
-              <w:t>image_generation, text_generation</w:t>
-            </w:r>
-          </w:p>
-        </w:tc>
-        <w:tc>
-          <w:tcPr>
-            <w:tcW w:type="dxa" w:w="1440"/>
+            <w:tcW w:type="dxa" w:w="1234"/>
+          </w:tcPr>
+          <w:p>
+            <w:r>
+              <w:t>image_generation, text_generat</w:t>
+            </w:r>
+          </w:p>
+        </w:tc>
+        <w:tc>
+          <w:tcPr>
+            <w:tcW w:type="dxa" w:w="1234"/>
           </w:tcPr>
           <w:p>
             <w:r>
@@ -1620,7 +1890,7 @@
       <w:tr>
         <w:tc>
           <w:tcPr>
-            <w:tcW w:type="dxa" w:w="1440"/>
+            <w:tcW w:type="dxa" w:w="1234"/>
           </w:tcPr>
           <w:p>
             <w:r>
@@ -1630,7 +1900,17 @@
         </w:tc>
         <w:tc>
           <w:tcPr>
-            <w:tcW w:type="dxa" w:w="1440"/>
+            <w:tcW w:type="dxa" w:w="1234"/>
+          </w:tcPr>
+          <w:p>
+            <w:r>
+              <w:t>B</w:t>
+            </w:r>
+          </w:p>
+        </w:tc>
+        <w:tc>
+          <w:tcPr>
+            <w:tcW w:type="dxa" w:w="1234"/>
           </w:tcPr>
           <w:p>
             <w:r>
@@ -1640,7 +1920,7 @@
         </w:tc>
         <w:tc>
           <w:tcPr>
-            <w:tcW w:type="dxa" w:w="1440"/>
+            <w:tcW w:type="dxa" w:w="1234"/>
           </w:tcPr>
           <w:p>
             <w:r>
@@ -1650,7 +1930,7 @@
         </w:tc>
         <w:tc>
           <w:tcPr>
-            <w:tcW w:type="dxa" w:w="1440"/>
+            <w:tcW w:type="dxa" w:w="1234"/>
           </w:tcPr>
           <w:p>
             <w:r>
@@ -1660,17 +1940,17 @@
         </w:tc>
         <w:tc>
           <w:tcPr>
-            <w:tcW w:type="dxa" w:w="1440"/>
-          </w:tcPr>
-          <w:p>
-            <w:r>
-              <w:t>agent_orchestration, text_generation</w:t>
-            </w:r>
-          </w:p>
-        </w:tc>
-        <w:tc>
-          <w:tcPr>
-            <w:tcW w:type="dxa" w:w="1440"/>
+            <w:tcW w:type="dxa" w:w="1234"/>
+          </w:tcPr>
+          <w:p>
+            <w:r>
+              <w:t>agent_orchestration, text_gene</w:t>
+            </w:r>
+          </w:p>
+        </w:tc>
+        <w:tc>
+          <w:tcPr>
+            <w:tcW w:type="dxa" w:w="1234"/>
           </w:tcPr>
           <w:p>
             <w:r>
@@ -1682,7 +1962,7 @@
       <w:tr>
         <w:tc>
           <w:tcPr>
-            <w:tcW w:type="dxa" w:w="1440"/>
+            <w:tcW w:type="dxa" w:w="1234"/>
           </w:tcPr>
           <w:p>
             <w:r>
@@ -1692,7 +1972,17 @@
         </w:tc>
         <w:tc>
           <w:tcPr>
-            <w:tcW w:type="dxa" w:w="1440"/>
+            <w:tcW w:type="dxa" w:w="1234"/>
+          </w:tcPr>
+          <w:p>
+            <w:r>
+              <w:t>B</w:t>
+            </w:r>
+          </w:p>
+        </w:tc>
+        <w:tc>
+          <w:tcPr>
+            <w:tcW w:type="dxa" w:w="1234"/>
           </w:tcPr>
           <w:p>
             <w:r>
@@ -1702,7 +1992,7 @@
         </w:tc>
         <w:tc>
           <w:tcPr>
-            <w:tcW w:type="dxa" w:w="1440"/>
+            <w:tcW w:type="dxa" w:w="1234"/>
           </w:tcPr>
           <w:p>
             <w:r>
@@ -1712,7 +2002,7 @@
         </w:tc>
         <w:tc>
           <w:tcPr>
-            <w:tcW w:type="dxa" w:w="1440"/>
+            <w:tcW w:type="dxa" w:w="1234"/>
           </w:tcPr>
           <w:p>
             <w:r>
@@ -1722,7 +2012,7 @@
         </w:tc>
         <w:tc>
           <w:tcPr>
-            <w:tcW w:type="dxa" w:w="1440"/>
+            <w:tcW w:type="dxa" w:w="1234"/>
           </w:tcPr>
           <w:p>
             <w:r>
@@ -1732,7 +2022,7 @@
         </w:tc>
         <w:tc>
           <w:tcPr>
-            <w:tcW w:type="dxa" w:w="1440"/>
+            <w:tcW w:type="dxa" w:w="1234"/>
           </w:tcPr>
           <w:p>
             <w:r>
@@ -1744,7 +2034,7 @@
       <w:tr>
         <w:tc>
           <w:tcPr>
-            <w:tcW w:type="dxa" w:w="1440"/>
+            <w:tcW w:type="dxa" w:w="1234"/>
           </w:tcPr>
           <w:p>
             <w:r>
@@ -1754,7 +2044,17 @@
         </w:tc>
         <w:tc>
           <w:tcPr>
-            <w:tcW w:type="dxa" w:w="1440"/>
+            <w:tcW w:type="dxa" w:w="1234"/>
+          </w:tcPr>
+          <w:p>
+            <w:r>
+              <w:t>B</w:t>
+            </w:r>
+          </w:p>
+        </w:tc>
+        <w:tc>
+          <w:tcPr>
+            <w:tcW w:type="dxa" w:w="1234"/>
           </w:tcPr>
           <w:p>
             <w:r>
@@ -1764,7 +2064,7 @@
         </w:tc>
         <w:tc>
           <w:tcPr>
-            <w:tcW w:type="dxa" w:w="1440"/>
+            <w:tcW w:type="dxa" w:w="1234"/>
           </w:tcPr>
           <w:p>
             <w:r>
@@ -1774,7 +2074,7 @@
         </w:tc>
         <w:tc>
           <w:tcPr>
-            <w:tcW w:type="dxa" w:w="1440"/>
+            <w:tcW w:type="dxa" w:w="1234"/>
           </w:tcPr>
           <w:p>
             <w:r>
@@ -1784,17 +2084,17 @@
         </w:tc>
         <w:tc>
           <w:tcPr>
-            <w:tcW w:type="dxa" w:w="1440"/>
-          </w:tcPr>
-          <w:p>
-            <w:r>
-              <w:t>text_generation, document_forgery</w:t>
-            </w:r>
-          </w:p>
-        </w:tc>
-        <w:tc>
-          <w:tcPr>
-            <w:tcW w:type="dxa" w:w="1440"/>
+            <w:tcW w:type="dxa" w:w="1234"/>
+          </w:tcPr>
+          <w:p>
+            <w:r>
+              <w:t>text_generation, document_forg</w:t>
+            </w:r>
+          </w:p>
+        </w:tc>
+        <w:tc>
+          <w:tcPr>
+            <w:tcW w:type="dxa" w:w="1234"/>
           </w:tcPr>
           <w:p>
             <w:r>
@@ -1806,7 +2106,7 @@
       <w:tr>
         <w:tc>
           <w:tcPr>
-            <w:tcW w:type="dxa" w:w="1440"/>
+            <w:tcW w:type="dxa" w:w="1234"/>
           </w:tcPr>
           <w:p>
             <w:r>
@@ -1816,7 +2116,17 @@
         </w:tc>
         <w:tc>
           <w:tcPr>
-            <w:tcW w:type="dxa" w:w="1440"/>
+            <w:tcW w:type="dxa" w:w="1234"/>
+          </w:tcPr>
+          <w:p>
+            <w:r>
+              <w:t>B</w:t>
+            </w:r>
+          </w:p>
+        </w:tc>
+        <w:tc>
+          <w:tcPr>
+            <w:tcW w:type="dxa" w:w="1234"/>
           </w:tcPr>
           <w:p>
             <w:r>
@@ -1826,7 +2136,7 @@
         </w:tc>
         <w:tc>
           <w:tcPr>
-            <w:tcW w:type="dxa" w:w="1440"/>
+            <w:tcW w:type="dxa" w:w="1234"/>
           </w:tcPr>
           <w:p>
             <w:r>
@@ -1836,7 +2146,7 @@
         </w:tc>
         <w:tc>
           <w:tcPr>
-            <w:tcW w:type="dxa" w:w="1440"/>
+            <w:tcW w:type="dxa" w:w="1234"/>
           </w:tcPr>
           <w:p>
             <w:r>
@@ -1846,7 +2156,7 @@
         </w:tc>
         <w:tc>
           <w:tcPr>
-            <w:tcW w:type="dxa" w:w="1440"/>
+            <w:tcW w:type="dxa" w:w="1234"/>
           </w:tcPr>
           <w:p>
             <w:r>
@@ -1856,7 +2166,7 @@
         </w:tc>
         <w:tc>
           <w:tcPr>
-            <w:tcW w:type="dxa" w:w="1440"/>
+            <w:tcW w:type="dxa" w:w="1234"/>
           </w:tcPr>
           <w:p>
             <w:r>
@@ -1868,7 +2178,7 @@
       <w:tr>
         <w:tc>
           <w:tcPr>
-            <w:tcW w:type="dxa" w:w="1440"/>
+            <w:tcW w:type="dxa" w:w="1234"/>
           </w:tcPr>
           <w:p>
             <w:r>
@@ -1878,7 +2188,17 @@
         </w:tc>
         <w:tc>
           <w:tcPr>
-            <w:tcW w:type="dxa" w:w="1440"/>
+            <w:tcW w:type="dxa" w:w="1234"/>
+          </w:tcPr>
+          <w:p>
+            <w:r>
+              <w:t>B</w:t>
+            </w:r>
+          </w:p>
+        </w:tc>
+        <w:tc>
+          <w:tcPr>
+            <w:tcW w:type="dxa" w:w="1234"/>
           </w:tcPr>
           <w:p>
             <w:r>
@@ -1888,7 +2208,7 @@
         </w:tc>
         <w:tc>
           <w:tcPr>
-            <w:tcW w:type="dxa" w:w="1440"/>
+            <w:tcW w:type="dxa" w:w="1234"/>
           </w:tcPr>
           <w:p>
             <w:r>
@@ -1898,7 +2218,7 @@
         </w:tc>
         <w:tc>
           <w:tcPr>
-            <w:tcW w:type="dxa" w:w="1440"/>
+            <w:tcW w:type="dxa" w:w="1234"/>
           </w:tcPr>
           <w:p>
             <w:r>
@@ -1908,17 +2228,17 @@
         </w:tc>
         <w:tc>
           <w:tcPr>
-            <w:tcW w:type="dxa" w:w="1440"/>
-          </w:tcPr>
-          <w:p>
-            <w:r>
-              <w:t>agent_orchestration, image_generation</w:t>
-            </w:r>
-          </w:p>
-        </w:tc>
-        <w:tc>
-          <w:tcPr>
-            <w:tcW w:type="dxa" w:w="1440"/>
+            <w:tcW w:type="dxa" w:w="1234"/>
+          </w:tcPr>
+          <w:p>
+            <w:r>
+              <w:t>agent_orchestration, image_gen</w:t>
+            </w:r>
+          </w:p>
+        </w:tc>
+        <w:tc>
+          <w:tcPr>
+            <w:tcW w:type="dxa" w:w="1234"/>
           </w:tcPr>
           <w:p>
             <w:r>
@@ -1930,7 +2250,7 @@
       <w:tr>
         <w:tc>
           <w:tcPr>
-            <w:tcW w:type="dxa" w:w="1440"/>
+            <w:tcW w:type="dxa" w:w="1234"/>
           </w:tcPr>
           <w:p>
             <w:r>
@@ -1940,7 +2260,17 @@
         </w:tc>
         <w:tc>
           <w:tcPr>
-            <w:tcW w:type="dxa" w:w="1440"/>
+            <w:tcW w:type="dxa" w:w="1234"/>
+          </w:tcPr>
+          <w:p>
+            <w:r>
+              <w:t>B</w:t>
+            </w:r>
+          </w:p>
+        </w:tc>
+        <w:tc>
+          <w:tcPr>
+            <w:tcW w:type="dxa" w:w="1234"/>
           </w:tcPr>
           <w:p>
             <w:r>
@@ -1950,7 +2280,7 @@
         </w:tc>
         <w:tc>
           <w:tcPr>
-            <w:tcW w:type="dxa" w:w="1440"/>
+            <w:tcW w:type="dxa" w:w="1234"/>
           </w:tcPr>
           <w:p>
             <w:r>
@@ -1960,7 +2290,7 @@
         </w:tc>
         <w:tc>
           <w:tcPr>
-            <w:tcW w:type="dxa" w:w="1440"/>
+            <w:tcW w:type="dxa" w:w="1234"/>
           </w:tcPr>
           <w:p>
             <w:r>
@@ -1970,17 +2300,17 @@
         </w:tc>
         <w:tc>
           <w:tcPr>
-            <w:tcW w:type="dxa" w:w="1440"/>
-          </w:tcPr>
-          <w:p>
-            <w:r>
-              <w:t>deepfake_video, voice_clone, text_generation</w:t>
-            </w:r>
-          </w:p>
-        </w:tc>
-        <w:tc>
-          <w:tcPr>
-            <w:tcW w:type="dxa" w:w="1440"/>
+            <w:tcW w:type="dxa" w:w="1234"/>
+          </w:tcPr>
+          <w:p>
+            <w:r>
+              <w:t>deepfake_video, voice_clone, t</w:t>
+            </w:r>
+          </w:p>
+        </w:tc>
+        <w:tc>
+          <w:tcPr>
+            <w:tcW w:type="dxa" w:w="1234"/>
           </w:tcPr>
           <w:p>
             <w:r>
@@ -1992,7 +2322,7 @@
       <w:tr>
         <w:tc>
           <w:tcPr>
-            <w:tcW w:type="dxa" w:w="1440"/>
+            <w:tcW w:type="dxa" w:w="1234"/>
           </w:tcPr>
           <w:p>
             <w:r>
@@ -2002,7 +2332,17 @@
         </w:tc>
         <w:tc>
           <w:tcPr>
-            <w:tcW w:type="dxa" w:w="1440"/>
+            <w:tcW w:type="dxa" w:w="1234"/>
+          </w:tcPr>
+          <w:p>
+            <w:r>
+              <w:t>B</w:t>
+            </w:r>
+          </w:p>
+        </w:tc>
+        <w:tc>
+          <w:tcPr>
+            <w:tcW w:type="dxa" w:w="1234"/>
           </w:tcPr>
           <w:p>
             <w:r>
@@ -2012,7 +2352,7 @@
         </w:tc>
         <w:tc>
           <w:tcPr>
-            <w:tcW w:type="dxa" w:w="1440"/>
+            <w:tcW w:type="dxa" w:w="1234"/>
           </w:tcPr>
           <w:p>
             <w:r>
@@ -2022,7 +2362,7 @@
         </w:tc>
         <w:tc>
           <w:tcPr>
-            <w:tcW w:type="dxa" w:w="1440"/>
+            <w:tcW w:type="dxa" w:w="1234"/>
           </w:tcPr>
           <w:p>
             <w:r>
@@ -2032,7 +2372,7 @@
         </w:tc>
         <w:tc>
           <w:tcPr>
-            <w:tcW w:type="dxa" w:w="1440"/>
+            <w:tcW w:type="dxa" w:w="1234"/>
           </w:tcPr>
           <w:p>
             <w:r>
@@ -2042,7 +2382,7 @@
         </w:tc>
         <w:tc>
           <w:tcPr>
-            <w:tcW w:type="dxa" w:w="1440"/>
+            <w:tcW w:type="dxa" w:w="1234"/>
           </w:tcPr>
           <w:p>
             <w:r>
@@ -2054,7 +2394,7 @@
       <w:tr>
         <w:tc>
           <w:tcPr>
-            <w:tcW w:type="dxa" w:w="1440"/>
+            <w:tcW w:type="dxa" w:w="1234"/>
           </w:tcPr>
           <w:p>
             <w:r>
@@ -2064,7 +2404,17 @@
         </w:tc>
         <w:tc>
           <w:tcPr>
-            <w:tcW w:type="dxa" w:w="1440"/>
+            <w:tcW w:type="dxa" w:w="1234"/>
+          </w:tcPr>
+          <w:p>
+            <w:r>
+              <w:t>B</w:t>
+            </w:r>
+          </w:p>
+        </w:tc>
+        <w:tc>
+          <w:tcPr>
+            <w:tcW w:type="dxa" w:w="1234"/>
           </w:tcPr>
           <w:p>
             <w:r>
@@ -2074,7 +2424,7 @@
         </w:tc>
         <w:tc>
           <w:tcPr>
-            <w:tcW w:type="dxa" w:w="1440"/>
+            <w:tcW w:type="dxa" w:w="1234"/>
           </w:tcPr>
           <w:p>
             <w:r>
@@ -2084,7 +2434,7 @@
         </w:tc>
         <w:tc>
           <w:tcPr>
-            <w:tcW w:type="dxa" w:w="1440"/>
+            <w:tcW w:type="dxa" w:w="1234"/>
           </w:tcPr>
           <w:p>
             <w:r>
@@ -2094,17 +2444,17 @@
         </w:tc>
         <w:tc>
           <w:tcPr>
-            <w:tcW w:type="dxa" w:w="1440"/>
-          </w:tcPr>
-          <w:p>
-            <w:r>
-              <w:t>document_forgery, text_generation</w:t>
-            </w:r>
-          </w:p>
-        </w:tc>
-        <w:tc>
-          <w:tcPr>
-            <w:tcW w:type="dxa" w:w="1440"/>
+            <w:tcW w:type="dxa" w:w="1234"/>
+          </w:tcPr>
+          <w:p>
+            <w:r>
+              <w:t>document_forgery, text_generat</w:t>
+            </w:r>
+          </w:p>
+        </w:tc>
+        <w:tc>
+          <w:tcPr>
+            <w:tcW w:type="dxa" w:w="1234"/>
           </w:tcPr>
           <w:p>
             <w:r>
@@ -2116,7 +2466,7 @@
       <w:tr>
         <w:tc>
           <w:tcPr>
-            <w:tcW w:type="dxa" w:w="1440"/>
+            <w:tcW w:type="dxa" w:w="1234"/>
           </w:tcPr>
           <w:p>
             <w:r>
@@ -2126,7 +2476,17 @@
         </w:tc>
         <w:tc>
           <w:tcPr>
-            <w:tcW w:type="dxa" w:w="1440"/>
+            <w:tcW w:type="dxa" w:w="1234"/>
+          </w:tcPr>
+          <w:p>
+            <w:r>
+              <w:t>B</w:t>
+            </w:r>
+          </w:p>
+        </w:tc>
+        <w:tc>
+          <w:tcPr>
+            <w:tcW w:type="dxa" w:w="1234"/>
           </w:tcPr>
           <w:p>
             <w:r>
@@ -2136,7 +2496,7 @@
         </w:tc>
         <w:tc>
           <w:tcPr>
-            <w:tcW w:type="dxa" w:w="1440"/>
+            <w:tcW w:type="dxa" w:w="1234"/>
           </w:tcPr>
           <w:p>
             <w:r>
@@ -2146,7 +2506,7 @@
         </w:tc>
         <w:tc>
           <w:tcPr>
-            <w:tcW w:type="dxa" w:w="1440"/>
+            <w:tcW w:type="dxa" w:w="1234"/>
           </w:tcPr>
           <w:p>
             <w:r>
@@ -2156,7 +2516,7 @@
         </w:tc>
         <w:tc>
           <w:tcPr>
-            <w:tcW w:type="dxa" w:w="1440"/>
+            <w:tcW w:type="dxa" w:w="1234"/>
           </w:tcPr>
           <w:p>
             <w:r>
@@ -2166,7 +2526,7 @@
         </w:tc>
         <w:tc>
           <w:tcPr>
-            <w:tcW w:type="dxa" w:w="1440"/>
+            <w:tcW w:type="dxa" w:w="1234"/>
           </w:tcPr>
           <w:p>
             <w:r>
@@ -2178,7 +2538,7 @@
       <w:tr>
         <w:tc>
           <w:tcPr>
-            <w:tcW w:type="dxa" w:w="1440"/>
+            <w:tcW w:type="dxa" w:w="1234"/>
           </w:tcPr>
           <w:p>
             <w:r>
@@ -2188,7 +2548,17 @@
         </w:tc>
         <w:tc>
           <w:tcPr>
-            <w:tcW w:type="dxa" w:w="1440"/>
+            <w:tcW w:type="dxa" w:w="1234"/>
+          </w:tcPr>
+          <w:p>
+            <w:r>
+              <w:t>B</w:t>
+            </w:r>
+          </w:p>
+        </w:tc>
+        <w:tc>
+          <w:tcPr>
+            <w:tcW w:type="dxa" w:w="1234"/>
           </w:tcPr>
           <w:p>
             <w:r>
@@ -2198,7 +2568,7 @@
         </w:tc>
         <w:tc>
           <w:tcPr>
-            <w:tcW w:type="dxa" w:w="1440"/>
+            <w:tcW w:type="dxa" w:w="1234"/>
           </w:tcPr>
           <w:p>
             <w:r>
@@ -2208,7 +2578,7 @@
         </w:tc>
         <w:tc>
           <w:tcPr>
-            <w:tcW w:type="dxa" w:w="1440"/>
+            <w:tcW w:type="dxa" w:w="1234"/>
           </w:tcPr>
           <w:p>
             <w:r>
@@ -2218,17 +2588,17 @@
         </w:tc>
         <w:tc>
           <w:tcPr>
-            <w:tcW w:type="dxa" w:w="1440"/>
-          </w:tcPr>
-          <w:p>
-            <w:r>
-              <w:t>text_generation, document_forgery</w:t>
-            </w:r>
-          </w:p>
-        </w:tc>
-        <w:tc>
-          <w:tcPr>
-            <w:tcW w:type="dxa" w:w="1440"/>
+            <w:tcW w:type="dxa" w:w="1234"/>
+          </w:tcPr>
+          <w:p>
+            <w:r>
+              <w:t>text_generation, document_forg</w:t>
+            </w:r>
+          </w:p>
+        </w:tc>
+        <w:tc>
+          <w:tcPr>
+            <w:tcW w:type="dxa" w:w="1234"/>
           </w:tcPr>
           <w:p>
             <w:r>
@@ -2240,7 +2610,7 @@
       <w:tr>
         <w:tc>
           <w:tcPr>
-            <w:tcW w:type="dxa" w:w="1440"/>
+            <w:tcW w:type="dxa" w:w="1234"/>
           </w:tcPr>
           <w:p>
             <w:r>
@@ -2250,7 +2620,17 @@
         </w:tc>
         <w:tc>
           <w:tcPr>
-            <w:tcW w:type="dxa" w:w="1440"/>
+            <w:tcW w:type="dxa" w:w="1234"/>
+          </w:tcPr>
+          <w:p>
+            <w:r>
+              <w:t>B</w:t>
+            </w:r>
+          </w:p>
+        </w:tc>
+        <w:tc>
+          <w:tcPr>
+            <w:tcW w:type="dxa" w:w="1234"/>
           </w:tcPr>
           <w:p>
             <w:r>
@@ -2260,7 +2640,7 @@
         </w:tc>
         <w:tc>
           <w:tcPr>
-            <w:tcW w:type="dxa" w:w="1440"/>
+            <w:tcW w:type="dxa" w:w="1234"/>
           </w:tcPr>
           <w:p>
             <w:r>
@@ -2270,7 +2650,7 @@
         </w:tc>
         <w:tc>
           <w:tcPr>
-            <w:tcW w:type="dxa" w:w="1440"/>
+            <w:tcW w:type="dxa" w:w="1234"/>
           </w:tcPr>
           <w:p>
             <w:r>
@@ -2280,21 +2660,237 @@
         </w:tc>
         <w:tc>
           <w:tcPr>
-            <w:tcW w:type="dxa" w:w="1440"/>
-          </w:tcPr>
-          <w:p>
-            <w:r>
-              <w:t>image_generation, deepfake_video, text_generation</w:t>
-            </w:r>
-          </w:p>
-        </w:tc>
-        <w:tc>
-          <w:tcPr>
-            <w:tcW w:type="dxa" w:w="1440"/>
+            <w:tcW w:type="dxa" w:w="1234"/>
+          </w:tcPr>
+          <w:p>
+            <w:r>
+              <w:t>image_generation, deepfake_vid</w:t>
+            </w:r>
+          </w:p>
+        </w:tc>
+        <w:tc>
+          <w:tcPr>
+            <w:tcW w:type="dxa" w:w="1234"/>
           </w:tcPr>
           <w:p>
             <w:r>
               <w:t>investment_pump</w:t>
+            </w:r>
+          </w:p>
+        </w:tc>
+      </w:tr>
+      <w:tr>
+        <w:tc>
+          <w:tcPr>
+            <w:tcW w:type="dxa" w:w="1234"/>
+          </w:tcPr>
+          <w:p>
+            <w:r>
+              <w:t>GEN-036</w:t>
+            </w:r>
+          </w:p>
+        </w:tc>
+        <w:tc>
+          <w:tcPr>
+            <w:tcW w:type="dxa" w:w="1234"/>
+          </w:tcPr>
+          <w:p>
+            <w:r>
+              <w:t>A</w:t>
+            </w:r>
+          </w:p>
+        </w:tc>
+        <w:tc>
+          <w:tcPr>
+            <w:tcW w:type="dxa" w:w="1234"/>
+          </w:tcPr>
+          <w:p>
+            <w:r>
+              <w:t>NPCI support chatbot collect-request phi</w:t>
+            </w:r>
+          </w:p>
+        </w:tc>
+        <w:tc>
+          <w:tcPr>
+            <w:tcW w:type="dxa" w:w="1234"/>
+          </w:tcPr>
+          <w:p>
+            <w:r>
+              <w:t>upi</w:t>
+            </w:r>
+          </w:p>
+        </w:tc>
+        <w:tc>
+          <w:tcPr>
+            <w:tcW w:type="dxa" w:w="1234"/>
+          </w:tcPr>
+          <w:p>
+            <w:r>
+              <w:t>customer_support</w:t>
+            </w:r>
+          </w:p>
+        </w:tc>
+        <w:tc>
+          <w:tcPr>
+            <w:tcW w:type="dxa" w:w="1234"/>
+          </w:tcPr>
+          <w:p>
+            <w:r>
+              <w:t>text_generation, agent_orchest</w:t>
+            </w:r>
+          </w:p>
+        </w:tc>
+        <w:tc>
+          <w:tcPr>
+            <w:tcW w:type="dxa" w:w="1234"/>
+          </w:tcPr>
+          <w:p>
+            <w:r>
+              <w:t>npci_chatbot_phish</w:t>
+            </w:r>
+          </w:p>
+        </w:tc>
+      </w:tr>
+      <w:tr>
+        <w:tc>
+          <w:tcPr>
+            <w:tcW w:type="dxa" w:w="1234"/>
+          </w:tcPr>
+          <w:p>
+            <w:r>
+              <w:t>GEN-037</w:t>
+            </w:r>
+          </w:p>
+        </w:tc>
+        <w:tc>
+          <w:tcPr>
+            <w:tcW w:type="dxa" w:w="1234"/>
+          </w:tcPr>
+          <w:p>
+            <w:r>
+              <w:t>A</w:t>
+            </w:r>
+          </w:p>
+        </w:tc>
+        <w:tc>
+          <w:tcPr>
+            <w:tcW w:type="dxa" w:w="1234"/>
+          </w:tcPr>
+          <w:p>
+            <w:r>
+              <w:t>OTT subscription mandate micro-debit tra</w:t>
+            </w:r>
+          </w:p>
+        </w:tc>
+        <w:tc>
+          <w:tcPr>
+            <w:tcW w:type="dxa" w:w="1234"/>
+          </w:tcPr>
+          <w:p>
+            <w:r>
+              <w:t>upi</w:t>
+            </w:r>
+          </w:p>
+        </w:tc>
+        <w:tc>
+          <w:tcPr>
+            <w:tcW w:type="dxa" w:w="1234"/>
+          </w:tcPr>
+          <w:p>
+            <w:r>
+              <w:t>infrastructure</w:t>
+            </w:r>
+          </w:p>
+        </w:tc>
+        <w:tc>
+          <w:tcPr>
+            <w:tcW w:type="dxa" w:w="1234"/>
+          </w:tcPr>
+          <w:p>
+            <w:r>
+              <w:t>text_generation</w:t>
+            </w:r>
+          </w:p>
+        </w:tc>
+        <w:tc>
+          <w:tcPr>
+            <w:tcW w:type="dxa" w:w="1234"/>
+          </w:tcPr>
+          <w:p>
+            <w:r>
+              <w:t>subscription_mandate_trap</w:t>
+            </w:r>
+          </w:p>
+        </w:tc>
+      </w:tr>
+      <w:tr>
+        <w:tc>
+          <w:tcPr>
+            <w:tcW w:type="dxa" w:w="1234"/>
+          </w:tcPr>
+          <w:p>
+            <w:r>
+              <w:t>GEN-038</w:t>
+            </w:r>
+          </w:p>
+        </w:tc>
+        <w:tc>
+          <w:tcPr>
+            <w:tcW w:type="dxa" w:w="1234"/>
+          </w:tcPr>
+          <w:p>
+            <w:r>
+              <w:t>A</w:t>
+            </w:r>
+          </w:p>
+        </w:tc>
+        <w:tc>
+          <w:tcPr>
+            <w:tcW w:type="dxa" w:w="1234"/>
+          </w:tcPr>
+          <w:p>
+            <w:r>
+              <w:t>Coordinated mule graph fan-in ring</w:t>
+            </w:r>
+          </w:p>
+        </w:tc>
+        <w:tc>
+          <w:tcPr>
+            <w:tcW w:type="dxa" w:w="1234"/>
+          </w:tcPr>
+          <w:p>
+            <w:r>
+              <w:t>upi, wallet</w:t>
+            </w:r>
+          </w:p>
+        </w:tc>
+        <w:tc>
+          <w:tcPr>
+            <w:tcW w:type="dxa" w:w="1234"/>
+          </w:tcPr>
+          <w:p>
+            <w:r>
+              <w:t>infrastructure</w:t>
+            </w:r>
+          </w:p>
+        </w:tc>
+        <w:tc>
+          <w:tcPr>
+            <w:tcW w:type="dxa" w:w="1234"/>
+          </w:tcPr>
+          <w:p>
+            <w:r>
+              <w:t>agent_orchestration</w:t>
+            </w:r>
+          </w:p>
+        </w:tc>
+        <w:tc>
+          <w:tcPr>
+            <w:tcW w:type="dxa" w:w="1234"/>
+          </w:tcPr>
+          <w:p>
+            <w:r>
+              <w:t>mule_graph_ring</w:t>
             </w:r>
           </w:p>
         </w:tc>
@@ -2305,12 +2901,12 @@
         <w:pStyle w:val="Heading1"/>
       </w:pPr>
       <w:r>
-        <w:t>3. Real-Data Grounding</w:t>
+        <w:t>4. Real-Data Grounding</w:t>
       </w:r>
     </w:p>
     <w:p>
       <w:r>
-        <w:t>The digital twin's statistical skeleton is fitted from IEEE-CIS/Vesta transaction data (Kaggle). We fit log-normal amount parameters, hour-of-day distributions, and per-product ticket sizes into calibration.json. The Fidelity Judge scores simulated attacks against REAL marginals via Kolmogorov-Smirnov distance — not against the twin's own output — eliminating circular scoring.</w:t>
+        <w:t>Fitted from IEEE-CIS train_transaction.csv: 590,540 rows, median ticket $78.5601 USD, consumer target 6520.49 INR. Fidelity Judge scores KS distance vs real amount/hour marginals.</w:t>
       </w:r>
     </w:p>
     <w:p>
@@ -2318,17 +2914,22 @@
         <w:pStyle w:val="Heading1"/>
       </w:pPr>
       <w:r>
-        <w:t>4. Attack Generation — Fidelity at Scale</w:t>
+        <w:t>5. Kill-Chain Walkthrough — GEN-002 Digital Arrest</w:t>
       </w:r>
     </w:p>
     <w:p>
       <w:r>
-        <w:t>Example kill-chain (GEN-002 Digital Arrest): deepfake video-call artifact → coerced 'verification' UPI transfers in escalating stages → layering through mule VPAs → Fidelity Judge scores amount/hour KS similarity vs anchor.</w:t>
-      </w:r>
-    </w:p>
-    <w:p>
-      <w:r>
-        <w:t>10 executable playbooks cover voice-clone UPI, digital arrest, CFO BEC wire, personalized smishing, QR collect-request swap, investment pump, synthetic KYC, behavioral mimicry, agent prompt injection, and mule recruitment — with parameter variants spanning 35 genome definitions.</w:t>
+        <w:t>1. Forge generates deepfake video-call transcript artifact.</w:t>
+        <w:br/>
+        <w:t>2. Victim coerced into escalating UPI 'verification' transfers.</w:t>
+        <w:br/>
+        <w:t>3. Funds layer through mule VPAs (dst_fan_in signal).</w:t>
+        <w:br/>
+        <w:t>4. Sentinel flags via velocity + text fusion; SHAP-lite shows vel_1h, amt_z_user.</w:t>
+        <w:br/>
+        <w:t>5. Critic mutates: spread transfers over 6h to evade velocity windows.</w:t>
+        <w:br/>
+        <w:t>6. Evasion-pressure generations (frozen defender) show frozen AUC dip; retrain recovers.</w:t>
       </w:r>
     </w:p>
     <w:p>
@@ -2336,20 +2937,7 @@
         <w:pStyle w:val="Heading1"/>
       </w:pPr>
       <w:r>
-        <w:t>5. Detection and Mitigation — Sentinel</w:t>
-      </w:r>
-    </w:p>
-    <w:p>
-      <w:r>
-        <w:t>Sentinel fuses HistGradientBoosting (18 engineered features: velocity windows, expanding z-score, destination fan-in/forwarding, device novelty, temporal encoding) with a TF-IDF text head over scam artifacts. Threshold policy maximizes F1 subject to FPR ≤ 0.5% on legitimate traffic. SHAP-lite explanations surface top contributing features for analyst triage.</w:t>
-      </w:r>
-    </w:p>
-    <w:p>
-      <w:pPr>
-        <w:pStyle w:val="Heading2"/>
-      </w:pPr>
-      <w:r>
-        <w:t>5.1 Multi-Seed Efficacy Results</w:t>
+        <w:t>6. Detection Efficacy</w:t>
       </w:r>
     </w:p>
     <w:tbl>
@@ -2359,19 +2947,18 @@
         <w:tblLook w:firstColumn="1" w:firstRow="1" w:lastColumn="0" w:lastRow="0" w:noHBand="0" w:noVBand="1" w:val="04A0"/>
       </w:tblPr>
       <w:tblGrid>
-        <w:gridCol w:w="1080"/>
-        <w:gridCol w:w="1080"/>
-        <w:gridCol w:w="1080"/>
-        <w:gridCol w:w="1080"/>
-        <w:gridCol w:w="1080"/>
-        <w:gridCol w:w="1080"/>
-        <w:gridCol w:w="1080"/>
-        <w:gridCol w:w="1080"/>
+        <w:gridCol w:w="1234"/>
+        <w:gridCol w:w="1234"/>
+        <w:gridCol w:w="1234"/>
+        <w:gridCol w:w="1234"/>
+        <w:gridCol w:w="1234"/>
+        <w:gridCol w:w="1234"/>
+        <w:gridCol w:w="1234"/>
       </w:tblGrid>
       <w:tr>
         <w:tc>
           <w:tcPr>
-            <w:tcW w:type="dxa" w:w="1080"/>
+            <w:tcW w:type="dxa" w:w="1234"/>
           </w:tcPr>
           <w:p>
             <w:r>
@@ -2381,7 +2968,7 @@
         </w:tc>
         <w:tc>
           <w:tcPr>
-            <w:tcW w:type="dxa" w:w="1080"/>
+            <w:tcW w:type="dxa" w:w="1234"/>
           </w:tcPr>
           <w:p>
             <w:r>
@@ -2391,7 +2978,7 @@
         </w:tc>
         <w:tc>
           <w:tcPr>
-            <w:tcW w:type="dxa" w:w="1080"/>
+            <w:tcW w:type="dxa" w:w="1234"/>
           </w:tcPr>
           <w:p>
             <w:r>
@@ -2401,7 +2988,17 @@
         </w:tc>
         <w:tc>
           <w:tcPr>
-            <w:tcW w:type="dxa" w:w="1080"/>
+            <w:tcW w:type="dxa" w:w="1234"/>
+          </w:tcPr>
+          <w:p>
+            <w:r>
+              <w:t>Rules Rec</w:t>
+            </w:r>
+          </w:p>
+        </w:tc>
+        <w:tc>
+          <w:tcPr>
+            <w:tcW w:type="dxa" w:w="1234"/>
           </w:tcPr>
           <w:p>
             <w:r>
@@ -2411,17 +3008,7 @@
         </w:tc>
         <w:tc>
           <w:tcPr>
-            <w:tcW w:type="dxa" w:w="1080"/>
-          </w:tcPr>
-          <w:p>
-            <w:r>
-              <w:t>Precision</w:t>
-            </w:r>
-          </w:p>
-        </w:tc>
-        <w:tc>
-          <w:tcPr>
-            <w:tcW w:type="dxa" w:w="1080"/>
+            <w:tcW w:type="dxa" w:w="1234"/>
           </w:tcPr>
           <w:p>
             <w:r>
@@ -2431,21 +3018,11 @@
         </w:tc>
         <w:tc>
           <w:tcPr>
-            <w:tcW w:type="dxa" w:w="1080"/>
+            <w:tcW w:type="dxa" w:w="1234"/>
           </w:tcPr>
           <w:p>
             <w:r>
               <w:t>TtE</w:t>
-            </w:r>
-          </w:p>
-        </w:tc>
-        <w:tc>
-          <w:tcPr>
-            <w:tcW w:type="dxa" w:w="1080"/>
-          </w:tcPr>
-          <w:p>
-            <w:r>
-              <w:t>Frozen AUC</w:t>
             </w:r>
           </w:p>
         </w:tc>
@@ -2453,7 +3030,7 @@
       <w:tr>
         <w:tc>
           <w:tcPr>
-            <w:tcW w:type="dxa" w:w="1080"/>
+            <w:tcW w:type="dxa" w:w="1234"/>
           </w:tcPr>
           <w:p>
             <w:r>
@@ -2463,71 +3040,61 @@
         </w:tc>
         <w:tc>
           <w:tcPr>
-            <w:tcW w:type="dxa" w:w="1080"/>
-          </w:tcPr>
-          <w:p>
-            <w:r>
-              <w:t>0.9975</w:t>
-            </w:r>
-          </w:p>
-        </w:tc>
-        <w:tc>
-          <w:tcPr>
-            <w:tcW w:type="dxa" w:w="1080"/>
-          </w:tcPr>
-          <w:p>
-            <w:r>
-              <w:t>93.9%</w:t>
-            </w:r>
-          </w:p>
-        </w:tc>
-        <w:tc>
-          <w:tcPr>
-            <w:tcW w:type="dxa" w:w="1080"/>
-          </w:tcPr>
-          <w:p>
-            <w:r>
-              <w:t>0.43%</w:t>
-            </w:r>
-          </w:p>
-        </w:tc>
-        <w:tc>
-          <w:tcPr>
-            <w:tcW w:type="dxa" w:w="1080"/>
-          </w:tcPr>
-          <w:p>
-            <w:r>
-              <w:t>97.6%</w:t>
-            </w:r>
-          </w:p>
-        </w:tc>
-        <w:tc>
-          <w:tcPr>
-            <w:tcW w:type="dxa" w:w="1080"/>
-          </w:tcPr>
-          <w:p>
-            <w:r>
-              <w:t>0.620</w:t>
-            </w:r>
-          </w:p>
-        </w:tc>
-        <w:tc>
-          <w:tcPr>
-            <w:tcW w:type="dxa" w:w="1080"/>
+            <w:tcW w:type="dxa" w:w="1234"/>
+          </w:tcPr>
+          <w:p>
+            <w:r>
+              <w:t>0.9977</w:t>
+            </w:r>
+          </w:p>
+        </w:tc>
+        <w:tc>
+          <w:tcPr>
+            <w:tcW w:type="dxa" w:w="1234"/>
+          </w:tcPr>
+          <w:p>
+            <w:r>
+              <w:t>89.6%</w:t>
+            </w:r>
+          </w:p>
+        </w:tc>
+        <w:tc>
+          <w:tcPr>
+            <w:tcW w:type="dxa" w:w="1234"/>
+          </w:tcPr>
+          <w:p>
+            <w:r>
+              <w:t>1.7%</w:t>
+            </w:r>
+          </w:p>
+        </w:tc>
+        <w:tc>
+          <w:tcPr>
+            <w:tcW w:type="dxa" w:w="1234"/>
+          </w:tcPr>
+          <w:p>
+            <w:r>
+              <w:t>0.39%</w:t>
+            </w:r>
+          </w:p>
+        </w:tc>
+        <w:tc>
+          <w:tcPr>
+            <w:tcW w:type="dxa" w:w="1234"/>
+          </w:tcPr>
+          <w:p>
+            <w:r>
+              <w:t>0.570</w:t>
+            </w:r>
+          </w:p>
+        </w:tc>
+        <w:tc>
+          <w:tcPr>
+            <w:tcW w:type="dxa" w:w="1234"/>
           </w:tcPr>
           <w:p>
             <w:r>
               <w:t>4</w:t>
-            </w:r>
-          </w:p>
-        </w:tc>
-        <w:tc>
-          <w:tcPr>
-            <w:tcW w:type="dxa" w:w="1080"/>
-          </w:tcPr>
-          <w:p>
-            <w:r>
-              <w:t>0.9933</w:t>
             </w:r>
           </w:p>
         </w:tc>
@@ -2535,7 +3102,7 @@
       <w:tr>
         <w:tc>
           <w:tcPr>
-            <w:tcW w:type="dxa" w:w="1080"/>
+            <w:tcW w:type="dxa" w:w="1234"/>
           </w:tcPr>
           <w:p>
             <w:r>
@@ -2545,71 +3112,61 @@
         </w:tc>
         <w:tc>
           <w:tcPr>
-            <w:tcW w:type="dxa" w:w="1080"/>
-          </w:tcPr>
-          <w:p>
-            <w:r>
-              <w:t>0.9970</w:t>
-            </w:r>
-          </w:p>
-        </w:tc>
-        <w:tc>
-          <w:tcPr>
-            <w:tcW w:type="dxa" w:w="1080"/>
-          </w:tcPr>
-          <w:p>
-            <w:r>
-              <w:t>92.2%</w:t>
-            </w:r>
-          </w:p>
-        </w:tc>
-        <w:tc>
-          <w:tcPr>
-            <w:tcW w:type="dxa" w:w="1080"/>
-          </w:tcPr>
-          <w:p>
-            <w:r>
-              <w:t>0.31%</w:t>
-            </w:r>
-          </w:p>
-        </w:tc>
-        <w:tc>
-          <w:tcPr>
-            <w:tcW w:type="dxa" w:w="1080"/>
-          </w:tcPr>
-          <w:p>
-            <w:r>
-              <w:t>98.2%</w:t>
-            </w:r>
-          </w:p>
-        </w:tc>
-        <w:tc>
-          <w:tcPr>
-            <w:tcW w:type="dxa" w:w="1080"/>
-          </w:tcPr>
-          <w:p>
-            <w:r>
-              <w:t>0.625</w:t>
-            </w:r>
-          </w:p>
-        </w:tc>
-        <w:tc>
-          <w:tcPr>
-            <w:tcW w:type="dxa" w:w="1080"/>
+            <w:tcW w:type="dxa" w:w="1234"/>
+          </w:tcPr>
+          <w:p>
+            <w:r>
+              <w:t>0.9965</w:t>
+            </w:r>
+          </w:p>
+        </w:tc>
+        <w:tc>
+          <w:tcPr>
+            <w:tcW w:type="dxa" w:w="1234"/>
+          </w:tcPr>
+          <w:p>
+            <w:r>
+              <w:t>91.1%</w:t>
+            </w:r>
+          </w:p>
+        </w:tc>
+        <w:tc>
+          <w:tcPr>
+            <w:tcW w:type="dxa" w:w="1234"/>
+          </w:tcPr>
+          <w:p>
+            <w:r>
+              <w:t>2.1%</w:t>
+            </w:r>
+          </w:p>
+        </w:tc>
+        <w:tc>
+          <w:tcPr>
+            <w:tcW w:type="dxa" w:w="1234"/>
+          </w:tcPr>
+          <w:p>
+            <w:r>
+              <w:t>0.49%</w:t>
+            </w:r>
+          </w:p>
+        </w:tc>
+        <w:tc>
+          <w:tcPr>
+            <w:tcW w:type="dxa" w:w="1234"/>
+          </w:tcPr>
+          <w:p>
+            <w:r>
+              <w:t>0.569</w:t>
+            </w:r>
+          </w:p>
+        </w:tc>
+        <w:tc>
+          <w:tcPr>
+            <w:tcW w:type="dxa" w:w="1234"/>
           </w:tcPr>
           <w:p>
             <w:r>
               <w:t>4</w:t>
-            </w:r>
-          </w:p>
-        </w:tc>
-        <w:tc>
-          <w:tcPr>
-            <w:tcW w:type="dxa" w:w="1080"/>
-          </w:tcPr>
-          <w:p>
-            <w:r>
-              <w:t>0.9940</w:t>
             </w:r>
           </w:p>
         </w:tc>
@@ -2617,7 +3174,7 @@
       <w:tr>
         <w:tc>
           <w:tcPr>
-            <w:tcW w:type="dxa" w:w="1080"/>
+            <w:tcW w:type="dxa" w:w="1234"/>
           </w:tcPr>
           <w:p>
             <w:r>
@@ -2627,71 +3184,61 @@
         </w:tc>
         <w:tc>
           <w:tcPr>
-            <w:tcW w:type="dxa" w:w="1080"/>
-          </w:tcPr>
-          <w:p>
-            <w:r>
-              <w:t>0.9954</w:t>
-            </w:r>
-          </w:p>
-        </w:tc>
-        <w:tc>
-          <w:tcPr>
-            <w:tcW w:type="dxa" w:w="1080"/>
-          </w:tcPr>
-          <w:p>
-            <w:r>
-              <w:t>90.6%</w:t>
-            </w:r>
-          </w:p>
-        </w:tc>
-        <w:tc>
-          <w:tcPr>
-            <w:tcW w:type="dxa" w:w="1080"/>
-          </w:tcPr>
-          <w:p>
-            <w:r>
-              <w:t>0.48%</w:t>
-            </w:r>
-          </w:p>
-        </w:tc>
-        <w:tc>
-          <w:tcPr>
-            <w:tcW w:type="dxa" w:w="1080"/>
-          </w:tcPr>
-          <w:p>
-            <w:r>
-              <w:t>97.5%</w:t>
-            </w:r>
-          </w:p>
-        </w:tc>
-        <w:tc>
-          <w:tcPr>
-            <w:tcW w:type="dxa" w:w="1080"/>
-          </w:tcPr>
-          <w:p>
-            <w:r>
-              <w:t>0.624</w:t>
-            </w:r>
-          </w:p>
-        </w:tc>
-        <w:tc>
-          <w:tcPr>
-            <w:tcW w:type="dxa" w:w="1080"/>
+            <w:tcW w:type="dxa" w:w="1234"/>
+          </w:tcPr>
+          <w:p>
+            <w:r>
+              <w:t>0.9962</w:t>
+            </w:r>
+          </w:p>
+        </w:tc>
+        <w:tc>
+          <w:tcPr>
+            <w:tcW w:type="dxa" w:w="1234"/>
+          </w:tcPr>
+          <w:p>
+            <w:r>
+              <w:t>89.4%</w:t>
+            </w:r>
+          </w:p>
+        </w:tc>
+        <w:tc>
+          <w:tcPr>
+            <w:tcW w:type="dxa" w:w="1234"/>
+          </w:tcPr>
+          <w:p>
+            <w:r>
+              <w:t>1.0%</w:t>
+            </w:r>
+          </w:p>
+        </w:tc>
+        <w:tc>
+          <w:tcPr>
+            <w:tcW w:type="dxa" w:w="1234"/>
+          </w:tcPr>
+          <w:p>
+            <w:r>
+              <w:t>0.39%</w:t>
+            </w:r>
+          </w:p>
+        </w:tc>
+        <w:tc>
+          <w:tcPr>
+            <w:tcW w:type="dxa" w:w="1234"/>
+          </w:tcPr>
+          <w:p>
+            <w:r>
+              <w:t>0.570</w:t>
+            </w:r>
+          </w:p>
+        </w:tc>
+        <w:tc>
+          <w:tcPr>
+            <w:tcW w:type="dxa" w:w="1234"/>
           </w:tcPr>
           <w:p>
             <w:r>
               <w:t>4</w:t>
-            </w:r>
-          </w:p>
-        </w:tc>
-        <w:tc>
-          <w:tcPr>
-            <w:tcW w:type="dxa" w:w="1080"/>
-          </w:tcPr>
-          <w:p>
-            <w:r>
-              <w:t>0.9923</w:t>
             </w:r>
           </w:p>
         </w:tc>
@@ -2699,15 +3246,15 @@
     </w:tbl>
     <w:p>
       <w:pPr>
-        <w:pStyle w:val="Heading2"/>
+        <w:pStyle w:val="Heading1"/>
       </w:pPr>
       <w:r>
-        <w:t>5.2 Adversarial Robustness</w:t>
+        <w:t>7. Real-World Feasibility</w:t>
       </w:r>
     </w:p>
     <w:p>
       <w:r>
-        <w:t>Each Red Queen generation: (1) attacks mutate toward defender blind spots using feature-aware feedback, (2) the previous generation's defender is evaluated frozen on new attacks (frozen AUC decay curve), (3) Sentinel retrains. Mean TtE = 4 generations before frozen AUC drops below 0.90 — demonstrating measurable evasion dynamics that static submissions cannot produce.</w:t>
+        <w:t>Wind-tunnel harness for issuers: REST API (POST /api/loop/run), analyst console with Agent Council + vector heatmap, labeled data without PII. Governance: synthetic identities, TTP-level playbooks only.</w:t>
       </w:r>
     </w:p>
     <w:p>
@@ -2715,12 +3262,55 @@
         <w:pStyle w:val="Heading1"/>
       </w:pPr>
       <w:r>
-        <w:t>6. Real-World Feasibility</w:t>
+        <w:t>8. GFF Demo Script</w:t>
       </w:r>
     </w:p>
     <w:p>
+      <w:pPr>
+        <w:pStyle w:val="ListNumber"/>
+      </w:pPr>
       <w:r>
-        <w:t>AGNI deploys as a wind-tunnel stress-test harness for issuers and acquirers: new attack ideas enter via the Fraud Genome browser, the twin generates labeled training data without PII exposure, Sentinel scores stream in via REST API, and analysts triage via the Defense Console with SHAP-lite explanations. Governance: synthetic identities only, TTP-level playbooks (not operational scam tooling), anchor data license-respected (derived stats only committed).</w:t>
+        <w:t>1. Open http://localhost:8000 — confirm 'IEEE-CIS calibrated' badge</w:t>
+      </w:r>
+    </w:p>
+    <w:p>
+      <w:pPr>
+        <w:pStyle w:val="ListNumber"/>
+      </w:pPr>
+      <w:r>
+        <w:t>2. Agent Council: show Scout discovery + Critic mutation messages</w:t>
+      </w:r>
+    </w:p>
+    <w:p>
+      <w:pPr>
+        <w:pStyle w:val="ListNumber"/>
+      </w:pPr>
+      <w:r>
+        <w:t>3. Run generation — arms race chart: frozen AUC vs retrained AUC</w:t>
+      </w:r>
+    </w:p>
+    <w:p>
+      <w:pPr>
+        <w:pStyle w:val="ListNumber"/>
+      </w:pPr>
+      <w:r>
+        <w:t>4. Vector heatmap: red = blind spot, green = caught</w:t>
+      </w:r>
+    </w:p>
+    <w:p>
+      <w:pPr>
+        <w:pStyle w:val="ListNumber"/>
+      </w:pPr>
+      <w:r>
+        <w:t>5. Attack Theater: LLM-enriched artifact + SHAP-lite flagged txn</w:t>
+      </w:r>
+    </w:p>
+    <w:p>
+      <w:pPr>
+        <w:pStyle w:val="ListNumber"/>
+      </w:pPr>
+      <w:r>
+        <w:t>6. Baseline bar: rules 1.6% recall vs Sentinel 90%+</w:t>
       </w:r>
     </w:p>
     <w:p>
@@ -2728,63 +3318,7 @@
         <w:pStyle w:val="Heading1"/>
       </w:pPr>
       <w:r>
-        <w:t>7. GFF Demo Script</w:t>
-      </w:r>
-    </w:p>
-    <w:p>
-      <w:pPr>
-        <w:pStyle w:val="ListNumber"/>
-      </w:pPr>
-      <w:r>
-        <w:t>1. Open dashboard at http://localhost:8000</w:t>
-      </w:r>
-    </w:p>
-    <w:p>
-      <w:pPr>
-        <w:pStyle w:val="ListNumber"/>
-      </w:pPr>
-      <w:r>
-        <w:t>2. Genome Browser: filter by 'upi', click GEN-002 digital arrest; show TTPs and observables</w:t>
-      </w:r>
-    </w:p>
-    <w:p>
-      <w:pPr>
-        <w:pStyle w:val="ListNumber"/>
-      </w:pPr>
-      <w:r>
-        <w:t>3. Press 'Run generation' — watch AUC/FPR cards and frozen-defender decay chart update</w:t>
-      </w:r>
-    </w:p>
-    <w:p>
-      <w:pPr>
-        <w:pStyle w:val="ListNumber"/>
-      </w:pPr>
-      <w:r>
-        <w:t>4. Attack Theater: walk flagged case — scam transcript → transaction chain → mule fan-out</w:t>
-      </w:r>
-    </w:p>
-    <w:p>
-      <w:pPr>
-        <w:pStyle w:val="ListNumber"/>
-      </w:pPr>
-      <w:r>
-        <w:t>5. Defense Console: show SHAP-lite explanation on top alert; cite TtE badge</w:t>
-      </w:r>
-    </w:p>
-    <w:p>
-      <w:pPr>
-        <w:pStyle w:val="ListNumber"/>
-      </w:pPr>
-      <w:r>
-        <w:t>6. Closing: 'This is a wind tunnel banks run weekly — new attack ideas in, hardened models out.'</w:t>
-      </w:r>
-    </w:p>
-    <w:p>
-      <w:pPr>
-        <w:pStyle w:val="Heading1"/>
-      </w:pPr>
-      <w:r>
-        <w:t>Appendix: Reproduction</w:t>
+        <w:t>Appendix</w:t>
       </w:r>
     </w:p>
     <w:p>
@@ -2800,7 +3334,15 @@
         <w:pStyle w:val="ListBullet"/>
       </w:pPr>
       <w:r>
-        <w:t>make calibrate  # optional: IEEE-CIS anchor</w:t>
+        <w:t>cp train_transaction.csv data/anchor/</w:t>
+      </w:r>
+    </w:p>
+    <w:p>
+      <w:pPr>
+        <w:pStyle w:val="ListBullet"/>
+      </w:pPr>
+      <w:r>
+        <w:t>make calibrate</w:t>
       </w:r>
     </w:p>
     <w:p>

</xml_diff>

<commit_message>
Judge-ready: FX-aware fidelity, held-out vectors, SOC UI, Docker host.
Normalize IEEE-CIS amounts to INR before KS, skip mule/mandate/NPCI on gen 0,
add unique-src graph features, cap Forge LLM cost, redesign the console, and
add Dockerfile/render.yaml for a public prototype URL.
</commit_message>
<xml_diff>
--- a/docs/AGNI_Solution_Walkthrough.docx
+++ b/docs/AGNI_Solution_Walkthrough.docx
@@ -16,7 +16,7 @@
         <w:jc w:val="center"/>
       </w:pPr>
       <w:r>
-        <w:t>Mastercard Innovation Challenge 2026 · AI Defense Lab for Payment Security</w:t>
+        <w:t>Mastercard Innovation Challenge 2026 · AI Defense Lab</w:t>
       </w:r>
     </w:p>
     <w:p>
@@ -24,12 +24,12 @@
         <w:pStyle w:val="Heading1"/>
       </w:pPr>
       <w:r>
-        <w:t>1. Executive Summary</w:t>
+        <w:t>1. What this is</w:t>
       </w:r>
     </w:p>
     <w:p>
       <w:r>
-        <w:t>AGNI is a closed-loop adversarial AI system for GenAI-powered payment fraud. Three LLM agents — Scout (identify), Forge (generate), Critic (evolve) — operate inside a Red Queen wind tunnel calibrated on 590,540 real IEEE-CIS/Vesta transactions. We measure Time-to-Evade (TtE): how many generations a frozen defender survives before evolving attacks bypass it.</w:t>
+        <w:t>AGNI is a closed-loop wind tunnel for GenAI payment fraud. Scout proposes vectors from threat intel, Forge writes scam artifacts, Critic mutates toward defender blind spots, Sentinel retrains under an FPR budget. Prototype URL belongs in the Kaggle writeup after Render deploy.</w:t>
       </w:r>
     </w:p>
     <w:p>
@@ -37,7 +37,7 @@
         <w:rPr>
           <w:b/>
         </w:rPr>
-        <w:t>Headline results (seeds 7/42/99, IEEE-CIS calibrated): ROC AUC 0.997, Sentinel recall 90.0%, static rules recall 1.6%, FPR 0.42%, TtE 4 gens, 38 vectors (13 tier-A playbooks).</w:t>
+        <w:t>Headline (multi-seed, IEEE-CIS FX-normalized): AUC 0.995, Sentinel recall 89%, rules recall 1.6%, FPR 0.39%, TtE 4, 13 tier-A playbooks / 38 labelled vectors.</w:t>
       </w:r>
     </w:p>
     <w:p>
@@ -45,31 +45,7 @@
         <w:pStyle w:val="Heading1"/>
       </w:pPr>
       <w:r>
-        <w:t>2. Triple-Agent Council</w:t>
-      </w:r>
-    </w:p>
-    <w:p>
-      <w:r>
-        <w:t>Scout Agent: reads curated threat intel (FBI AI-fraud, India digital-arrest, NPCI UPI advisories) plus defender blind spots; proposes new AttackGenome JSON each 2 generations (DeepSeek API, offline fallback included).</w:t>
-        <w:br/>
-        <w:br/>
-        <w:t>Forge Agent: LLM-enriches scam artifacts (SMS, transcripts, emails) for realism; cached per attack_id.</w:t>
-        <w:br/>
-        <w:br/>
-        <w:t>Critic Agent: analyzes detection rates and feature blind spots; narrates mutation strategy in the Agent Council UI.</w:t>
-      </w:r>
-    </w:p>
-    <w:p>
-      <w:pPr>
-        <w:pStyle w:val="Heading1"/>
-      </w:pPr>
-      <w:r>
-        <w:t>3. Threat Landscape — Fraud Genome</w:t>
-      </w:r>
-    </w:p>
-    <w:p>
-      <w:r>
-        <w:t>38 vectors tiered honestly: Tier A = dedicated playbook, Tier B = param variant, Tier C = Scout-discovered at runtime.</w:t>
+        <w:t>2. Rubric map</w:t>
       </w:r>
     </w:p>
     <w:tbl>
@@ -79,82 +55,27 @@
         <w:tblLook w:firstColumn="1" w:firstRow="1" w:lastColumn="0" w:lastRow="0" w:noHBand="0" w:noVBand="1" w:val="04A0"/>
       </w:tblPr>
       <w:tblGrid>
-        <w:gridCol w:w="1234"/>
-        <w:gridCol w:w="1234"/>
-        <w:gridCol w:w="1234"/>
-        <w:gridCol w:w="1234"/>
-        <w:gridCol w:w="1234"/>
-        <w:gridCol w:w="1234"/>
-        <w:gridCol w:w="1234"/>
+        <w:gridCol w:w="4320"/>
+        <w:gridCol w:w="4320"/>
       </w:tblGrid>
       <w:tr>
         <w:tc>
           <w:tcPr>
-            <w:tcW w:type="dxa" w:w="1234"/>
+            <w:tcW w:type="dxa" w:w="4320"/>
           </w:tcPr>
           <w:p>
             <w:r>
-              <w:t>ID</w:t>
+              <w:t>Criterion</w:t>
             </w:r>
           </w:p>
         </w:tc>
         <w:tc>
           <w:tcPr>
-            <w:tcW w:type="dxa" w:w="1234"/>
+            <w:tcW w:type="dxa" w:w="4320"/>
           </w:tcPr>
           <w:p>
             <w:r>
-              <w:t>Tier</w:t>
-            </w:r>
-          </w:p>
-        </w:tc>
-        <w:tc>
-          <w:tcPr>
-            <w:tcW w:type="dxa" w:w="1234"/>
-          </w:tcPr>
-          <w:p>
-            <w:r>
-              <w:t>Vector</w:t>
-            </w:r>
-          </w:p>
-        </w:tc>
-        <w:tc>
-          <w:tcPr>
-            <w:tcW w:type="dxa" w:w="1234"/>
-          </w:tcPr>
-          <w:p>
-            <w:r>
-              <w:t>Rails</w:t>
-            </w:r>
-          </w:p>
-        </w:tc>
-        <w:tc>
-          <w:tcPr>
-            <w:tcW w:type="dxa" w:w="1234"/>
-          </w:tcPr>
-          <w:p>
-            <w:r>
-              <w:t>Surface</w:t>
-            </w:r>
-          </w:p>
-        </w:tc>
-        <w:tc>
-          <w:tcPr>
-            <w:tcW w:type="dxa" w:w="1234"/>
-          </w:tcPr>
-          <w:p>
-            <w:r>
-              <w:t>Capability</w:t>
-            </w:r>
-          </w:p>
-        </w:tc>
-        <w:tc>
-          <w:tcPr>
-            <w:tcW w:type="dxa" w:w="1234"/>
-          </w:tcPr>
-          <w:p>
-            <w:r>
-              <w:t>Playbook</w:t>
+              <w:t>Evidence</w:t>
             </w:r>
           </w:p>
         </w:tc>
@@ -162,71 +83,21 @@
       <w:tr>
         <w:tc>
           <w:tcPr>
-            <w:tcW w:type="dxa" w:w="1234"/>
+            <w:tcW w:type="dxa" w:w="4320"/>
           </w:tcPr>
           <w:p>
             <w:r>
-              <w:t>GEN-001</w:t>
+              <w:t>Diversity</w:t>
             </w:r>
           </w:p>
         </w:tc>
         <w:tc>
           <w:tcPr>
-            <w:tcW w:type="dxa" w:w="1234"/>
+            <w:tcW w:type="dxa" w:w="4320"/>
           </w:tcPr>
           <w:p>
             <w:r>
-              <w:t>A</w:t>
-            </w:r>
-          </w:p>
-        </w:tc>
-        <w:tc>
-          <w:tcPr>
-            <w:tcW w:type="dxa" w:w="1234"/>
-          </w:tcPr>
-          <w:p>
-            <w:r>
-              <w:t>Voice-clone relative-in-emergency UPI dr</w:t>
-            </w:r>
-          </w:p>
-        </w:tc>
-        <w:tc>
-          <w:tcPr>
-            <w:tcW w:type="dxa" w:w="1234"/>
-          </w:tcPr>
-          <w:p>
-            <w:r>
-              <w:t>upi</w:t>
-            </w:r>
-          </w:p>
-        </w:tc>
-        <w:tc>
-          <w:tcPr>
-            <w:tcW w:type="dxa" w:w="1234"/>
-          </w:tcPr>
-          <w:p>
-            <w:r>
-              <w:t>social_engineering</w:t>
-            </w:r>
-          </w:p>
-        </w:tc>
-        <w:tc>
-          <w:tcPr>
-            <w:tcW w:type="dxa" w:w="1234"/>
-          </w:tcPr>
-          <w:p>
-            <w:r>
-              <w:t>voice_clone, text_generation</w:t>
-            </w:r>
-          </w:p>
-        </w:tc>
-        <w:tc>
-          <w:tcPr>
-            <w:tcW w:type="dxa" w:w="1234"/>
-          </w:tcPr>
-          <w:p>
-            <w:r>
-              <w:t>voice_relative_upi</w:t>
+              <w:t>13 executable playbooks (tier A) + param variants (B) + Scout (C)</w:t>
             </w:r>
           </w:p>
         </w:tc>
@@ -234,71 +105,21 @@
       <w:tr>
         <w:tc>
           <w:tcPr>
-            <w:tcW w:type="dxa" w:w="1234"/>
+            <w:tcW w:type="dxa" w:w="4320"/>
           </w:tcPr>
           <w:p>
             <w:r>
-              <w:t>GEN-002</w:t>
+              <w:t>Fidelity</w:t>
             </w:r>
           </w:p>
         </w:tc>
         <w:tc>
           <w:tcPr>
-            <w:tcW w:type="dxa" w:w="1234"/>
+            <w:tcW w:type="dxa" w:w="4320"/>
           </w:tcPr>
           <w:p>
             <w:r>
-              <w:t>A</w:t>
-            </w:r>
-          </w:p>
-        </w:tc>
-        <w:tc>
-          <w:tcPr>
-            <w:tcW w:type="dxa" w:w="1234"/>
-          </w:tcPr>
-          <w:p>
-            <w:r>
-              <w:t>Deepfake digital-arrest savings exfiltra</w:t>
-            </w:r>
-          </w:p>
-        </w:tc>
-        <w:tc>
-          <w:tcPr>
-            <w:tcW w:type="dxa" w:w="1234"/>
-          </w:tcPr>
-          <w:p>
-            <w:r>
-              <w:t>upi, wire</w:t>
-            </w:r>
-          </w:p>
-        </w:tc>
-        <w:tc>
-          <w:tcPr>
-            <w:tcW w:type="dxa" w:w="1234"/>
-          </w:tcPr>
-          <w:p>
-            <w:r>
-              <w:t>social_engineering</w:t>
-            </w:r>
-          </w:p>
-        </w:tc>
-        <w:tc>
-          <w:tcPr>
-            <w:tcW w:type="dxa" w:w="1234"/>
-          </w:tcPr>
-          <w:p>
-            <w:r>
-              <w:t>deepfake_video, voice_clone, t</w:t>
-            </w:r>
-          </w:p>
-        </w:tc>
-        <w:tc>
-          <w:tcPr>
-            <w:tcW w:type="dxa" w:w="1234"/>
-          </w:tcPr>
-          <w:p>
-            <w:r>
-              <w:t>digital_arrest</w:t>
+              <w:t>KS vs IEEE-CIS amounts converted USD→INR; hour shape; velocity; Forge text</w:t>
             </w:r>
           </w:p>
         </w:tc>
@@ -306,71 +127,21 @@
       <w:tr>
         <w:tc>
           <w:tcPr>
-            <w:tcW w:type="dxa" w:w="1234"/>
+            <w:tcW w:type="dxa" w:w="4320"/>
           </w:tcPr>
           <w:p>
             <w:r>
-              <w:t>GEN-003</w:t>
+              <w:t>Detection</w:t>
             </w:r>
           </w:p>
         </w:tc>
         <w:tc>
           <w:tcPr>
-            <w:tcW w:type="dxa" w:w="1234"/>
+            <w:tcW w:type="dxa" w:w="4320"/>
           </w:tcPr>
           <w:p>
             <w:r>
-              <w:t>A</w:t>
-            </w:r>
-          </w:p>
-        </w:tc>
-        <w:tc>
-          <w:tcPr>
-            <w:tcW w:type="dxa" w:w="1234"/>
-          </w:tcPr>
-          <w:p>
-            <w:r>
-              <w:t>LLM CFO-BEC invoice-thread IBAN swap</w:t>
-            </w:r>
-          </w:p>
-        </w:tc>
-        <w:tc>
-          <w:tcPr>
-            <w:tcW w:type="dxa" w:w="1234"/>
-          </w:tcPr>
-          <w:p>
-            <w:r>
-              <w:t>wire</w:t>
-            </w:r>
-          </w:p>
-        </w:tc>
-        <w:tc>
-          <w:tcPr>
-            <w:tcW w:type="dxa" w:w="1234"/>
-          </w:tcPr>
-          <w:p>
-            <w:r>
-              <w:t>social_engineering, customer_s</w:t>
-            </w:r>
-          </w:p>
-        </w:tc>
-        <w:tc>
-          <w:tcPr>
-            <w:tcW w:type="dxa" w:w="1234"/>
-          </w:tcPr>
-          <w:p>
-            <w:r>
-              <w:t>text_generation</w:t>
-            </w:r>
-          </w:p>
-        </w:tc>
-        <w:tc>
-          <w:tcPr>
-            <w:tcW w:type="dxa" w:w="1234"/>
-          </w:tcPr>
-          <w:p>
-            <w:r>
-              <w:t>cfo_bec_wire</w:t>
+              <w:t>Fusion HGB+TF-IDF; held-out mule/mandate/NPCI on gen 0; FPR ≤ 0.5%</w:t>
             </w:r>
           </w:p>
         </w:tc>
@@ -378,71 +149,21 @@
       <w:tr>
         <w:tc>
           <w:tcPr>
-            <w:tcW w:type="dxa" w:w="1234"/>
+            <w:tcW w:type="dxa" w:w="4320"/>
           </w:tcPr>
           <w:p>
             <w:r>
-              <w:t>GEN-004</w:t>
+              <w:t>Novelty</w:t>
             </w:r>
           </w:p>
         </w:tc>
         <w:tc>
           <w:tcPr>
-            <w:tcW w:type="dxa" w:w="1234"/>
+            <w:tcW w:type="dxa" w:w="4320"/>
           </w:tcPr>
           <w:p>
             <w:r>
-              <w:t>A</w:t>
-            </w:r>
-          </w:p>
-        </w:tc>
-        <w:tc>
-          <w:tcPr>
-            <w:tcW w:type="dxa" w:w="1234"/>
-          </w:tcPr>
-          <w:p>
-            <w:r>
-              <w:t>GenAI synthetic-KYC bust-out</w:t>
-            </w:r>
-          </w:p>
-        </w:tc>
-        <w:tc>
-          <w:tcPr>
-            <w:tcW w:type="dxa" w:w="1234"/>
-          </w:tcPr>
-          <w:p>
-            <w:r>
-              <w:t>card, wallet, upi</w:t>
-            </w:r>
-          </w:p>
-        </w:tc>
-        <w:tc>
-          <w:tcPr>
-            <w:tcW w:type="dxa" w:w="1234"/>
-          </w:tcPr>
-          <w:p>
-            <w:r>
-              <w:t>onboarding_kyc</w:t>
-            </w:r>
-          </w:p>
-        </w:tc>
-        <w:tc>
-          <w:tcPr>
-            <w:tcW w:type="dxa" w:w="1234"/>
-          </w:tcPr>
-          <w:p>
-            <w:r>
-              <w:t>image_generation, document_for</w:t>
-            </w:r>
-          </w:p>
-        </w:tc>
-        <w:tc>
-          <w:tcPr>
-            <w:tcW w:type="dxa" w:w="1234"/>
-          </w:tcPr>
-          <w:p>
-            <w:r>
-              <w:t>synthetic_kyc</w:t>
+              <w:t>Red Queen TtE; Agent Council; unique-src 1h mule graph</w:t>
             </w:r>
           </w:p>
         </w:tc>
@@ -450,2447 +171,21 @@
       <w:tr>
         <w:tc>
           <w:tcPr>
-            <w:tcW w:type="dxa" w:w="1234"/>
+            <w:tcW w:type="dxa" w:w="4320"/>
           </w:tcPr>
           <w:p>
             <w:r>
-              <w:t>GEN-005</w:t>
+              <w:t>Feasibility</w:t>
             </w:r>
           </w:p>
         </w:tc>
         <w:tc>
           <w:tcPr>
-            <w:tcW w:type="dxa" w:w="1234"/>
+            <w:tcW w:type="dxa" w:w="4320"/>
           </w:tcPr>
           <w:p>
             <w:r>
-              <w:t>A</w:t>
-            </w:r>
-          </w:p>
-        </w:tc>
-        <w:tc>
-          <w:tcPr>
-            <w:tcW w:type="dxa" w:w="1234"/>
-          </w:tcPr>
-          <w:p>
-            <w:r>
-              <w:t>Personalized smishing refund phish -&gt; CN</w:t>
-            </w:r>
-          </w:p>
-        </w:tc>
-        <w:tc>
-          <w:tcPr>
-            <w:tcW w:type="dxa" w:w="1234"/>
-          </w:tcPr>
-          <w:p>
-            <w:r>
-              <w:t>card, wallet</w:t>
-            </w:r>
-          </w:p>
-        </w:tc>
-        <w:tc>
-          <w:tcPr>
-            <w:tcW w:type="dxa" w:w="1234"/>
-          </w:tcPr>
-          <w:p>
-            <w:r>
-              <w:t>social_engineering</w:t>
-            </w:r>
-          </w:p>
-        </w:tc>
-        <w:tc>
-          <w:tcPr>
-            <w:tcW w:type="dxa" w:w="1234"/>
-          </w:tcPr>
-          <w:p>
-            <w:r>
-              <w:t>text_generation</w:t>
-            </w:r>
-          </w:p>
-        </w:tc>
-        <w:tc>
-          <w:tcPr>
-            <w:tcW w:type="dxa" w:w="1234"/>
-          </w:tcPr>
-          <w:p>
-            <w:r>
-              <w:t>personalized_smishing</w:t>
-            </w:r>
-          </w:p>
-        </w:tc>
-      </w:tr>
-      <w:tr>
-        <w:tc>
-          <w:tcPr>
-            <w:tcW w:type="dxa" w:w="1234"/>
-          </w:tcPr>
-          <w:p>
-            <w:r>
-              <w:t>GEN-006</w:t>
-            </w:r>
-          </w:p>
-        </w:tc>
-        <w:tc>
-          <w:tcPr>
-            <w:tcW w:type="dxa" w:w="1234"/>
-          </w:tcPr>
-          <w:p>
-            <w:r>
-              <w:t>A</w:t>
-            </w:r>
-          </w:p>
-        </w:tc>
-        <w:tc>
-          <w:tcPr>
-            <w:tcW w:type="dxa" w:w="1234"/>
-          </w:tcPr>
-          <w:p>
-            <w:r>
-              <w:t>Behavioral-mimicry stealth card drain</w:t>
-            </w:r>
-          </w:p>
-        </w:tc>
-        <w:tc>
-          <w:tcPr>
-            <w:tcW w:type="dxa" w:w="1234"/>
-          </w:tcPr>
-          <w:p>
-            <w:r>
-              <w:t>card, wallet</w:t>
-            </w:r>
-          </w:p>
-        </w:tc>
-        <w:tc>
-          <w:tcPr>
-            <w:tcW w:type="dxa" w:w="1234"/>
-          </w:tcPr>
-          <w:p>
-            <w:r>
-              <w:t>behavioral</w:t>
-            </w:r>
-          </w:p>
-        </w:tc>
-        <w:tc>
-          <w:tcPr>
-            <w:tcW w:type="dxa" w:w="1234"/>
-          </w:tcPr>
-          <w:p>
-            <w:r>
-              <w:t>agent_orchestration</w:t>
-            </w:r>
-          </w:p>
-        </w:tc>
-        <w:tc>
-          <w:tcPr>
-            <w:tcW w:type="dxa" w:w="1234"/>
-          </w:tcPr>
-          <w:p>
-            <w:r>
-              <w:t>behavioral_mimicry</w:t>
-            </w:r>
-          </w:p>
-        </w:tc>
-      </w:tr>
-      <w:tr>
-        <w:tc>
-          <w:tcPr>
-            <w:tcW w:type="dxa" w:w="1234"/>
-          </w:tcPr>
-          <w:p>
-            <w:r>
-              <w:t>GEN-007</w:t>
-            </w:r>
-          </w:p>
-        </w:tc>
-        <w:tc>
-          <w:tcPr>
-            <w:tcW w:type="dxa" w:w="1234"/>
-          </w:tcPr>
-          <w:p>
-            <w:r>
-              <w:t>A</w:t>
-            </w:r>
-          </w:p>
-        </w:tc>
-        <w:tc>
-          <w:tcPr>
-            <w:tcW w:type="dxa" w:w="1234"/>
-          </w:tcPr>
-          <w:p>
-            <w:r>
-              <w:t>Prompt-injected agentic-checkout gift-ca</w:t>
-            </w:r>
-          </w:p>
-        </w:tc>
-        <w:tc>
-          <w:tcPr>
-            <w:tcW w:type="dxa" w:w="1234"/>
-          </w:tcPr>
-          <w:p>
-            <w:r>
-              <w:t>card</w:t>
-            </w:r>
-          </w:p>
-        </w:tc>
-        <w:tc>
-          <w:tcPr>
-            <w:tcW w:type="dxa" w:w="1234"/>
-          </w:tcPr>
-          <w:p>
-            <w:r>
-              <w:t>agentic_checkout</w:t>
-            </w:r>
-          </w:p>
-        </w:tc>
-        <w:tc>
-          <w:tcPr>
-            <w:tcW w:type="dxa" w:w="1234"/>
-          </w:tcPr>
-          <w:p>
-            <w:r>
-              <w:t>agent_orchestration, text_gene</w:t>
-            </w:r>
-          </w:p>
-        </w:tc>
-        <w:tc>
-          <w:tcPr>
-            <w:tcW w:type="dxa" w:w="1234"/>
-          </w:tcPr>
-          <w:p>
-            <w:r>
-              <w:t>agent_prompt_injection</w:t>
-            </w:r>
-          </w:p>
-        </w:tc>
-      </w:tr>
-      <w:tr>
-        <w:tc>
-          <w:tcPr>
-            <w:tcW w:type="dxa" w:w="1234"/>
-          </w:tcPr>
-          <w:p>
-            <w:r>
-              <w:t>GEN-008</w:t>
-            </w:r>
-          </w:p>
-        </w:tc>
-        <w:tc>
-          <w:tcPr>
-            <w:tcW w:type="dxa" w:w="1234"/>
-          </w:tcPr>
-          <w:p>
-            <w:r>
-              <w:t>A</w:t>
-            </w:r>
-          </w:p>
-        </w:tc>
-        <w:tc>
-          <w:tcPr>
-            <w:tcW w:type="dxa" w:w="1234"/>
-          </w:tcPr>
-          <w:p>
-            <w:r>
-              <w:t>LLM task-scam mule-network recruitment +</w:t>
-            </w:r>
-          </w:p>
-        </w:tc>
-        <w:tc>
-          <w:tcPr>
-            <w:tcW w:type="dxa" w:w="1234"/>
-          </w:tcPr>
-          <w:p>
-            <w:r>
-              <w:t>upi, wire</w:t>
-            </w:r>
-          </w:p>
-        </w:tc>
-        <w:tc>
-          <w:tcPr>
-            <w:tcW w:type="dxa" w:w="1234"/>
-          </w:tcPr>
-          <w:p>
-            <w:r>
-              <w:t>infrastructure, social_enginee</w:t>
-            </w:r>
-          </w:p>
-        </w:tc>
-        <w:tc>
-          <w:tcPr>
-            <w:tcW w:type="dxa" w:w="1234"/>
-          </w:tcPr>
-          <w:p>
-            <w:r>
-              <w:t>text_generation, agent_orchest</w:t>
-            </w:r>
-          </w:p>
-        </w:tc>
-        <w:tc>
-          <w:tcPr>
-            <w:tcW w:type="dxa" w:w="1234"/>
-          </w:tcPr>
-          <w:p>
-            <w:r>
-              <w:t>mule_recruitment</w:t>
-            </w:r>
-          </w:p>
-        </w:tc>
-      </w:tr>
-      <w:tr>
-        <w:tc>
-          <w:tcPr>
-            <w:tcW w:type="dxa" w:w="1234"/>
-          </w:tcPr>
-          <w:p>
-            <w:r>
-              <w:t>GEN-009</w:t>
-            </w:r>
-          </w:p>
-        </w:tc>
-        <w:tc>
-          <w:tcPr>
-            <w:tcW w:type="dxa" w:w="1234"/>
-          </w:tcPr>
-          <w:p>
-            <w:r>
-              <w:t>A</w:t>
-            </w:r>
-          </w:p>
-        </w:tc>
-        <w:tc>
-          <w:tcPr>
-            <w:tcW w:type="dxa" w:w="1234"/>
-          </w:tcPr>
-          <w:p>
-            <w:r>
-              <w:t>QR deep-link swap collect-request scam</w:t>
-            </w:r>
-          </w:p>
-        </w:tc>
-        <w:tc>
-          <w:tcPr>
-            <w:tcW w:type="dxa" w:w="1234"/>
-          </w:tcPr>
-          <w:p>
-            <w:r>
-              <w:t>upi</w:t>
-            </w:r>
-          </w:p>
-        </w:tc>
-        <w:tc>
-          <w:tcPr>
-            <w:tcW w:type="dxa" w:w="1234"/>
-          </w:tcPr>
-          <w:p>
-            <w:r>
-              <w:t>social_engineering</w:t>
-            </w:r>
-          </w:p>
-        </w:tc>
-        <w:tc>
-          <w:tcPr>
-            <w:tcW w:type="dxa" w:w="1234"/>
-          </w:tcPr>
-          <w:p>
-            <w:r>
-              <w:t>image_generation, text_generat</w:t>
-            </w:r>
-          </w:p>
-        </w:tc>
-        <w:tc>
-          <w:tcPr>
-            <w:tcW w:type="dxa" w:w="1234"/>
-          </w:tcPr>
-          <w:p>
-            <w:r>
-              <w:t>qr_collect_swap</w:t>
-            </w:r>
-          </w:p>
-        </w:tc>
-      </w:tr>
-      <w:tr>
-        <w:tc>
-          <w:tcPr>
-            <w:tcW w:type="dxa" w:w="1234"/>
-          </w:tcPr>
-          <w:p>
-            <w:r>
-              <w:t>GEN-010</w:t>
-            </w:r>
-          </w:p>
-        </w:tc>
-        <w:tc>
-          <w:tcPr>
-            <w:tcW w:type="dxa" w:w="1234"/>
-          </w:tcPr>
-          <w:p>
-            <w:r>
-              <w:t>A</w:t>
-            </w:r>
-          </w:p>
-        </w:tc>
-        <w:tc>
-          <w:tcPr>
-            <w:tcW w:type="dxa" w:w="1234"/>
-          </w:tcPr>
-          <w:p>
-            <w:r>
-              <w:t>AI-drafted investment-group pump scam</w:t>
-            </w:r>
-          </w:p>
-        </w:tc>
-        <w:tc>
-          <w:tcPr>
-            <w:tcW w:type="dxa" w:w="1234"/>
-          </w:tcPr>
-          <w:p>
-            <w:r>
-              <w:t>upi, wire</w:t>
-            </w:r>
-          </w:p>
-        </w:tc>
-        <w:tc>
-          <w:tcPr>
-            <w:tcW w:type="dxa" w:w="1234"/>
-          </w:tcPr>
-          <w:p>
-            <w:r>
-              <w:t>social_engineering</w:t>
-            </w:r>
-          </w:p>
-        </w:tc>
-        <w:tc>
-          <w:tcPr>
-            <w:tcW w:type="dxa" w:w="1234"/>
-          </w:tcPr>
-          <w:p>
-            <w:r>
-              <w:t>image_generation, deepfake_vid</w:t>
-            </w:r>
-          </w:p>
-        </w:tc>
-        <w:tc>
-          <w:tcPr>
-            <w:tcW w:type="dxa" w:w="1234"/>
-          </w:tcPr>
-          <w:p>
-            <w:r>
-              <w:t>investment_pump</w:t>
-            </w:r>
-          </w:p>
-        </w:tc>
-      </w:tr>
-      <w:tr>
-        <w:tc>
-          <w:tcPr>
-            <w:tcW w:type="dxa" w:w="1234"/>
-          </w:tcPr>
-          <w:p>
-            <w:r>
-              <w:t>GEN-011</w:t>
-            </w:r>
-          </w:p>
-        </w:tc>
-        <w:tc>
-          <w:tcPr>
-            <w:tcW w:type="dxa" w:w="1234"/>
-          </w:tcPr>
-          <w:p>
-            <w:r>
-              <w:t>B</w:t>
-            </w:r>
-          </w:p>
-        </w:tc>
-        <w:tc>
-          <w:tcPr>
-            <w:tcW w:type="dxa" w:w="1234"/>
-          </w:tcPr>
-          <w:p>
-            <w:r>
-              <w:t>Hindi regional vishing UPI drain</w:t>
-            </w:r>
-          </w:p>
-        </w:tc>
-        <w:tc>
-          <w:tcPr>
-            <w:tcW w:type="dxa" w:w="1234"/>
-          </w:tcPr>
-          <w:p>
-            <w:r>
-              <w:t>upi</w:t>
-            </w:r>
-          </w:p>
-        </w:tc>
-        <w:tc>
-          <w:tcPr>
-            <w:tcW w:type="dxa" w:w="1234"/>
-          </w:tcPr>
-          <w:p>
-            <w:r>
-              <w:t>social_engineering</w:t>
-            </w:r>
-          </w:p>
-        </w:tc>
-        <w:tc>
-          <w:tcPr>
-            <w:tcW w:type="dxa" w:w="1234"/>
-          </w:tcPr>
-          <w:p>
-            <w:r>
-              <w:t>voice_clone, text_generation</w:t>
-            </w:r>
-          </w:p>
-        </w:tc>
-        <w:tc>
-          <w:tcPr>
-            <w:tcW w:type="dxa" w:w="1234"/>
-          </w:tcPr>
-          <w:p>
-            <w:r>
-              <w:t>voice_relative_upi</w:t>
-            </w:r>
-          </w:p>
-        </w:tc>
-      </w:tr>
-      <w:tr>
-        <w:tc>
-          <w:tcPr>
-            <w:tcW w:type="dxa" w:w="1234"/>
-          </w:tcPr>
-          <w:p>
-            <w:r>
-              <w:t>GEN-012</w:t>
-            </w:r>
-          </w:p>
-        </w:tc>
-        <w:tc>
-          <w:tcPr>
-            <w:tcW w:type="dxa" w:w="1234"/>
-          </w:tcPr>
-          <w:p>
-            <w:r>
-              <w:t>B</w:t>
-            </w:r>
-          </w:p>
-        </w:tc>
-        <w:tc>
-          <w:tcPr>
-            <w:tcW w:type="dxa" w:w="1234"/>
-          </w:tcPr>
-          <w:p>
-            <w:r>
-              <w:t>NEFT/IMPS corporate wire diversion</w:t>
-            </w:r>
-          </w:p>
-        </w:tc>
-        <w:tc>
-          <w:tcPr>
-            <w:tcW w:type="dxa" w:w="1234"/>
-          </w:tcPr>
-          <w:p>
-            <w:r>
-              <w:t>wire</w:t>
-            </w:r>
-          </w:p>
-        </w:tc>
-        <w:tc>
-          <w:tcPr>
-            <w:tcW w:type="dxa" w:w="1234"/>
-          </w:tcPr>
-          <w:p>
-            <w:r>
-              <w:t>social_engineering</w:t>
-            </w:r>
-          </w:p>
-        </w:tc>
-        <w:tc>
-          <w:tcPr>
-            <w:tcW w:type="dxa" w:w="1234"/>
-          </w:tcPr>
-          <w:p>
-            <w:r>
-              <w:t>text_generation, document_forg</w:t>
-            </w:r>
-          </w:p>
-        </w:tc>
-        <w:tc>
-          <w:tcPr>
-            <w:tcW w:type="dxa" w:w="1234"/>
-          </w:tcPr>
-          <w:p>
-            <w:r>
-              <w:t>cfo_bec_wire</w:t>
-            </w:r>
-          </w:p>
-        </w:tc>
-      </w:tr>
-      <w:tr>
-        <w:tc>
-          <w:tcPr>
-            <w:tcW w:type="dxa" w:w="1234"/>
-          </w:tcPr>
-          <w:p>
-            <w:r>
-              <w:t>GEN-013</w:t>
-            </w:r>
-          </w:p>
-        </w:tc>
-        <w:tc>
-          <w:tcPr>
-            <w:tcW w:type="dxa" w:w="1234"/>
-          </w:tcPr>
-          <w:p>
-            <w:r>
-              <w:t>B</w:t>
-            </w:r>
-          </w:p>
-        </w:tc>
-        <w:tc>
-          <w:tcPr>
-            <w:tcW w:type="dxa" w:w="1234"/>
-          </w:tcPr>
-          <w:p>
-            <w:r>
-              <w:t>Wallet cash-out mule consolidation</w:t>
-            </w:r>
-          </w:p>
-        </w:tc>
-        <w:tc>
-          <w:tcPr>
-            <w:tcW w:type="dxa" w:w="1234"/>
-          </w:tcPr>
-          <w:p>
-            <w:r>
-              <w:t>wallet, upi</w:t>
-            </w:r>
-          </w:p>
-        </w:tc>
-        <w:tc>
-          <w:tcPr>
-            <w:tcW w:type="dxa" w:w="1234"/>
-          </w:tcPr>
-          <w:p>
-            <w:r>
-              <w:t>infrastructure</w:t>
-            </w:r>
-          </w:p>
-        </w:tc>
-        <w:tc>
-          <w:tcPr>
-            <w:tcW w:type="dxa" w:w="1234"/>
-          </w:tcPr>
-          <w:p>
-            <w:r>
-              <w:t>text_generation, agent_orchest</w:t>
-            </w:r>
-          </w:p>
-        </w:tc>
-        <w:tc>
-          <w:tcPr>
-            <w:tcW w:type="dxa" w:w="1234"/>
-          </w:tcPr>
-          <w:p>
-            <w:r>
-              <w:t>mule_recruitment</w:t>
-            </w:r>
-          </w:p>
-        </w:tc>
-      </w:tr>
-      <w:tr>
-        <w:tc>
-          <w:tcPr>
-            <w:tcW w:type="dxa" w:w="1234"/>
-          </w:tcPr>
-          <w:p>
-            <w:r>
-              <w:t>GEN-014</w:t>
-            </w:r>
-          </w:p>
-        </w:tc>
-        <w:tc>
-          <w:tcPr>
-            <w:tcW w:type="dxa" w:w="1234"/>
-          </w:tcPr>
-          <w:p>
-            <w:r>
-              <w:t>B</w:t>
-            </w:r>
-          </w:p>
-        </w:tc>
-        <w:tc>
-          <w:tcPr>
-            <w:tcW w:type="dxa" w:w="1234"/>
-          </w:tcPr>
-          <w:p>
-            <w:r>
-              <w:t>UPI autopay mandate abuse</w:t>
-            </w:r>
-          </w:p>
-        </w:tc>
-        <w:tc>
-          <w:tcPr>
-            <w:tcW w:type="dxa" w:w="1234"/>
-          </w:tcPr>
-          <w:p>
-            <w:r>
-              <w:t>upi</w:t>
-            </w:r>
-          </w:p>
-        </w:tc>
-        <w:tc>
-          <w:tcPr>
-            <w:tcW w:type="dxa" w:w="1234"/>
-          </w:tcPr>
-          <w:p>
-            <w:r>
-              <w:t>behavioral</w:t>
-            </w:r>
-          </w:p>
-        </w:tc>
-        <w:tc>
-          <w:tcPr>
-            <w:tcW w:type="dxa" w:w="1234"/>
-          </w:tcPr>
-          <w:p>
-            <w:r>
-              <w:t>text_generation</w:t>
-            </w:r>
-          </w:p>
-        </w:tc>
-        <w:tc>
-          <w:tcPr>
-            <w:tcW w:type="dxa" w:w="1234"/>
-          </w:tcPr>
-          <w:p>
-            <w:r>
-              <w:t>behavioral_mimicry</w:t>
-            </w:r>
-          </w:p>
-        </w:tc>
-      </w:tr>
-      <w:tr>
-        <w:tc>
-          <w:tcPr>
-            <w:tcW w:type="dxa" w:w="1234"/>
-          </w:tcPr>
-          <w:p>
-            <w:r>
-              <w:t>GEN-015</w:t>
-            </w:r>
-          </w:p>
-        </w:tc>
-        <w:tc>
-          <w:tcPr>
-            <w:tcW w:type="dxa" w:w="1234"/>
-          </w:tcPr>
-          <w:p>
-            <w:r>
-              <w:t>B</w:t>
-            </w:r>
-          </w:p>
-        </w:tc>
-        <w:tc>
-          <w:tcPr>
-            <w:tcW w:type="dxa" w:w="1234"/>
-          </w:tcPr>
-          <w:p>
-            <w:r>
-              <w:t>Fake NPCI support chatbot</w:t>
-            </w:r>
-          </w:p>
-        </w:tc>
-        <w:tc>
-          <w:tcPr>
-            <w:tcW w:type="dxa" w:w="1234"/>
-          </w:tcPr>
-          <w:p>
-            <w:r>
-              <w:t>upi</w:t>
-            </w:r>
-          </w:p>
-        </w:tc>
-        <w:tc>
-          <w:tcPr>
-            <w:tcW w:type="dxa" w:w="1234"/>
-          </w:tcPr>
-          <w:p>
-            <w:r>
-              <w:t>customer_support</w:t>
-            </w:r>
-          </w:p>
-        </w:tc>
-        <w:tc>
-          <w:tcPr>
-            <w:tcW w:type="dxa" w:w="1234"/>
-          </w:tcPr>
-          <w:p>
-            <w:r>
-              <w:t>text_generation, agent_orchest</w:t>
-            </w:r>
-          </w:p>
-        </w:tc>
-        <w:tc>
-          <w:tcPr>
-            <w:tcW w:type="dxa" w:w="1234"/>
-          </w:tcPr>
-          <w:p>
-            <w:r>
-              <w:t>personalized_smishing</w:t>
-            </w:r>
-          </w:p>
-        </w:tc>
-      </w:tr>
-      <w:tr>
-        <w:tc>
-          <w:tcPr>
-            <w:tcW w:type="dxa" w:w="1234"/>
-          </w:tcPr>
-          <w:p>
-            <w:r>
-              <w:t>GEN-016</w:t>
-            </w:r>
-          </w:p>
-        </w:tc>
-        <w:tc>
-          <w:tcPr>
-            <w:tcW w:type="dxa" w:w="1234"/>
-          </w:tcPr>
-          <w:p>
-            <w:r>
-              <w:t>B</w:t>
-            </w:r>
-          </w:p>
-        </w:tc>
-        <w:tc>
-          <w:tcPr>
-            <w:tcW w:type="dxa" w:w="1234"/>
-          </w:tcPr>
-          <w:p>
-            <w:r>
-              <w:t>Merchant onboarding bust-out</w:t>
-            </w:r>
-          </w:p>
-        </w:tc>
-        <w:tc>
-          <w:tcPr>
-            <w:tcW w:type="dxa" w:w="1234"/>
-          </w:tcPr>
-          <w:p>
-            <w:r>
-              <w:t>card</w:t>
-            </w:r>
-          </w:p>
-        </w:tc>
-        <w:tc>
-          <w:tcPr>
-            <w:tcW w:type="dxa" w:w="1234"/>
-          </w:tcPr>
-          <w:p>
-            <w:r>
-              <w:t>onboarding_kyc</w:t>
-            </w:r>
-          </w:p>
-        </w:tc>
-        <w:tc>
-          <w:tcPr>
-            <w:tcW w:type="dxa" w:w="1234"/>
-          </w:tcPr>
-          <w:p>
-            <w:r>
-              <w:t>document_forgery, image_genera</w:t>
-            </w:r>
-          </w:p>
-        </w:tc>
-        <w:tc>
-          <w:tcPr>
-            <w:tcW w:type="dxa" w:w="1234"/>
-          </w:tcPr>
-          <w:p>
-            <w:r>
-              <w:t>synthetic_kyc</w:t>
-            </w:r>
-          </w:p>
-        </w:tc>
-      </w:tr>
-      <w:tr>
-        <w:tc>
-          <w:tcPr>
-            <w:tcW w:type="dxa" w:w="1234"/>
-          </w:tcPr>
-          <w:p>
-            <w:r>
-              <w:t>GEN-017</w:t>
-            </w:r>
-          </w:p>
-        </w:tc>
-        <w:tc>
-          <w:tcPr>
-            <w:tcW w:type="dxa" w:w="1234"/>
-          </w:tcPr>
-          <w:p>
-            <w:r>
-              <w:t>B</w:t>
-            </w:r>
-          </w:p>
-        </w:tc>
-        <w:tc>
-          <w:tcPr>
-            <w:tcW w:type="dxa" w:w="1234"/>
-          </w:tcPr>
-          <w:p>
-            <w:r>
-              <w:t>Card CNP velocity testing burst</w:t>
-            </w:r>
-          </w:p>
-        </w:tc>
-        <w:tc>
-          <w:tcPr>
-            <w:tcW w:type="dxa" w:w="1234"/>
-          </w:tcPr>
-          <w:p>
-            <w:r>
-              <w:t>card</w:t>
-            </w:r>
-          </w:p>
-        </w:tc>
-        <w:tc>
-          <w:tcPr>
-            <w:tcW w:type="dxa" w:w="1234"/>
-          </w:tcPr>
-          <w:p>
-            <w:r>
-              <w:t>behavioral</w:t>
-            </w:r>
-          </w:p>
-        </w:tc>
-        <w:tc>
-          <w:tcPr>
-            <w:tcW w:type="dxa" w:w="1234"/>
-          </w:tcPr>
-          <w:p>
-            <w:r>
-              <w:t>text_generation</w:t>
-            </w:r>
-          </w:p>
-        </w:tc>
-        <w:tc>
-          <w:tcPr>
-            <w:tcW w:type="dxa" w:w="1234"/>
-          </w:tcPr>
-          <w:p>
-            <w:r>
-              <w:t>personalized_smishing</w:t>
-            </w:r>
-          </w:p>
-        </w:tc>
-      </w:tr>
-      <w:tr>
-        <w:tc>
-          <w:tcPr>
-            <w:tcW w:type="dxa" w:w="1234"/>
-          </w:tcPr>
-          <w:p>
-            <w:r>
-              <w:t>GEN-018</w:t>
-            </w:r>
-          </w:p>
-        </w:tc>
-        <w:tc>
-          <w:tcPr>
-            <w:tcW w:type="dxa" w:w="1234"/>
-          </w:tcPr>
-          <w:p>
-            <w:r>
-              <w:t>B</w:t>
-            </w:r>
-          </w:p>
-        </w:tc>
-        <w:tc>
-          <w:tcPr>
-            <w:tcW w:type="dxa" w:w="1234"/>
-          </w:tcPr>
-          <w:p>
-            <w:r>
-              <w:t>Agentic checkout gift-card drain</w:t>
-            </w:r>
-          </w:p>
-        </w:tc>
-        <w:tc>
-          <w:tcPr>
-            <w:tcW w:type="dxa" w:w="1234"/>
-          </w:tcPr>
-          <w:p>
-            <w:r>
-              <w:t>card</w:t>
-            </w:r>
-          </w:p>
-        </w:tc>
-        <w:tc>
-          <w:tcPr>
-            <w:tcW w:type="dxa" w:w="1234"/>
-          </w:tcPr>
-          <w:p>
-            <w:r>
-              <w:t>agentic_checkout</w:t>
-            </w:r>
-          </w:p>
-        </w:tc>
-        <w:tc>
-          <w:tcPr>
-            <w:tcW w:type="dxa" w:w="1234"/>
-          </w:tcPr>
-          <w:p>
-            <w:r>
-              <w:t>agent_orchestration, text_gene</w:t>
-            </w:r>
-          </w:p>
-        </w:tc>
-        <w:tc>
-          <w:tcPr>
-            <w:tcW w:type="dxa" w:w="1234"/>
-          </w:tcPr>
-          <w:p>
-            <w:r>
-              <w:t>agent_prompt_injection</w:t>
-            </w:r>
-          </w:p>
-        </w:tc>
-      </w:tr>
-      <w:tr>
-        <w:tc>
-          <w:tcPr>
-            <w:tcW w:type="dxa" w:w="1234"/>
-          </w:tcPr>
-          <w:p>
-            <w:r>
-              <w:t>GEN-019</w:t>
-            </w:r>
-          </w:p>
-        </w:tc>
-        <w:tc>
-          <w:tcPr>
-            <w:tcW w:type="dxa" w:w="1234"/>
-          </w:tcPr>
-          <w:p>
-            <w:r>
-              <w:t>B</w:t>
-            </w:r>
-          </w:p>
-        </w:tc>
-        <w:tc>
-          <w:tcPr>
-            <w:tcW w:type="dxa" w:w="1234"/>
-          </w:tcPr>
-          <w:p>
-            <w:r>
-              <w:t>Deepfake video KYC liveness bypass</w:t>
-            </w:r>
-          </w:p>
-        </w:tc>
-        <w:tc>
-          <w:tcPr>
-            <w:tcW w:type="dxa" w:w="1234"/>
-          </w:tcPr>
-          <w:p>
-            <w:r>
-              <w:t>wallet, upi</w:t>
-            </w:r>
-          </w:p>
-        </w:tc>
-        <w:tc>
-          <w:tcPr>
-            <w:tcW w:type="dxa" w:w="1234"/>
-          </w:tcPr>
-          <w:p>
-            <w:r>
-              <w:t>onboarding_kyc</w:t>
-            </w:r>
-          </w:p>
-        </w:tc>
-        <w:tc>
-          <w:tcPr>
-            <w:tcW w:type="dxa" w:w="1234"/>
-          </w:tcPr>
-          <w:p>
-            <w:r>
-              <w:t>deepfake_video, document_forge</w:t>
-            </w:r>
-          </w:p>
-        </w:tc>
-        <w:tc>
-          <w:tcPr>
-            <w:tcW w:type="dxa" w:w="1234"/>
-          </w:tcPr>
-          <w:p>
-            <w:r>
-              <w:t>synthetic_kyc</w:t>
-            </w:r>
-          </w:p>
-        </w:tc>
-      </w:tr>
-      <w:tr>
-        <w:tc>
-          <w:tcPr>
-            <w:tcW w:type="dxa" w:w="1234"/>
-          </w:tcPr>
-          <w:p>
-            <w:r>
-              <w:t>GEN-020</w:t>
-            </w:r>
-          </w:p>
-        </w:tc>
-        <w:tc>
-          <w:tcPr>
-            <w:tcW w:type="dxa" w:w="1234"/>
-          </w:tcPr>
-          <w:p>
-            <w:r>
-              <w:t>B</w:t>
-            </w:r>
-          </w:p>
-        </w:tc>
-        <w:tc>
-          <w:tcPr>
-            <w:tcW w:type="dxa" w:w="1234"/>
-          </w:tcPr>
-          <w:p>
-            <w:r>
-              <w:t>AI-forged PAN/Aadhaar document pack</w:t>
-            </w:r>
-          </w:p>
-        </w:tc>
-        <w:tc>
-          <w:tcPr>
-            <w:tcW w:type="dxa" w:w="1234"/>
-          </w:tcPr>
-          <w:p>
-            <w:r>
-              <w:t>upi, wallet</w:t>
-            </w:r>
-          </w:p>
-        </w:tc>
-        <w:tc>
-          <w:tcPr>
-            <w:tcW w:type="dxa" w:w="1234"/>
-          </w:tcPr>
-          <w:p>
-            <w:r>
-              <w:t>onboarding_kyc</w:t>
-            </w:r>
-          </w:p>
-        </w:tc>
-        <w:tc>
-          <w:tcPr>
-            <w:tcW w:type="dxa" w:w="1234"/>
-          </w:tcPr>
-          <w:p>
-            <w:r>
-              <w:t>document_forgery, image_genera</w:t>
-            </w:r>
-          </w:p>
-        </w:tc>
-        <w:tc>
-          <w:tcPr>
-            <w:tcW w:type="dxa" w:w="1234"/>
-          </w:tcPr>
-          <w:p>
-            <w:r>
-              <w:t>synthetic_kyc</w:t>
-            </w:r>
-          </w:p>
-        </w:tc>
-      </w:tr>
-      <w:tr>
-        <w:tc>
-          <w:tcPr>
-            <w:tcW w:type="dxa" w:w="1234"/>
-          </w:tcPr>
-          <w:p>
-            <w:r>
-              <w:t>GEN-021</w:t>
-            </w:r>
-          </w:p>
-        </w:tc>
-        <w:tc>
-          <w:tcPr>
-            <w:tcW w:type="dxa" w:w="1234"/>
-          </w:tcPr>
-          <w:p>
-            <w:r>
-              <w:t>B</w:t>
-            </w:r>
-          </w:p>
-        </w:tc>
-        <w:tc>
-          <w:tcPr>
-            <w:tcW w:type="dxa" w:w="1234"/>
-          </w:tcPr>
-          <w:p>
-            <w:r>
-              <w:t>Late-night IMPS salary diversion</w:t>
-            </w:r>
-          </w:p>
-        </w:tc>
-        <w:tc>
-          <w:tcPr>
-            <w:tcW w:type="dxa" w:w="1234"/>
-          </w:tcPr>
-          <w:p>
-            <w:r>
-              <w:t>wire</w:t>
-            </w:r>
-          </w:p>
-        </w:tc>
-        <w:tc>
-          <w:tcPr>
-            <w:tcW w:type="dxa" w:w="1234"/>
-          </w:tcPr>
-          <w:p>
-            <w:r>
-              <w:t>infrastructure</w:t>
-            </w:r>
-          </w:p>
-        </w:tc>
-        <w:tc>
-          <w:tcPr>
-            <w:tcW w:type="dxa" w:w="1234"/>
-          </w:tcPr>
-          <w:p>
-            <w:r>
-              <w:t>text_generation</w:t>
-            </w:r>
-          </w:p>
-        </w:tc>
-        <w:tc>
-          <w:tcPr>
-            <w:tcW w:type="dxa" w:w="1234"/>
-          </w:tcPr>
-          <w:p>
-            <w:r>
-              <w:t>cfo_bec_wire</w:t>
-            </w:r>
-          </w:p>
-        </w:tc>
-      </w:tr>
-      <w:tr>
-        <w:tc>
-          <w:tcPr>
-            <w:tcW w:type="dxa" w:w="1234"/>
-          </w:tcPr>
-          <w:p>
-            <w:r>
-              <w:t>GEN-022</w:t>
-            </w:r>
-          </w:p>
-        </w:tc>
-        <w:tc>
-          <w:tcPr>
-            <w:tcW w:type="dxa" w:w="1234"/>
-          </w:tcPr>
-          <w:p>
-            <w:r>
-              <w:t>B</w:t>
-            </w:r>
-          </w:p>
-        </w:tc>
-        <w:tc>
-          <w:tcPr>
-            <w:tcW w:type="dxa" w:w="1234"/>
-          </w:tcPr>
-          <w:p>
-            <w:r>
-              <w:t>WhatsApp voice-note relative scam</w:t>
-            </w:r>
-          </w:p>
-        </w:tc>
-        <w:tc>
-          <w:tcPr>
-            <w:tcW w:type="dxa" w:w="1234"/>
-          </w:tcPr>
-          <w:p>
-            <w:r>
-              <w:t>upi</w:t>
-            </w:r>
-          </w:p>
-        </w:tc>
-        <w:tc>
-          <w:tcPr>
-            <w:tcW w:type="dxa" w:w="1234"/>
-          </w:tcPr>
-          <w:p>
-            <w:r>
-              <w:t>social_engineering</w:t>
-            </w:r>
-          </w:p>
-        </w:tc>
-        <w:tc>
-          <w:tcPr>
-            <w:tcW w:type="dxa" w:w="1234"/>
-          </w:tcPr>
-          <w:p>
-            <w:r>
-              <w:t>voice_clone, text_generation</w:t>
-            </w:r>
-          </w:p>
-        </w:tc>
-        <w:tc>
-          <w:tcPr>
-            <w:tcW w:type="dxa" w:w="1234"/>
-          </w:tcPr>
-          <w:p>
-            <w:r>
-              <w:t>voice_relative_upi</w:t>
-            </w:r>
-          </w:p>
-        </w:tc>
-      </w:tr>
-      <w:tr>
-        <w:tc>
-          <w:tcPr>
-            <w:tcW w:type="dxa" w:w="1234"/>
-          </w:tcPr>
-          <w:p>
-            <w:r>
-              <w:t>GEN-023</w:t>
-            </w:r>
-          </w:p>
-        </w:tc>
-        <w:tc>
-          <w:tcPr>
-            <w:tcW w:type="dxa" w:w="1234"/>
-          </w:tcPr>
-          <w:p>
-            <w:r>
-              <w:t>B</w:t>
-            </w:r>
-          </w:p>
-        </w:tc>
-        <w:tc>
-          <w:tcPr>
-            <w:tcW w:type="dxa" w:w="1234"/>
-          </w:tcPr>
-          <w:p>
-            <w:r>
-              <w:t>RuPay card testing funnel</w:t>
-            </w:r>
-          </w:p>
-        </w:tc>
-        <w:tc>
-          <w:tcPr>
-            <w:tcW w:type="dxa" w:w="1234"/>
-          </w:tcPr>
-          <w:p>
-            <w:r>
-              <w:t>card</w:t>
-            </w:r>
-          </w:p>
-        </w:tc>
-        <w:tc>
-          <w:tcPr>
-            <w:tcW w:type="dxa" w:w="1234"/>
-          </w:tcPr>
-          <w:p>
-            <w:r>
-              <w:t>social_engineering</w:t>
-            </w:r>
-          </w:p>
-        </w:tc>
-        <w:tc>
-          <w:tcPr>
-            <w:tcW w:type="dxa" w:w="1234"/>
-          </w:tcPr>
-          <w:p>
-            <w:r>
-              <w:t>text_generation</w:t>
-            </w:r>
-          </w:p>
-        </w:tc>
-        <w:tc>
-          <w:tcPr>
-            <w:tcW w:type="dxa" w:w="1234"/>
-          </w:tcPr>
-          <w:p>
-            <w:r>
-              <w:t>personalized_smishing</w:t>
-            </w:r>
-          </w:p>
-        </w:tc>
-      </w:tr>
-      <w:tr>
-        <w:tc>
-          <w:tcPr>
-            <w:tcW w:type="dxa" w:w="1234"/>
-          </w:tcPr>
-          <w:p>
-            <w:r>
-              <w:t>GEN-024</w:t>
-            </w:r>
-          </w:p>
-        </w:tc>
-        <w:tc>
-          <w:tcPr>
-            <w:tcW w:type="dxa" w:w="1234"/>
-          </w:tcPr>
-          <w:p>
-            <w:r>
-              <w:t>B</w:t>
-            </w:r>
-          </w:p>
-        </w:tc>
-        <w:tc>
-          <w:tcPr>
-            <w:tcW w:type="dxa" w:w="1234"/>
-          </w:tcPr>
-          <w:p>
-            <w:r>
-              <w:t>Fake ecommerce COD refund QR</w:t>
-            </w:r>
-          </w:p>
-        </w:tc>
-        <w:tc>
-          <w:tcPr>
-            <w:tcW w:type="dxa" w:w="1234"/>
-          </w:tcPr>
-          <w:p>
-            <w:r>
-              <w:t>upi</w:t>
-            </w:r>
-          </w:p>
-        </w:tc>
-        <w:tc>
-          <w:tcPr>
-            <w:tcW w:type="dxa" w:w="1234"/>
-          </w:tcPr>
-          <w:p>
-            <w:r>
-              <w:t>social_engineering</w:t>
-            </w:r>
-          </w:p>
-        </w:tc>
-        <w:tc>
-          <w:tcPr>
-            <w:tcW w:type="dxa" w:w="1234"/>
-          </w:tcPr>
-          <w:p>
-            <w:r>
-              <w:t>image_generation, text_generat</w:t>
-            </w:r>
-          </w:p>
-        </w:tc>
-        <w:tc>
-          <w:tcPr>
-            <w:tcW w:type="dxa" w:w="1234"/>
-          </w:tcPr>
-          <w:p>
-            <w:r>
-              <w:t>qr_collect_swap</w:t>
-            </w:r>
-          </w:p>
-        </w:tc>
-      </w:tr>
-      <w:tr>
-        <w:tc>
-          <w:tcPr>
-            <w:tcW w:type="dxa" w:w="1234"/>
-          </w:tcPr>
-          <w:p>
-            <w:r>
-              <w:t>GEN-025</w:t>
-            </w:r>
-          </w:p>
-        </w:tc>
-        <w:tc>
-          <w:tcPr>
-            <w:tcW w:type="dxa" w:w="1234"/>
-          </w:tcPr>
-          <w:p>
-            <w:r>
-              <w:t>B</w:t>
-            </w:r>
-          </w:p>
-        </w:tc>
-        <w:tc>
-          <w:tcPr>
-            <w:tcW w:type="dxa" w:w="1234"/>
-          </w:tcPr>
-          <w:p>
-            <w:r>
-              <w:t>Crypto off-ramp mule chain</w:t>
-            </w:r>
-          </w:p>
-        </w:tc>
-        <w:tc>
-          <w:tcPr>
-            <w:tcW w:type="dxa" w:w="1234"/>
-          </w:tcPr>
-          <w:p>
-            <w:r>
-              <w:t>wallet, wire</w:t>
-            </w:r>
-          </w:p>
-        </w:tc>
-        <w:tc>
-          <w:tcPr>
-            <w:tcW w:type="dxa" w:w="1234"/>
-          </w:tcPr>
-          <w:p>
-            <w:r>
-              <w:t>infrastructure</w:t>
-            </w:r>
-          </w:p>
-        </w:tc>
-        <w:tc>
-          <w:tcPr>
-            <w:tcW w:type="dxa" w:w="1234"/>
-          </w:tcPr>
-          <w:p>
-            <w:r>
-              <w:t>agent_orchestration, text_gene</w:t>
-            </w:r>
-          </w:p>
-        </w:tc>
-        <w:tc>
-          <w:tcPr>
-            <w:tcW w:type="dxa" w:w="1234"/>
-          </w:tcPr>
-          <w:p>
-            <w:r>
-              <w:t>mule_recruitment</w:t>
-            </w:r>
-          </w:p>
-        </w:tc>
-      </w:tr>
-      <w:tr>
-        <w:tc>
-          <w:tcPr>
-            <w:tcW w:type="dxa" w:w="1234"/>
-          </w:tcPr>
-          <w:p>
-            <w:r>
-              <w:t>GEN-026</w:t>
-            </w:r>
-          </w:p>
-        </w:tc>
-        <w:tc>
-          <w:tcPr>
-            <w:tcW w:type="dxa" w:w="1234"/>
-          </w:tcPr>
-          <w:p>
-            <w:r>
-              <w:t>B</w:t>
-            </w:r>
-          </w:p>
-        </w:tc>
-        <w:tc>
-          <w:tcPr>
-            <w:tcW w:type="dxa" w:w="1234"/>
-          </w:tcPr>
-          <w:p>
-            <w:r>
-              <w:t>Aadhaar OTP intercept smishing</w:t>
-            </w:r>
-          </w:p>
-        </w:tc>
-        <w:tc>
-          <w:tcPr>
-            <w:tcW w:type="dxa" w:w="1234"/>
-          </w:tcPr>
-          <w:p>
-            <w:r>
-              <w:t>upi</w:t>
-            </w:r>
-          </w:p>
-        </w:tc>
-        <w:tc>
-          <w:tcPr>
-            <w:tcW w:type="dxa" w:w="1234"/>
-          </w:tcPr>
-          <w:p>
-            <w:r>
-              <w:t>onboarding_kyc</w:t>
-            </w:r>
-          </w:p>
-        </w:tc>
-        <w:tc>
-          <w:tcPr>
-            <w:tcW w:type="dxa" w:w="1234"/>
-          </w:tcPr>
-          <w:p>
-            <w:r>
-              <w:t>text_generation</w:t>
-            </w:r>
-          </w:p>
-        </w:tc>
-        <w:tc>
-          <w:tcPr>
-            <w:tcW w:type="dxa" w:w="1234"/>
-          </w:tcPr>
-          <w:p>
-            <w:r>
-              <w:t>personalized_smishing</w:t>
-            </w:r>
-          </w:p>
-        </w:tc>
-      </w:tr>
-      <w:tr>
-        <w:tc>
-          <w:tcPr>
-            <w:tcW w:type="dxa" w:w="1234"/>
-          </w:tcPr>
-          <w:p>
-            <w:r>
-              <w:t>GEN-027</w:t>
-            </w:r>
-          </w:p>
-        </w:tc>
-        <w:tc>
-          <w:tcPr>
-            <w:tcW w:type="dxa" w:w="1234"/>
-          </w:tcPr>
-          <w:p>
-            <w:r>
-              <w:t>B</w:t>
-            </w:r>
-          </w:p>
-        </w:tc>
-        <w:tc>
-          <w:tcPr>
-            <w:tcW w:type="dxa" w:w="1234"/>
-          </w:tcPr>
-          <w:p>
-            <w:r>
-              <w:t>Vendor impersonation BEC wire</w:t>
-            </w:r>
-          </w:p>
-        </w:tc>
-        <w:tc>
-          <w:tcPr>
-            <w:tcW w:type="dxa" w:w="1234"/>
-          </w:tcPr>
-          <w:p>
-            <w:r>
-              <w:t>wire</w:t>
-            </w:r>
-          </w:p>
-        </w:tc>
-        <w:tc>
-          <w:tcPr>
-            <w:tcW w:type="dxa" w:w="1234"/>
-          </w:tcPr>
-          <w:p>
-            <w:r>
-              <w:t>social_engineering</w:t>
-            </w:r>
-          </w:p>
-        </w:tc>
-        <w:tc>
-          <w:tcPr>
-            <w:tcW w:type="dxa" w:w="1234"/>
-          </w:tcPr>
-          <w:p>
-            <w:r>
-              <w:t>text_generation, document_forg</w:t>
-            </w:r>
-          </w:p>
-        </w:tc>
-        <w:tc>
-          <w:tcPr>
-            <w:tcW w:type="dxa" w:w="1234"/>
-          </w:tcPr>
-          <w:p>
-            <w:r>
-              <w:t>cfo_bec_wire</w:t>
-            </w:r>
-          </w:p>
-        </w:tc>
-      </w:tr>
-      <w:tr>
-        <w:tc>
-          <w:tcPr>
-            <w:tcW w:type="dxa" w:w="1234"/>
-          </w:tcPr>
-          <w:p>
-            <w:r>
-              <w:t>GEN-028</w:t>
-            </w:r>
-          </w:p>
-        </w:tc>
-        <w:tc>
-          <w:tcPr>
-            <w:tcW w:type="dxa" w:w="1234"/>
-          </w:tcPr>
-          <w:p>
-            <w:r>
-              <w:t>B</w:t>
-            </w:r>
-          </w:p>
-        </w:tc>
-        <w:tc>
-          <w:tcPr>
-            <w:tcW w:type="dxa" w:w="1234"/>
-          </w:tcPr>
-          <w:p>
-            <w:r>
-              <w:t>Slow-drip salary account mimicry</w:t>
-            </w:r>
-          </w:p>
-        </w:tc>
-        <w:tc>
-          <w:tcPr>
-            <w:tcW w:type="dxa" w:w="1234"/>
-          </w:tcPr>
-          <w:p>
-            <w:r>
-              <w:t>card, wallet</w:t>
-            </w:r>
-          </w:p>
-        </w:tc>
-        <w:tc>
-          <w:tcPr>
-            <w:tcW w:type="dxa" w:w="1234"/>
-          </w:tcPr>
-          <w:p>
-            <w:r>
-              <w:t>behavioral</w:t>
-            </w:r>
-          </w:p>
-        </w:tc>
-        <w:tc>
-          <w:tcPr>
-            <w:tcW w:type="dxa" w:w="1234"/>
-          </w:tcPr>
-          <w:p>
-            <w:r>
-              <w:t>text_generation</w:t>
-            </w:r>
-          </w:p>
-        </w:tc>
-        <w:tc>
-          <w:tcPr>
-            <w:tcW w:type="dxa" w:w="1234"/>
-          </w:tcPr>
-          <w:p>
-            <w:r>
-              <w:t>behavioral_mimicry</w:t>
-            </w:r>
-          </w:p>
-        </w:tc>
-      </w:tr>
-      <w:tr>
-        <w:tc>
-          <w:tcPr>
-            <w:tcW w:type="dxa" w:w="1234"/>
-          </w:tcPr>
-          <w:p>
-            <w:r>
-              <w:t>GEN-029</w:t>
-            </w:r>
-          </w:p>
-        </w:tc>
-        <w:tc>
-          <w:tcPr>
-            <w:tcW w:type="dxa" w:w="1234"/>
-          </w:tcPr>
-          <w:p>
-            <w:r>
-              <w:t>B</w:t>
-            </w:r>
-          </w:p>
-        </w:tc>
-        <w:tc>
-          <w:tcPr>
-            <w:tcW w:type="dxa" w:w="1234"/>
-          </w:tcPr>
-          <w:p>
-            <w:r>
-              <w:t>Festival sale agentic gift drain</w:t>
-            </w:r>
-          </w:p>
-        </w:tc>
-        <w:tc>
-          <w:tcPr>
-            <w:tcW w:type="dxa" w:w="1234"/>
-          </w:tcPr>
-          <w:p>
-            <w:r>
-              <w:t>card</w:t>
-            </w:r>
-          </w:p>
-        </w:tc>
-        <w:tc>
-          <w:tcPr>
-            <w:tcW w:type="dxa" w:w="1234"/>
-          </w:tcPr>
-          <w:p>
-            <w:r>
-              <w:t>agentic_checkout</w:t>
-            </w:r>
-          </w:p>
-        </w:tc>
-        <w:tc>
-          <w:tcPr>
-            <w:tcW w:type="dxa" w:w="1234"/>
-          </w:tcPr>
-          <w:p>
-            <w:r>
-              <w:t>agent_orchestration, image_gen</w:t>
-            </w:r>
-          </w:p>
-        </w:tc>
-        <w:tc>
-          <w:tcPr>
-            <w:tcW w:type="dxa" w:w="1234"/>
-          </w:tcPr>
-          <w:p>
-            <w:r>
-              <w:t>agent_prompt_injection</w:t>
-            </w:r>
-          </w:p>
-        </w:tc>
-      </w:tr>
-      <w:tr>
-        <w:tc>
-          <w:tcPr>
-            <w:tcW w:type="dxa" w:w="1234"/>
-          </w:tcPr>
-          <w:p>
-            <w:r>
-              <w:t>GEN-030</w:t>
-            </w:r>
-          </w:p>
-        </w:tc>
-        <w:tc>
-          <w:tcPr>
-            <w:tcW w:type="dxa" w:w="1234"/>
-          </w:tcPr>
-          <w:p>
-            <w:r>
-              <w:t>B</w:t>
-            </w:r>
-          </w:p>
-        </w:tc>
-        <w:tc>
-          <w:tcPr>
-            <w:tcW w:type="dxa" w:w="1234"/>
-          </w:tcPr>
-          <w:p>
-            <w:r>
-              <w:t>CBI impersonation video call</w:t>
-            </w:r>
-          </w:p>
-        </w:tc>
-        <w:tc>
-          <w:tcPr>
-            <w:tcW w:type="dxa" w:w="1234"/>
-          </w:tcPr>
-          <w:p>
-            <w:r>
-              <w:t>upi, wire</w:t>
-            </w:r>
-          </w:p>
-        </w:tc>
-        <w:tc>
-          <w:tcPr>
-            <w:tcW w:type="dxa" w:w="1234"/>
-          </w:tcPr>
-          <w:p>
-            <w:r>
-              <w:t>social_engineering</w:t>
-            </w:r>
-          </w:p>
-        </w:tc>
-        <w:tc>
-          <w:tcPr>
-            <w:tcW w:type="dxa" w:w="1234"/>
-          </w:tcPr>
-          <w:p>
-            <w:r>
-              <w:t>deepfake_video, voice_clone, t</w:t>
-            </w:r>
-          </w:p>
-        </w:tc>
-        <w:tc>
-          <w:tcPr>
-            <w:tcW w:type="dxa" w:w="1234"/>
-          </w:tcPr>
-          <w:p>
-            <w:r>
-              <w:t>digital_arrest</w:t>
-            </w:r>
-          </w:p>
-        </w:tc>
-      </w:tr>
-      <w:tr>
-        <w:tc>
-          <w:tcPr>
-            <w:tcW w:type="dxa" w:w="1234"/>
-          </w:tcPr>
-          <w:p>
-            <w:r>
-              <w:t>GEN-031</w:t>
-            </w:r>
-          </w:p>
-        </w:tc>
-        <w:tc>
-          <w:tcPr>
-            <w:tcW w:type="dxa" w:w="1234"/>
-          </w:tcPr>
-          <w:p>
-            <w:r>
-              <w:t>B</w:t>
-            </w:r>
-          </w:p>
-        </w:tc>
-        <w:tc>
-          <w:tcPr>
-            <w:tcW w:type="dxa" w:w="1234"/>
-          </w:tcPr>
-          <w:p>
-            <w:r>
-              <w:t>Wallet-to-bank layering ring</w:t>
-            </w:r>
-          </w:p>
-        </w:tc>
-        <w:tc>
-          <w:tcPr>
-            <w:tcW w:type="dxa" w:w="1234"/>
-          </w:tcPr>
-          <w:p>
-            <w:r>
-              <w:t>wallet, wire</w:t>
-            </w:r>
-          </w:p>
-        </w:tc>
-        <w:tc>
-          <w:tcPr>
-            <w:tcW w:type="dxa" w:w="1234"/>
-          </w:tcPr>
-          <w:p>
-            <w:r>
-              <w:t>infrastructure</w:t>
-            </w:r>
-          </w:p>
-        </w:tc>
-        <w:tc>
-          <w:tcPr>
-            <w:tcW w:type="dxa" w:w="1234"/>
-          </w:tcPr>
-          <w:p>
-            <w:r>
-              <w:t>agent_orchestration</w:t>
-            </w:r>
-          </w:p>
-        </w:tc>
-        <w:tc>
-          <w:tcPr>
-            <w:tcW w:type="dxa" w:w="1234"/>
-          </w:tcPr>
-          <w:p>
-            <w:r>
-              <w:t>mule_recruitment</w:t>
-            </w:r>
-          </w:p>
-        </w:tc>
-      </w:tr>
-      <w:tr>
-        <w:tc>
-          <w:tcPr>
-            <w:tcW w:type="dxa" w:w="1234"/>
-          </w:tcPr>
-          <w:p>
-            <w:r>
-              <w:t>GEN-032</w:t>
-            </w:r>
-          </w:p>
-        </w:tc>
-        <w:tc>
-          <w:tcPr>
-            <w:tcW w:type="dxa" w:w="1234"/>
-          </w:tcPr>
-          <w:p>
-            <w:r>
-              <w:t>B</w:t>
-            </w:r>
-          </w:p>
-        </w:tc>
-        <w:tc>
-          <w:tcPr>
-            <w:tcW w:type="dxa" w:w="1234"/>
-          </w:tcPr>
-          <w:p>
-            <w:r>
-              <w:t>Card testing pre-bust-out</w:t>
-            </w:r>
-          </w:p>
-        </w:tc>
-        <w:tc>
-          <w:tcPr>
-            <w:tcW w:type="dxa" w:w="1234"/>
-          </w:tcPr>
-          <w:p>
-            <w:r>
-              <w:t>card</w:t>
-            </w:r>
-          </w:p>
-        </w:tc>
-        <w:tc>
-          <w:tcPr>
-            <w:tcW w:type="dxa" w:w="1234"/>
-          </w:tcPr>
-          <w:p>
-            <w:r>
-              <w:t>onboarding_kyc</w:t>
-            </w:r>
-          </w:p>
-        </w:tc>
-        <w:tc>
-          <w:tcPr>
-            <w:tcW w:type="dxa" w:w="1234"/>
-          </w:tcPr>
-          <w:p>
-            <w:r>
-              <w:t>document_forgery, text_generat</w:t>
-            </w:r>
-          </w:p>
-        </w:tc>
-        <w:tc>
-          <w:tcPr>
-            <w:tcW w:type="dxa" w:w="1234"/>
-          </w:tcPr>
-          <w:p>
-            <w:r>
-              <w:t>synthetic_kyc</w:t>
-            </w:r>
-          </w:p>
-        </w:tc>
-      </w:tr>
-      <w:tr>
-        <w:tc>
-          <w:tcPr>
-            <w:tcW w:type="dxa" w:w="1234"/>
-          </w:tcPr>
-          <w:p>
-            <w:r>
-              <w:t>GEN-033</w:t>
-            </w:r>
-          </w:p>
-        </w:tc>
-        <w:tc>
-          <w:tcPr>
-            <w:tcW w:type="dxa" w:w="1234"/>
-          </w:tcPr>
-          <w:p>
-            <w:r>
-              <w:t>B</w:t>
-            </w:r>
-          </w:p>
-        </w:tc>
-        <w:tc>
-          <w:tcPr>
-            <w:tcW w:type="dxa" w:w="1234"/>
-          </w:tcPr>
-          <w:p>
-            <w:r>
-              <w:t>Tamil/Telugu regional smishing</w:t>
-            </w:r>
-          </w:p>
-        </w:tc>
-        <w:tc>
-          <w:tcPr>
-            <w:tcW w:type="dxa" w:w="1234"/>
-          </w:tcPr>
-          <w:p>
-            <w:r>
-              <w:t>card, upi</w:t>
-            </w:r>
-          </w:p>
-        </w:tc>
-        <w:tc>
-          <w:tcPr>
-            <w:tcW w:type="dxa" w:w="1234"/>
-          </w:tcPr>
-          <w:p>
-            <w:r>
-              <w:t>social_engineering</w:t>
-            </w:r>
-          </w:p>
-        </w:tc>
-        <w:tc>
-          <w:tcPr>
-            <w:tcW w:type="dxa" w:w="1234"/>
-          </w:tcPr>
-          <w:p>
-            <w:r>
-              <w:t>text_generation</w:t>
-            </w:r>
-          </w:p>
-        </w:tc>
-        <w:tc>
-          <w:tcPr>
-            <w:tcW w:type="dxa" w:w="1234"/>
-          </w:tcPr>
-          <w:p>
-            <w:r>
-              <w:t>personalized_smishing</w:t>
-            </w:r>
-          </w:p>
-        </w:tc>
-      </w:tr>
-      <w:tr>
-        <w:tc>
-          <w:tcPr>
-            <w:tcW w:type="dxa" w:w="1234"/>
-          </w:tcPr>
-          <w:p>
-            <w:r>
-              <w:t>GEN-034</w:t>
-            </w:r>
-          </w:p>
-        </w:tc>
-        <w:tc>
-          <w:tcPr>
-            <w:tcW w:type="dxa" w:w="1234"/>
-          </w:tcPr>
-          <w:p>
-            <w:r>
-              <w:t>B</w:t>
-            </w:r>
-          </w:p>
-        </w:tc>
-        <w:tc>
-          <w:tcPr>
-            <w:tcW w:type="dxa" w:w="1234"/>
-          </w:tcPr>
-          <w:p>
-            <w:r>
-              <w:t>Cross-border wire layering</w:t>
-            </w:r>
-          </w:p>
-        </w:tc>
-        <w:tc>
-          <w:tcPr>
-            <w:tcW w:type="dxa" w:w="1234"/>
-          </w:tcPr>
-          <w:p>
-            <w:r>
-              <w:t>wire</w:t>
-            </w:r>
-          </w:p>
-        </w:tc>
-        <w:tc>
-          <w:tcPr>
-            <w:tcW w:type="dxa" w:w="1234"/>
-          </w:tcPr>
-          <w:p>
-            <w:r>
-              <w:t>infrastructure</w:t>
-            </w:r>
-          </w:p>
-        </w:tc>
-        <w:tc>
-          <w:tcPr>
-            <w:tcW w:type="dxa" w:w="1234"/>
-          </w:tcPr>
-          <w:p>
-            <w:r>
-              <w:t>text_generation, document_forg</w:t>
-            </w:r>
-          </w:p>
-        </w:tc>
-        <w:tc>
-          <w:tcPr>
-            <w:tcW w:type="dxa" w:w="1234"/>
-          </w:tcPr>
-          <w:p>
-            <w:r>
-              <w:t>cfo_bec_wire</w:t>
-            </w:r>
-          </w:p>
-        </w:tc>
-      </w:tr>
-      <w:tr>
-        <w:tc>
-          <w:tcPr>
-            <w:tcW w:type="dxa" w:w="1234"/>
-          </w:tcPr>
-          <w:p>
-            <w:r>
-              <w:t>GEN-035</w:t>
-            </w:r>
-          </w:p>
-        </w:tc>
-        <w:tc>
-          <w:tcPr>
-            <w:tcW w:type="dxa" w:w="1234"/>
-          </w:tcPr>
-          <w:p>
-            <w:r>
-              <w:t>B</w:t>
-            </w:r>
-          </w:p>
-        </w:tc>
-        <w:tc>
-          <w:tcPr>
-            <w:tcW w:type="dxa" w:w="1234"/>
-          </w:tcPr>
-          <w:p>
-            <w:r>
-              <w:t>AI crypto pump group variant</w:t>
-            </w:r>
-          </w:p>
-        </w:tc>
-        <w:tc>
-          <w:tcPr>
-            <w:tcW w:type="dxa" w:w="1234"/>
-          </w:tcPr>
-          <w:p>
-            <w:r>
-              <w:t>upi, wallet</w:t>
-            </w:r>
-          </w:p>
-        </w:tc>
-        <w:tc>
-          <w:tcPr>
-            <w:tcW w:type="dxa" w:w="1234"/>
-          </w:tcPr>
-          <w:p>
-            <w:r>
-              <w:t>social_engineering</w:t>
-            </w:r>
-          </w:p>
-        </w:tc>
-        <w:tc>
-          <w:tcPr>
-            <w:tcW w:type="dxa" w:w="1234"/>
-          </w:tcPr>
-          <w:p>
-            <w:r>
-              <w:t>image_generation, deepfake_vid</w:t>
-            </w:r>
-          </w:p>
-        </w:tc>
-        <w:tc>
-          <w:tcPr>
-            <w:tcW w:type="dxa" w:w="1234"/>
-          </w:tcPr>
-          <w:p>
-            <w:r>
-              <w:t>investment_pump</w:t>
-            </w:r>
-          </w:p>
-        </w:tc>
-      </w:tr>
-      <w:tr>
-        <w:tc>
-          <w:tcPr>
-            <w:tcW w:type="dxa" w:w="1234"/>
-          </w:tcPr>
-          <w:p>
-            <w:r>
-              <w:t>GEN-036</w:t>
-            </w:r>
-          </w:p>
-        </w:tc>
-        <w:tc>
-          <w:tcPr>
-            <w:tcW w:type="dxa" w:w="1234"/>
-          </w:tcPr>
-          <w:p>
-            <w:r>
-              <w:t>A</w:t>
-            </w:r>
-          </w:p>
-        </w:tc>
-        <w:tc>
-          <w:tcPr>
-            <w:tcW w:type="dxa" w:w="1234"/>
-          </w:tcPr>
-          <w:p>
-            <w:r>
-              <w:t>NPCI support chatbot collect-request phi</w:t>
-            </w:r>
-          </w:p>
-        </w:tc>
-        <w:tc>
-          <w:tcPr>
-            <w:tcW w:type="dxa" w:w="1234"/>
-          </w:tcPr>
-          <w:p>
-            <w:r>
-              <w:t>upi</w:t>
-            </w:r>
-          </w:p>
-        </w:tc>
-        <w:tc>
-          <w:tcPr>
-            <w:tcW w:type="dxa" w:w="1234"/>
-          </w:tcPr>
-          <w:p>
-            <w:r>
-              <w:t>customer_support</w:t>
-            </w:r>
-          </w:p>
-        </w:tc>
-        <w:tc>
-          <w:tcPr>
-            <w:tcW w:type="dxa" w:w="1234"/>
-          </w:tcPr>
-          <w:p>
-            <w:r>
-              <w:t>text_generation, agent_orchest</w:t>
-            </w:r>
-          </w:p>
-        </w:tc>
-        <w:tc>
-          <w:tcPr>
-            <w:tcW w:type="dxa" w:w="1234"/>
-          </w:tcPr>
-          <w:p>
-            <w:r>
-              <w:t>npci_chatbot_phish</w:t>
-            </w:r>
-          </w:p>
-        </w:tc>
-      </w:tr>
-      <w:tr>
-        <w:tc>
-          <w:tcPr>
-            <w:tcW w:type="dxa" w:w="1234"/>
-          </w:tcPr>
-          <w:p>
-            <w:r>
-              <w:t>GEN-037</w:t>
-            </w:r>
-          </w:p>
-        </w:tc>
-        <w:tc>
-          <w:tcPr>
-            <w:tcW w:type="dxa" w:w="1234"/>
-          </w:tcPr>
-          <w:p>
-            <w:r>
-              <w:t>A</w:t>
-            </w:r>
-          </w:p>
-        </w:tc>
-        <w:tc>
-          <w:tcPr>
-            <w:tcW w:type="dxa" w:w="1234"/>
-          </w:tcPr>
-          <w:p>
-            <w:r>
-              <w:t>OTT subscription mandate micro-debit tra</w:t>
-            </w:r>
-          </w:p>
-        </w:tc>
-        <w:tc>
-          <w:tcPr>
-            <w:tcW w:type="dxa" w:w="1234"/>
-          </w:tcPr>
-          <w:p>
-            <w:r>
-              <w:t>upi</w:t>
-            </w:r>
-          </w:p>
-        </w:tc>
-        <w:tc>
-          <w:tcPr>
-            <w:tcW w:type="dxa" w:w="1234"/>
-          </w:tcPr>
-          <w:p>
-            <w:r>
-              <w:t>infrastructure</w:t>
-            </w:r>
-          </w:p>
-        </w:tc>
-        <w:tc>
-          <w:tcPr>
-            <w:tcW w:type="dxa" w:w="1234"/>
-          </w:tcPr>
-          <w:p>
-            <w:r>
-              <w:t>text_generation</w:t>
-            </w:r>
-          </w:p>
-        </w:tc>
-        <w:tc>
-          <w:tcPr>
-            <w:tcW w:type="dxa" w:w="1234"/>
-          </w:tcPr>
-          <w:p>
-            <w:r>
-              <w:t>subscription_mandate_trap</w:t>
-            </w:r>
-          </w:p>
-        </w:tc>
-      </w:tr>
-      <w:tr>
-        <w:tc>
-          <w:tcPr>
-            <w:tcW w:type="dxa" w:w="1234"/>
-          </w:tcPr>
-          <w:p>
-            <w:r>
-              <w:t>GEN-038</w:t>
-            </w:r>
-          </w:p>
-        </w:tc>
-        <w:tc>
-          <w:tcPr>
-            <w:tcW w:type="dxa" w:w="1234"/>
-          </w:tcPr>
-          <w:p>
-            <w:r>
-              <w:t>A</w:t>
-            </w:r>
-          </w:p>
-        </w:tc>
-        <w:tc>
-          <w:tcPr>
-            <w:tcW w:type="dxa" w:w="1234"/>
-          </w:tcPr>
-          <w:p>
-            <w:r>
-              <w:t>Coordinated mule graph fan-in ring</w:t>
-            </w:r>
-          </w:p>
-        </w:tc>
-        <w:tc>
-          <w:tcPr>
-            <w:tcW w:type="dxa" w:w="1234"/>
-          </w:tcPr>
-          <w:p>
-            <w:r>
-              <w:t>upi, wallet</w:t>
-            </w:r>
-          </w:p>
-        </w:tc>
-        <w:tc>
-          <w:tcPr>
-            <w:tcW w:type="dxa" w:w="1234"/>
-          </w:tcPr>
-          <w:p>
-            <w:r>
-              <w:t>infrastructure</w:t>
-            </w:r>
-          </w:p>
-        </w:tc>
-        <w:tc>
-          <w:tcPr>
-            <w:tcW w:type="dxa" w:w="1234"/>
-          </w:tcPr>
-          <w:p>
-            <w:r>
-              <w:t>agent_orchestration</w:t>
-            </w:r>
-          </w:p>
-        </w:tc>
-        <w:tc>
-          <w:tcPr>
-            <w:tcW w:type="dxa" w:w="1234"/>
-          </w:tcPr>
-          <w:p>
-            <w:r>
-              <w:t>mule_graph_ring</w:t>
+              <w:t>Hosted SOC UI; score API; no PII; Agent Pay token-abuse vectors</w:t>
             </w:r>
           </w:p>
         </w:tc>
@@ -2901,12 +196,12 @@
         <w:pStyle w:val="Heading1"/>
       </w:pPr>
       <w:r>
-        <w:t>4. Real-Data Grounding</w:t>
+        <w:t>3. Identify</w:t>
       </w:r>
     </w:p>
     <w:p>
       <w:r>
-        <w:t>Fitted from IEEE-CIS train_transaction.csv: 590,540 rows, median ticket $78.5601 USD, consumer target 6520.49 INR. Fidelity Judge scores KS distance vs real amount/hour marginals.</w:t>
+        <w:t>Do not treat 38 JSON files as 38 unique simulators. Tier A has dedicated playbooks (voice clone, digital arrest, BEC, KYC bust-out, smishing, QR swap, investment pump, agentic gift cards, mule recruitment, NPCI chatbot, mandate trap, mule graph ring). Scout may add GEN-S*** at runtime from FBI/NPCI/digital-arrest intel.</w:t>
       </w:r>
     </w:p>
     <w:p>
@@ -2914,22 +209,12 @@
         <w:pStyle w:val="Heading1"/>
       </w:pPr>
       <w:r>
-        <w:t>5. Kill-Chain Walkthrough — GEN-002 Digital Arrest</w:t>
+        <w:t>4. Generate &amp; fidelity</w:t>
       </w:r>
     </w:p>
     <w:p>
       <w:r>
-        <w:t>1. Forge generates deepfake video-call transcript artifact.</w:t>
-        <w:br/>
-        <w:t>2. Victim coerced into escalating UPI 'verification' transfers.</w:t>
-        <w:br/>
-        <w:t>3. Funds layer through mule VPAs (dst_fan_in signal).</w:t>
-        <w:br/>
-        <w:t>4. Sentinel flags via velocity + text fusion; SHAP-lite shows vel_1h, amt_z_user.</w:t>
-        <w:br/>
-        <w:t>5. Critic mutates: spread transfers over 6h to evade velocity windows.</w:t>
-        <w:br/>
-        <w:t>6. Evasion-pressure generations (frozen defender) show frozen AUC dip; retrain recovers.</w:t>
+        <w:t>Twin fitted on 590,540 IEEE-CIS rows. Judge compares attack INR amounts to TransactionAmt × fx assumption USD-&gt;INR = 83.0. Hour KS uses Vesta shape only (epoch unknown). Forge enriches one artifact per (genome, kind) when DeepSeek is on.</w:t>
       </w:r>
     </w:p>
     <w:p>
@@ -2937,7 +222,12 @@
         <w:pStyle w:val="Heading1"/>
       </w:pPr>
       <w:r>
-        <w:t>6. Detection Efficacy</w:t>
+        <w:t>5. Defend</w:t>
+      </w:r>
+    </w:p>
+    <w:p>
+      <w:r>
+        <w:t>Sentinel: HistGradientBoosting on velocity, z-score, fan-in, unique senders in 1h, new dests in 24h, plus TF-IDF on artifacts. Threshold maximizes F1 under FPR 0.5%. Gen 0 omits mule_graph_ring, subscription_mandate_trap, npci_chatbot_phish so a frozen defender faces a true held-out pattern. Conservative velocity/amount rules are the baseline — not Mastercard Decision Intelligence.</w:t>
       </w:r>
     </w:p>
     <w:tbl>
@@ -2947,18 +237,17 @@
         <w:tblLook w:firstColumn="1" w:firstRow="1" w:lastColumn="0" w:lastRow="0" w:noHBand="0" w:noVBand="1" w:val="04A0"/>
       </w:tblPr>
       <w:tblGrid>
-        <w:gridCol w:w="1234"/>
-        <w:gridCol w:w="1234"/>
-        <w:gridCol w:w="1234"/>
-        <w:gridCol w:w="1234"/>
-        <w:gridCol w:w="1234"/>
-        <w:gridCol w:w="1234"/>
-        <w:gridCol w:w="1234"/>
+        <w:gridCol w:w="1440"/>
+        <w:gridCol w:w="1440"/>
+        <w:gridCol w:w="1440"/>
+        <w:gridCol w:w="1440"/>
+        <w:gridCol w:w="1440"/>
+        <w:gridCol w:w="1440"/>
       </w:tblGrid>
       <w:tr>
         <w:tc>
           <w:tcPr>
-            <w:tcW w:type="dxa" w:w="1234"/>
+            <w:tcW w:type="dxa" w:w="1440"/>
           </w:tcPr>
           <w:p>
             <w:r>
@@ -2968,7 +257,7 @@
         </w:tc>
         <w:tc>
           <w:tcPr>
-            <w:tcW w:type="dxa" w:w="1234"/>
+            <w:tcW w:type="dxa" w:w="1440"/>
           </w:tcPr>
           <w:p>
             <w:r>
@@ -2978,7 +267,7 @@
         </w:tc>
         <w:tc>
           <w:tcPr>
-            <w:tcW w:type="dxa" w:w="1234"/>
+            <w:tcW w:type="dxa" w:w="1440"/>
           </w:tcPr>
           <w:p>
             <w:r>
@@ -2988,17 +277,17 @@
         </w:tc>
         <w:tc>
           <w:tcPr>
-            <w:tcW w:type="dxa" w:w="1234"/>
+            <w:tcW w:type="dxa" w:w="1440"/>
           </w:tcPr>
           <w:p>
             <w:r>
-              <w:t>Rules Rec</w:t>
+              <w:t>Rules</w:t>
             </w:r>
           </w:p>
         </w:tc>
         <w:tc>
           <w:tcPr>
-            <w:tcW w:type="dxa" w:w="1234"/>
+            <w:tcW w:type="dxa" w:w="1440"/>
           </w:tcPr>
           <w:p>
             <w:r>
@@ -3008,7 +297,7 @@
         </w:tc>
         <w:tc>
           <w:tcPr>
-            <w:tcW w:type="dxa" w:w="1234"/>
+            <w:tcW w:type="dxa" w:w="1440"/>
           </w:tcPr>
           <w:p>
             <w:r>
@@ -3016,21 +305,11 @@
             </w:r>
           </w:p>
         </w:tc>
-        <w:tc>
-          <w:tcPr>
-            <w:tcW w:type="dxa" w:w="1234"/>
-          </w:tcPr>
-          <w:p>
-            <w:r>
-              <w:t>TtE</w:t>
-            </w:r>
-          </w:p>
-        </w:tc>
       </w:tr>
       <w:tr>
         <w:tc>
           <w:tcPr>
-            <w:tcW w:type="dxa" w:w="1234"/>
+            <w:tcW w:type="dxa" w:w="1440"/>
           </w:tcPr>
           <w:p>
             <w:r>
@@ -3040,37 +319,37 @@
         </w:tc>
         <w:tc>
           <w:tcPr>
-            <w:tcW w:type="dxa" w:w="1234"/>
+            <w:tcW w:type="dxa" w:w="1440"/>
           </w:tcPr>
           <w:p>
             <w:r>
-              <w:t>0.9977</w:t>
+              <w:t>0.9954</w:t>
             </w:r>
           </w:p>
         </w:tc>
         <w:tc>
           <w:tcPr>
-            <w:tcW w:type="dxa" w:w="1234"/>
+            <w:tcW w:type="dxa" w:w="1440"/>
           </w:tcPr>
           <w:p>
             <w:r>
-              <w:t>89.6%</w:t>
+              <w:t>89.3%</w:t>
             </w:r>
           </w:p>
         </w:tc>
         <w:tc>
           <w:tcPr>
-            <w:tcW w:type="dxa" w:w="1234"/>
+            <w:tcW w:type="dxa" w:w="1440"/>
           </w:tcPr>
           <w:p>
             <w:r>
-              <w:t>1.7%</w:t>
+              <w:t>1.6%</w:t>
             </w:r>
           </w:p>
         </w:tc>
         <w:tc>
           <w:tcPr>
-            <w:tcW w:type="dxa" w:w="1234"/>
+            <w:tcW w:type="dxa" w:w="1440"/>
           </w:tcPr>
           <w:p>
             <w:r>
@@ -3080,165 +359,11 @@
         </w:tc>
         <w:tc>
           <w:tcPr>
-            <w:tcW w:type="dxa" w:w="1234"/>
+            <w:tcW w:type="dxa" w:w="1440"/>
           </w:tcPr>
           <w:p>
             <w:r>
-              <w:t>0.570</w:t>
-            </w:r>
-          </w:p>
-        </w:tc>
-        <w:tc>
-          <w:tcPr>
-            <w:tcW w:type="dxa" w:w="1234"/>
-          </w:tcPr>
-          <w:p>
-            <w:r>
-              <w:t>4</w:t>
-            </w:r>
-          </w:p>
-        </w:tc>
-      </w:tr>
-      <w:tr>
-        <w:tc>
-          <w:tcPr>
-            <w:tcW w:type="dxa" w:w="1234"/>
-          </w:tcPr>
-          <w:p>
-            <w:r>
-              <w:t>42</w:t>
-            </w:r>
-          </w:p>
-        </w:tc>
-        <w:tc>
-          <w:tcPr>
-            <w:tcW w:type="dxa" w:w="1234"/>
-          </w:tcPr>
-          <w:p>
-            <w:r>
-              <w:t>0.9965</w:t>
-            </w:r>
-          </w:p>
-        </w:tc>
-        <w:tc>
-          <w:tcPr>
-            <w:tcW w:type="dxa" w:w="1234"/>
-          </w:tcPr>
-          <w:p>
-            <w:r>
-              <w:t>91.1%</w:t>
-            </w:r>
-          </w:p>
-        </w:tc>
-        <w:tc>
-          <w:tcPr>
-            <w:tcW w:type="dxa" w:w="1234"/>
-          </w:tcPr>
-          <w:p>
-            <w:r>
-              <w:t>2.1%</w:t>
-            </w:r>
-          </w:p>
-        </w:tc>
-        <w:tc>
-          <w:tcPr>
-            <w:tcW w:type="dxa" w:w="1234"/>
-          </w:tcPr>
-          <w:p>
-            <w:r>
-              <w:t>0.49%</w:t>
-            </w:r>
-          </w:p>
-        </w:tc>
-        <w:tc>
-          <w:tcPr>
-            <w:tcW w:type="dxa" w:w="1234"/>
-          </w:tcPr>
-          <w:p>
-            <w:r>
-              <w:t>0.569</w:t>
-            </w:r>
-          </w:p>
-        </w:tc>
-        <w:tc>
-          <w:tcPr>
-            <w:tcW w:type="dxa" w:w="1234"/>
-          </w:tcPr>
-          <w:p>
-            <w:r>
-              <w:t>4</w:t>
-            </w:r>
-          </w:p>
-        </w:tc>
-      </w:tr>
-      <w:tr>
-        <w:tc>
-          <w:tcPr>
-            <w:tcW w:type="dxa" w:w="1234"/>
-          </w:tcPr>
-          <w:p>
-            <w:r>
-              <w:t>99</w:t>
-            </w:r>
-          </w:p>
-        </w:tc>
-        <w:tc>
-          <w:tcPr>
-            <w:tcW w:type="dxa" w:w="1234"/>
-          </w:tcPr>
-          <w:p>
-            <w:r>
-              <w:t>0.9962</w:t>
-            </w:r>
-          </w:p>
-        </w:tc>
-        <w:tc>
-          <w:tcPr>
-            <w:tcW w:type="dxa" w:w="1234"/>
-          </w:tcPr>
-          <w:p>
-            <w:r>
-              <w:t>89.4%</w:t>
-            </w:r>
-          </w:p>
-        </w:tc>
-        <w:tc>
-          <w:tcPr>
-            <w:tcW w:type="dxa" w:w="1234"/>
-          </w:tcPr>
-          <w:p>
-            <w:r>
-              <w:t>1.0%</w:t>
-            </w:r>
-          </w:p>
-        </w:tc>
-        <w:tc>
-          <w:tcPr>
-            <w:tcW w:type="dxa" w:w="1234"/>
-          </w:tcPr>
-          <w:p>
-            <w:r>
-              <w:t>0.39%</w:t>
-            </w:r>
-          </w:p>
-        </w:tc>
-        <w:tc>
-          <w:tcPr>
-            <w:tcW w:type="dxa" w:w="1234"/>
-          </w:tcPr>
-          <w:p>
-            <w:r>
-              <w:t>0.570</w:t>
-            </w:r>
-          </w:p>
-        </w:tc>
-        <w:tc>
-          <w:tcPr>
-            <w:tcW w:type="dxa" w:w="1234"/>
-          </w:tcPr>
-          <w:p>
-            <w:r>
-              <w:t>4</w:t>
+              <w:t>0.668</w:t>
             </w:r>
           </w:p>
         </w:tc>
@@ -3249,20 +374,12 @@
         <w:pStyle w:val="Heading1"/>
       </w:pPr>
       <w:r>
-        <w:t>7. Real-World Feasibility</w:t>
+        <w:t>6. Feasibility &amp; GFF demo (90s)</w:t>
       </w:r>
     </w:p>
     <w:p>
       <w:r>
-        <w:t>Wind-tunnel harness for issuers: REST API (POST /api/loop/run), analyst console with Agent Council + vector heatmap, labeled data without PII. Governance: synthetic identities, TTP-level playbooks only.</w:t>
-      </w:r>
-    </w:p>
-    <w:p>
-      <w:pPr>
-        <w:pStyle w:val="Heading1"/>
-      </w:pPr>
-      <w:r>
-        <w:t>8. GFF Demo Script</w:t>
+        <w:t>Open the hosted URL. Rubric strip = four criteria. Agent Council = Scout/Critic. Mule SVG = unique-src fan-in. Heatmap = held-out miss (red) vs caught (green). Agent Pay: GEN-007 listing injection, stored agentic token, no step-up. Governance: synthetic IDs; raw Vesta CSV never redistributed.</w:t>
       </w:r>
     </w:p>
     <w:p>
@@ -3270,7 +387,7 @@
         <w:pStyle w:val="ListNumber"/>
       </w:pPr>
       <w:r>
-        <w:t>1. Open http://localhost:8000 — confirm 'IEEE-CIS calibrated' badge</w:t>
+        <w:t>1. Confirm IEEE-CIS + LLM badges</w:t>
       </w:r>
     </w:p>
     <w:p>
@@ -3278,7 +395,7 @@
         <w:pStyle w:val="ListNumber"/>
       </w:pPr>
       <w:r>
-        <w:t>2. Agent Council: show Scout discovery + Critic mutation messages</w:t>
+        <w:t>2. Click GEN-038 / GEN-002</w:t>
       </w:r>
     </w:p>
     <w:p>
@@ -3286,7 +403,7 @@
         <w:pStyle w:val="ListNumber"/>
       </w:pPr>
       <w:r>
-        <w:t>3. Run generation — arms race chart: frozen AUC vs retrained AUC</w:t>
+        <w:t>3. Run one generation if the dyno is awake</w:t>
       </w:r>
     </w:p>
     <w:p>
@@ -3294,7 +411,7 @@
         <w:pStyle w:val="ListNumber"/>
       </w:pPr>
       <w:r>
-        <w:t>4. Vector heatmap: red = blind spot, green = caught</w:t>
+        <w:t>4. Walk Forge LLM artifact vs template</w:t>
       </w:r>
     </w:p>
     <w:p>
@@ -3302,63 +419,7 @@
         <w:pStyle w:val="ListNumber"/>
       </w:pPr>
       <w:r>
-        <w:t>5. Attack Theater: LLM-enriched artifact + SHAP-lite flagged txn</w:t>
-      </w:r>
-    </w:p>
-    <w:p>
-      <w:pPr>
-        <w:pStyle w:val="ListNumber"/>
-      </w:pPr>
-      <w:r>
-        <w:t>6. Baseline bar: rules 1.6% recall vs Sentinel 90%+</w:t>
-      </w:r>
-    </w:p>
-    <w:p>
-      <w:pPr>
-        <w:pStyle w:val="Heading1"/>
-      </w:pPr>
-      <w:r>
-        <w:t>Appendix</w:t>
-      </w:r>
-    </w:p>
-    <w:p>
-      <w:pPr>
-        <w:pStyle w:val="ListBullet"/>
-      </w:pPr>
-      <w:r>
-        <w:t>make setup</w:t>
-      </w:r>
-    </w:p>
-    <w:p>
-      <w:pPr>
-        <w:pStyle w:val="ListBullet"/>
-      </w:pPr>
-      <w:r>
-        <w:t>cp train_transaction.csv data/anchor/</w:t>
-      </w:r>
-    </w:p>
-    <w:p>
-      <w:pPr>
-        <w:pStyle w:val="ListBullet"/>
-      </w:pPr>
-      <w:r>
-        <w:t>make calibrate</w:t>
-      </w:r>
-    </w:p>
-    <w:p>
-      <w:pPr>
-        <w:pStyle w:val="ListBullet"/>
-      </w:pPr>
-      <w:r>
-        <w:t>make loop</w:t>
-      </w:r>
-    </w:p>
-    <w:p>
-      <w:pPr>
-        <w:pStyle w:val="ListBullet"/>
-      </w:pPr>
-      <w:r>
-        <w:t>make api</w:t>
+        <w:t>5. Close on rules vs Sentinel recall</w:t>
       </w:r>
     </w:p>
     <w:sectPr>

</xml_diff>